<commit_message>
feat: enrich strategy explanations and strategy-level threshold deviation review
</commit_message>
<xml_diff>
--- a/03_文档/报告/2026-08-18_v4稳健性分析报告_上司版.docx
+++ b/03_文档/报告/2026-08-18_v4稳健性分析报告_上司版.docx
@@ -62,7 +62,7 @@
           <w:color w:val="000000"/>
           <w:sz w:val="20"/>
         </w:rPr>
-        <w:t>固定切分将历史数据分为建模段（train）与回测段（test）。严格重选指只用建模段数据重新选择策略，再用未参与建模的 2025 年后数据回测，避免选策略时看过回测成绩。</w:t>
+        <w:t>固定切分将历史数据分为建模段（train）与回测段（test）。建模段为 2005-06-15 ~ 2024-12-31；回测段为 2025-01-01 ~ 2026-08-04。严格重选指只用建模段数据重新选择策略，再用未参与建模的回测段数据回测，避免选策略时看过回测成绩。</w:t>
       </w:r>
     </w:p>
     <w:p>
@@ -1454,7 +1454,7 @@
           <w:color w:val="000000"/>
           <w:sz w:val="20"/>
         </w:rPr>
-        <w:t>结论：103/103 支基金回测段命中率 &gt;=55%，平均回报与命中率均高于建模段，未见样本外衰减。</w:t>
+        <w:t>结论：103/103 支基金回测段命中率 &gt;=55%、平均回报 &gt;=0.2%，没有基金在回测段掉出合格线，平均回报与命中率均高于建模段，未见样本外衰减。</w:t>
       </w:r>
     </w:p>
     <w:p>
@@ -4584,6 +4584,17 @@
           <w:color w:val="000000"/>
           <w:sz w:val="20"/>
         </w:rPr>
+        <w:t>说明：UDPSX、UIPSX 的 2025 后表现也明显改善（平均 0.536%/0.526%、命中 67.9%/60.5%），但全历史平均回报与显著性仍偏弱，UDPSX 同时波动偏高，因此仍列入补强名单；若只按 2025 后口径，可按观察名单处理。</w:t>
+      </w:r>
+    </w:p>
+    <w:p>
+      <w:r>
+        <w:rPr>
+          <w:rFonts w:ascii="Microsoft YaHei" w:hAnsi="Microsoft YaHei" w:eastAsia="Microsoft YaHei"/>
+          <w:b w:val="0"/>
+          <w:color w:val="000000"/>
+          <w:sz w:val="20"/>
+        </w:rPr>
         <w:t>改进措施：优先用候选池中更显著的信号替换 4 条训练弱策略；全历史弱但 2025 后强的 6 条继续观察，不为了凑覆盖硬塞低质量信号。</w:t>
       </w:r>
     </w:p>
@@ -4610,7 +4621,7 @@
           <w:color w:val="000000"/>
           <w:sz w:val="20"/>
         </w:rPr>
-        <w:t>231 条策略已逐条给出经济解释，输出列包括“触发条件”“条件解释”与“机制”，不含条件代码和历史统计；全部明细见 v4_strategy_explanation_v3.csv。</w:t>
+        <w:t>231 条策略已逐条给出经济解释，输出列包括“触发条件”“条件解释”与“机制”，不含条件代码和历史统计；全部明细见 v4_strategy_explanation_v3.csv。机制列按“条件说明了什么 → 带来的市场影响 → 基金产品特征 → 为什么该基金上涨/下跌”四段式书写。</w:t>
       </w:r>
     </w:p>
     <w:p>
@@ -11984,6 +11995,17 @@
           <w:color w:val="000000"/>
           <w:sz w:val="20"/>
         </w:rPr>
+        <w:t>产品命名说明：UltraSector = 2 倍杠杆行业基金；Ultra China/Japan/Latin America 等 = 2 倍杠杆地区/主题基金；UltraShort/Short = 反向（做空）产品；Bull/Bear = 多头/空头；带 Ultra 前缀一般表示约 2 倍杠杆。</w:t>
+      </w:r>
+    </w:p>
+    <w:p>
+      <w:r>
+        <w:rPr>
+          <w:rFonts w:ascii="Microsoft YaHei" w:hAnsi="Microsoft YaHei" w:eastAsia="Microsoft YaHei"/>
+          <w:b w:val="0"/>
+          <w:color w:val="000000"/>
+          <w:sz w:val="20"/>
+        </w:rPr>
         <w:t>需观察基金（合并层面，含比值 &gt;=1.5）：</w:t>
       </w:r>
     </w:p>
@@ -12533,7 +12555,7 @@
           <w:color w:val="000000"/>
           <w:sz w:val="20"/>
         </w:rPr>
-        <w:t>情有可原（杠杆/反向产品，波动高是基金本身特质，不是策略选错）：</w:t>
+        <w:t>情有可原（先写产品，再写指标；只列异常的指标）：</w:t>
       </w:r>
     </w:p>
     <w:tbl>
@@ -12681,7 +12703,7 @@
                 <w:color w:val="333333"/>
                 <w:sz w:val="16"/>
               </w:rPr>
-              <w:t>基金本身全历史 std 3.53% / 3.59%，最大单笔亏损 -24.9%；贵金属 UltraSector 杠杆产品</w:t>
+              <w:t>贵金属 UltraSector 杠杆产品，基金本身全历史 std 3.53% / 3.59%</w:t>
             </w:r>
           </w:p>
         </w:tc>
@@ -12746,7 +12768,7 @@
                 <w:color w:val="333333"/>
                 <w:sz w:val="16"/>
               </w:rPr>
-              <w:t>基金本身全历史 std 4.17%，最大单笔亏损 -50.0%；Ultra Short China 反向杠杆</w:t>
+              <w:t>Ultra Short China 反向杠杆产品，基金本身全历史 std 4.17%</w:t>
             </w:r>
           </w:p>
         </w:tc>
@@ -12811,7 +12833,7 @@
                 <w:color w:val="333333"/>
                 <w:sz w:val="16"/>
               </w:rPr>
-              <w:t>基金本身全历史 std 4.02%，最大单笔亏损 -40.5%；Ultra Latin America 杠杆</w:t>
+              <w:t>Ultra Latin America 杠杆产品，基金本身最大单笔亏损 -40.5%</w:t>
             </w:r>
           </w:p>
         </w:tc>
@@ -12876,7 +12898,7 @@
                 <w:color w:val="333333"/>
                 <w:sz w:val="16"/>
               </w:rPr>
-              <w:t>基金本身全历史 std 3.13% / 3.02%，最大单笔亏损 -50.0% / -41.5%；Ultra Small-Cap 杠杆</w:t>
+              <w:t>Ultra Small-Cap 杠杆产品，基金本身最大单笔亏损 -50.0% / -41.5%</w:t>
             </w:r>
           </w:p>
         </w:tc>
@@ -12941,7 +12963,7 @@
                 <w:color w:val="333333"/>
                 <w:sz w:val="16"/>
               </w:rPr>
-              <w:t>基金本身全历史 std 4.21%，最大单笔亏损 -26.0%；Ultra China 杠杆</w:t>
+              <w:t>Ultra China 杠杆产品，基金本身全历史 std 4.21%</w:t>
             </w:r>
           </w:p>
         </w:tc>
@@ -13006,7 +13028,7 @@
                 <w:color w:val="333333"/>
                 <w:sz w:val="16"/>
               </w:rPr>
-              <w:t>基金本身全历史 std 3.13% / 3.14% / 4.23%；UltraSector/Ultra 杠杆</w:t>
+              <w:t>UltraSector/Ultra 杠杆产品，基金本身全历史 std 3.13% / 3.14% / 4.23%</w:t>
             </w:r>
           </w:p>
         </w:tc>
@@ -13046,7 +13068,7 @@
           <w:color w:val="000000"/>
           <w:sz w:val="20"/>
         </w:rPr>
-        <w:t>本章假设：对单个策略，把某个条件阈值改深，例如 XLK&lt;=-1% 且 该基金当日回报&lt;=-2% 中的 XLK 改为 &lt;=-2%/-2.5%/-3%，整个策略的平均回报和命中率应递增。以下全部按策略统计；多条件策略只调整被扫描的那个条件，其他子条件保持不变。</w:t>
+        <w:t>本章假设：对单个策略，把某个条件阈值改深，例如 XLK&lt;=-1% 且 该基金当日回报&lt;=-2% 中的 XLK 改为 &lt;=-2%/-2.5%/-3%，整个策略的平均回报和命中率应递增。以下全部按策略统计；多条件策略只调整被扫描的那个条件，其他子条件保持不变。4.1、4.2、4.3 使用同一份策略级阈值扫描结果。</w:t>
       </w:r>
     </w:p>
     <w:p>
@@ -13072,7 +13094,7 @@
           <w:color w:val="000000"/>
           <w:sz w:val="20"/>
         </w:rPr>
-        <w:t>负向阈值扫描（策略级，其余条件固定）：</w:t>
+        <w:t>负向阈值扫描（策略级，其余条件固定；同一策略调整不同条件计为不同策略）：</w:t>
       </w:r>
     </w:p>
     <w:tbl>
@@ -13091,15 +13113,16 @@
         </w:tblBorders>
       </w:tblPr>
       <w:tblGrid>
-        <w:gridCol w:w="2161"/>
-        <w:gridCol w:w="2161"/>
-        <w:gridCol w:w="2161"/>
-        <w:gridCol w:w="2161"/>
+        <w:gridCol w:w="1729"/>
+        <w:gridCol w:w="1729"/>
+        <w:gridCol w:w="1729"/>
+        <w:gridCol w:w="1729"/>
+        <w:gridCol w:w="1729"/>
       </w:tblGrid>
       <w:tr>
         <w:tc>
           <w:tcPr>
-            <w:tcW w:type="dxa" w:w="1701"/>
+            <w:tcW w:type="dxa" w:w="1247"/>
             <w:shd w:fill="FFFFFF" w:val="clear"/>
           </w:tcPr>
           <w:p>
@@ -13120,7 +13143,7 @@
         </w:tc>
         <w:tc>
           <w:tcPr>
-            <w:tcW w:type="dxa" w:w="2041"/>
+            <w:tcW w:type="dxa" w:w="1701"/>
             <w:shd w:fill="FFFFFF" w:val="clear"/>
           </w:tcPr>
           <w:p>
@@ -13181,11 +13204,32 @@
             </w:r>
           </w:p>
         </w:tc>
+        <w:tc>
+          <w:tcPr>
+            <w:tcW w:type="dxa" w:w="1134"/>
+            <w:shd w:fill="FFFFFF" w:val="clear"/>
+          </w:tcPr>
+          <w:p>
+            <w:pPr>
+              <w:spacing w:before="60" w:after="60"/>
+              <w:jc w:val="center"/>
+            </w:pPr>
+            <w:r>
+              <w:rPr>
+                <w:rFonts w:ascii="SimHei" w:hAnsi="SimHei" w:eastAsia="SimHei"/>
+                <w:b/>
+                <w:color w:val="000000"/>
+                <w:sz w:val="18"/>
+              </w:rPr>
+              <w:t>策略数</w:t>
+            </w:r>
+          </w:p>
+        </w:tc>
       </w:tr>
       <w:tr>
         <w:tc>
           <w:tcPr>
-            <w:tcW w:type="dxa" w:w="2161"/>
+            <w:tcW w:type="dxa" w:w="1729"/>
             <w:shd w:fill="FFFFFF" w:val="clear"/>
           </w:tcPr>
           <w:p>
@@ -13206,7 +13250,7 @@
         </w:tc>
         <w:tc>
           <w:tcPr>
-            <w:tcW w:type="dxa" w:w="2161"/>
+            <w:tcW w:type="dxa" w:w="1729"/>
             <w:shd w:fill="FFFFFF" w:val="clear"/>
           </w:tcPr>
           <w:p>
@@ -13227,7 +13271,7 @@
         </w:tc>
         <w:tc>
           <w:tcPr>
-            <w:tcW w:type="dxa" w:w="2161"/>
+            <w:tcW w:type="dxa" w:w="1729"/>
             <w:shd w:fill="FFFFFF" w:val="clear"/>
           </w:tcPr>
           <w:p>
@@ -13248,7 +13292,7 @@
         </w:tc>
         <w:tc>
           <w:tcPr>
-            <w:tcW w:type="dxa" w:w="2161"/>
+            <w:tcW w:type="dxa" w:w="1729"/>
             <w:shd w:fill="FFFFFF" w:val="clear"/>
           </w:tcPr>
           <w:p>
@@ -13264,6 +13308,27 @@
                 <w:sz w:val="16"/>
               </w:rPr>
               <w:t>1041</w:t>
+            </w:r>
+          </w:p>
+        </w:tc>
+        <w:tc>
+          <w:tcPr>
+            <w:tcW w:type="dxa" w:w="1729"/>
+            <w:shd w:fill="FFFFFF" w:val="clear"/>
+          </w:tcPr>
+          <w:p>
+            <w:pPr>
+              <w:spacing w:before="20" w:after="20"/>
+              <w:jc w:val="center"/>
+            </w:pPr>
+            <w:r>
+              <w:rPr>
+                <w:rFonts w:ascii="Microsoft YaHei" w:hAnsi="Microsoft YaHei" w:eastAsia="Microsoft YaHei"/>
+                <w:b w:val="0"/>
+                <w:color w:val="333333"/>
+                <w:sz w:val="16"/>
+              </w:rPr>
+              <w:t>24</w:t>
             </w:r>
           </w:p>
         </w:tc>
@@ -13271,7 +13336,7 @@
       <w:tr>
         <w:tc>
           <w:tcPr>
-            <w:tcW w:type="dxa" w:w="2161"/>
+            <w:tcW w:type="dxa" w:w="1729"/>
             <w:shd w:fill="E6E6E6" w:val="clear"/>
           </w:tcPr>
           <w:p>
@@ -13292,7 +13357,7 @@
         </w:tc>
         <w:tc>
           <w:tcPr>
-            <w:tcW w:type="dxa" w:w="2161"/>
+            <w:tcW w:type="dxa" w:w="1729"/>
             <w:shd w:fill="E6E6E6" w:val="clear"/>
           </w:tcPr>
           <w:p>
@@ -13313,7 +13378,7 @@
         </w:tc>
         <w:tc>
           <w:tcPr>
-            <w:tcW w:type="dxa" w:w="2161"/>
+            <w:tcW w:type="dxa" w:w="1729"/>
             <w:shd w:fill="E6E6E6" w:val="clear"/>
           </w:tcPr>
           <w:p>
@@ -13334,7 +13399,7 @@
         </w:tc>
         <w:tc>
           <w:tcPr>
-            <w:tcW w:type="dxa" w:w="2161"/>
+            <w:tcW w:type="dxa" w:w="1729"/>
             <w:shd w:fill="E6E6E6" w:val="clear"/>
           </w:tcPr>
           <w:p>
@@ -13350,6 +13415,27 @@
                 <w:sz w:val="16"/>
               </w:rPr>
               <w:t>606</w:t>
+            </w:r>
+          </w:p>
+        </w:tc>
+        <w:tc>
+          <w:tcPr>
+            <w:tcW w:type="dxa" w:w="1729"/>
+            <w:shd w:fill="E6E6E6" w:val="clear"/>
+          </w:tcPr>
+          <w:p>
+            <w:pPr>
+              <w:spacing w:before="20" w:after="20"/>
+              <w:jc w:val="center"/>
+            </w:pPr>
+            <w:r>
+              <w:rPr>
+                <w:rFonts w:ascii="Microsoft YaHei" w:hAnsi="Microsoft YaHei" w:eastAsia="Microsoft YaHei"/>
+                <w:b w:val="0"/>
+                <w:color w:val="333333"/>
+                <w:sz w:val="16"/>
+              </w:rPr>
+              <w:t>25</w:t>
             </w:r>
           </w:p>
         </w:tc>
@@ -13357,7 +13443,7 @@
       <w:tr>
         <w:tc>
           <w:tcPr>
-            <w:tcW w:type="dxa" w:w="2161"/>
+            <w:tcW w:type="dxa" w:w="1729"/>
             <w:shd w:fill="FFFFFF" w:val="clear"/>
           </w:tcPr>
           <w:p>
@@ -13378,7 +13464,7 @@
         </w:tc>
         <w:tc>
           <w:tcPr>
-            <w:tcW w:type="dxa" w:w="2161"/>
+            <w:tcW w:type="dxa" w:w="1729"/>
             <w:shd w:fill="FFFFFF" w:val="clear"/>
           </w:tcPr>
           <w:p>
@@ -13399,7 +13485,7 @@
         </w:tc>
         <w:tc>
           <w:tcPr>
-            <w:tcW w:type="dxa" w:w="2161"/>
+            <w:tcW w:type="dxa" w:w="1729"/>
             <w:shd w:fill="FFFFFF" w:val="clear"/>
           </w:tcPr>
           <w:p>
@@ -13420,7 +13506,7 @@
         </w:tc>
         <w:tc>
           <w:tcPr>
-            <w:tcW w:type="dxa" w:w="2161"/>
+            <w:tcW w:type="dxa" w:w="1729"/>
             <w:shd w:fill="FFFFFF" w:val="clear"/>
           </w:tcPr>
           <w:p>
@@ -13436,6 +13522,27 @@
                 <w:sz w:val="16"/>
               </w:rPr>
               <w:t>370</w:t>
+            </w:r>
+          </w:p>
+        </w:tc>
+        <w:tc>
+          <w:tcPr>
+            <w:tcW w:type="dxa" w:w="1729"/>
+            <w:shd w:fill="FFFFFF" w:val="clear"/>
+          </w:tcPr>
+          <w:p>
+            <w:pPr>
+              <w:spacing w:before="20" w:after="20"/>
+              <w:jc w:val="center"/>
+            </w:pPr>
+            <w:r>
+              <w:rPr>
+                <w:rFonts w:ascii="Microsoft YaHei" w:hAnsi="Microsoft YaHei" w:eastAsia="Microsoft YaHei"/>
+                <w:b w:val="0"/>
+                <w:color w:val="333333"/>
+                <w:sz w:val="16"/>
+              </w:rPr>
+              <w:t>25</w:t>
             </w:r>
           </w:p>
         </w:tc>
@@ -13443,7 +13550,7 @@
       <w:tr>
         <w:tc>
           <w:tcPr>
-            <w:tcW w:type="dxa" w:w="2161"/>
+            <w:tcW w:type="dxa" w:w="1729"/>
             <w:shd w:fill="E6E6E6" w:val="clear"/>
           </w:tcPr>
           <w:p>
@@ -13464,7 +13571,7 @@
         </w:tc>
         <w:tc>
           <w:tcPr>
-            <w:tcW w:type="dxa" w:w="2161"/>
+            <w:tcW w:type="dxa" w:w="1729"/>
             <w:shd w:fill="E6E6E6" w:val="clear"/>
           </w:tcPr>
           <w:p>
@@ -13485,7 +13592,7 @@
         </w:tc>
         <w:tc>
           <w:tcPr>
-            <w:tcW w:type="dxa" w:w="2161"/>
+            <w:tcW w:type="dxa" w:w="1729"/>
             <w:shd w:fill="E6E6E6" w:val="clear"/>
           </w:tcPr>
           <w:p>
@@ -13506,7 +13613,7 @@
         </w:tc>
         <w:tc>
           <w:tcPr>
-            <w:tcW w:type="dxa" w:w="2161"/>
+            <w:tcW w:type="dxa" w:w="1729"/>
             <w:shd w:fill="E6E6E6" w:val="clear"/>
           </w:tcPr>
           <w:p>
@@ -13522,6 +13629,27 @@
                 <w:sz w:val="16"/>
               </w:rPr>
               <w:t>217</w:t>
+            </w:r>
+          </w:p>
+        </w:tc>
+        <w:tc>
+          <w:tcPr>
+            <w:tcW w:type="dxa" w:w="1729"/>
+            <w:shd w:fill="E6E6E6" w:val="clear"/>
+          </w:tcPr>
+          <w:p>
+            <w:pPr>
+              <w:spacing w:before="20" w:after="20"/>
+              <w:jc w:val="center"/>
+            </w:pPr>
+            <w:r>
+              <w:rPr>
+                <w:rFonts w:ascii="Microsoft YaHei" w:hAnsi="Microsoft YaHei" w:eastAsia="Microsoft YaHei"/>
+                <w:b w:val="0"/>
+                <w:color w:val="333333"/>
+                <w:sz w:val="16"/>
+              </w:rPr>
+              <w:t>23</w:t>
             </w:r>
           </w:p>
         </w:tc>
@@ -13529,7 +13657,7 @@
       <w:tr>
         <w:tc>
           <w:tcPr>
-            <w:tcW w:type="dxa" w:w="2161"/>
+            <w:tcW w:type="dxa" w:w="1729"/>
             <w:shd w:fill="FFFFFF" w:val="clear"/>
           </w:tcPr>
           <w:p>
@@ -13550,7 +13678,7 @@
         </w:tc>
         <w:tc>
           <w:tcPr>
-            <w:tcW w:type="dxa" w:w="2161"/>
+            <w:tcW w:type="dxa" w:w="1729"/>
             <w:shd w:fill="FFFFFF" w:val="clear"/>
           </w:tcPr>
           <w:p>
@@ -13571,7 +13699,7 @@
         </w:tc>
         <w:tc>
           <w:tcPr>
-            <w:tcW w:type="dxa" w:w="2161"/>
+            <w:tcW w:type="dxa" w:w="1729"/>
             <w:shd w:fill="FFFFFF" w:val="clear"/>
           </w:tcPr>
           <w:p>
@@ -13592,7 +13720,7 @@
         </w:tc>
         <w:tc>
           <w:tcPr>
-            <w:tcW w:type="dxa" w:w="2161"/>
+            <w:tcW w:type="dxa" w:w="1729"/>
             <w:shd w:fill="FFFFFF" w:val="clear"/>
           </w:tcPr>
           <w:p>
@@ -13608,6 +13736,27 @@
                 <w:sz w:val="16"/>
               </w:rPr>
               <w:t>155</w:t>
+            </w:r>
+          </w:p>
+        </w:tc>
+        <w:tc>
+          <w:tcPr>
+            <w:tcW w:type="dxa" w:w="1729"/>
+            <w:shd w:fill="FFFFFF" w:val="clear"/>
+          </w:tcPr>
+          <w:p>
+            <w:pPr>
+              <w:spacing w:before="20" w:after="20"/>
+              <w:jc w:val="center"/>
+            </w:pPr>
+            <w:r>
+              <w:rPr>
+                <w:rFonts w:ascii="Microsoft YaHei" w:hAnsi="Microsoft YaHei" w:eastAsia="Microsoft YaHei"/>
+                <w:b w:val="0"/>
+                <w:color w:val="333333"/>
+                <w:sz w:val="16"/>
+              </w:rPr>
+              <w:t>21</w:t>
             </w:r>
           </w:p>
         </w:tc>
@@ -13615,7 +13764,7 @@
       <w:tr>
         <w:tc>
           <w:tcPr>
-            <w:tcW w:type="dxa" w:w="2161"/>
+            <w:tcW w:type="dxa" w:w="1729"/>
             <w:shd w:fill="E6E6E6" w:val="clear"/>
           </w:tcPr>
           <w:p>
@@ -13636,7 +13785,7 @@
         </w:tc>
         <w:tc>
           <w:tcPr>
-            <w:tcW w:type="dxa" w:w="2161"/>
+            <w:tcW w:type="dxa" w:w="1729"/>
             <w:shd w:fill="E6E6E6" w:val="clear"/>
           </w:tcPr>
           <w:p>
@@ -13657,7 +13806,7 @@
         </w:tc>
         <w:tc>
           <w:tcPr>
-            <w:tcW w:type="dxa" w:w="2161"/>
+            <w:tcW w:type="dxa" w:w="1729"/>
             <w:shd w:fill="E6E6E6" w:val="clear"/>
           </w:tcPr>
           <w:p>
@@ -13678,7 +13827,7 @@
         </w:tc>
         <w:tc>
           <w:tcPr>
-            <w:tcW w:type="dxa" w:w="2161"/>
+            <w:tcW w:type="dxa" w:w="1729"/>
             <w:shd w:fill="E6E6E6" w:val="clear"/>
           </w:tcPr>
           <w:p>
@@ -13694,6 +13843,27 @@
                 <w:sz w:val="16"/>
               </w:rPr>
               <w:t>240</w:t>
+            </w:r>
+          </w:p>
+        </w:tc>
+        <w:tc>
+          <w:tcPr>
+            <w:tcW w:type="dxa" w:w="1729"/>
+            <w:shd w:fill="E6E6E6" w:val="clear"/>
+          </w:tcPr>
+          <w:p>
+            <w:pPr>
+              <w:spacing w:before="20" w:after="20"/>
+              <w:jc w:val="center"/>
+            </w:pPr>
+            <w:r>
+              <w:rPr>
+                <w:rFonts w:ascii="Microsoft YaHei" w:hAnsi="Microsoft YaHei" w:eastAsia="Microsoft YaHei"/>
+                <w:b w:val="0"/>
+                <w:color w:val="333333"/>
+                <w:sz w:val="16"/>
+              </w:rPr>
+              <w:t>15</w:t>
             </w:r>
           </w:p>
         </w:tc>
@@ -13726,15 +13896,16 @@
         </w:tblBorders>
       </w:tblPr>
       <w:tblGrid>
-        <w:gridCol w:w="2161"/>
-        <w:gridCol w:w="2161"/>
-        <w:gridCol w:w="2161"/>
-        <w:gridCol w:w="2161"/>
+        <w:gridCol w:w="1729"/>
+        <w:gridCol w:w="1729"/>
+        <w:gridCol w:w="1729"/>
+        <w:gridCol w:w="1729"/>
+        <w:gridCol w:w="1729"/>
       </w:tblGrid>
       <w:tr>
         <w:tc>
           <w:tcPr>
-            <w:tcW w:type="dxa" w:w="1701"/>
+            <w:tcW w:type="dxa" w:w="1247"/>
             <w:shd w:fill="FFFFFF" w:val="clear"/>
           </w:tcPr>
           <w:p>
@@ -13755,7 +13926,7 @@
         </w:tc>
         <w:tc>
           <w:tcPr>
-            <w:tcW w:type="dxa" w:w="2041"/>
+            <w:tcW w:type="dxa" w:w="1701"/>
             <w:shd w:fill="FFFFFF" w:val="clear"/>
           </w:tcPr>
           <w:p>
@@ -13816,11 +13987,32 @@
             </w:r>
           </w:p>
         </w:tc>
+        <w:tc>
+          <w:tcPr>
+            <w:tcW w:type="dxa" w:w="1134"/>
+            <w:shd w:fill="FFFFFF" w:val="clear"/>
+          </w:tcPr>
+          <w:p>
+            <w:pPr>
+              <w:spacing w:before="60" w:after="60"/>
+              <w:jc w:val="center"/>
+            </w:pPr>
+            <w:r>
+              <w:rPr>
+                <w:rFonts w:ascii="SimHei" w:hAnsi="SimHei" w:eastAsia="SimHei"/>
+                <w:b/>
+                <w:color w:val="000000"/>
+                <w:sz w:val="18"/>
+              </w:rPr>
+              <w:t>策略数</w:t>
+            </w:r>
+          </w:p>
+        </w:tc>
       </w:tr>
       <w:tr>
         <w:tc>
           <w:tcPr>
-            <w:tcW w:type="dxa" w:w="2161"/>
+            <w:tcW w:type="dxa" w:w="1729"/>
             <w:shd w:fill="FFFFFF" w:val="clear"/>
           </w:tcPr>
           <w:p>
@@ -13841,7 +14033,7 @@
         </w:tc>
         <w:tc>
           <w:tcPr>
-            <w:tcW w:type="dxa" w:w="2161"/>
+            <w:tcW w:type="dxa" w:w="1729"/>
             <w:shd w:fill="FFFFFF" w:val="clear"/>
           </w:tcPr>
           <w:p>
@@ -13862,7 +14054,7 @@
         </w:tc>
         <w:tc>
           <w:tcPr>
-            <w:tcW w:type="dxa" w:w="2161"/>
+            <w:tcW w:type="dxa" w:w="1729"/>
             <w:shd w:fill="FFFFFF" w:val="clear"/>
           </w:tcPr>
           <w:p>
@@ -13883,7 +14075,7 @@
         </w:tc>
         <w:tc>
           <w:tcPr>
-            <w:tcW w:type="dxa" w:w="2161"/>
+            <w:tcW w:type="dxa" w:w="1729"/>
             <w:shd w:fill="FFFFFF" w:val="clear"/>
           </w:tcPr>
           <w:p>
@@ -13899,6 +14091,27 @@
                 <w:sz w:val="16"/>
               </w:rPr>
               <w:t>560</w:t>
+            </w:r>
+          </w:p>
+        </w:tc>
+        <w:tc>
+          <w:tcPr>
+            <w:tcW w:type="dxa" w:w="1729"/>
+            <w:shd w:fill="FFFFFF" w:val="clear"/>
+          </w:tcPr>
+          <w:p>
+            <w:pPr>
+              <w:spacing w:before="20" w:after="20"/>
+              <w:jc w:val="center"/>
+            </w:pPr>
+            <w:r>
+              <w:rPr>
+                <w:rFonts w:ascii="Microsoft YaHei" w:hAnsi="Microsoft YaHei" w:eastAsia="Microsoft YaHei"/>
+                <w:b w:val="0"/>
+                <w:color w:val="333333"/>
+                <w:sz w:val="16"/>
+              </w:rPr>
+              <w:t>7</w:t>
             </w:r>
           </w:p>
         </w:tc>
@@ -13906,7 +14119,7 @@
       <w:tr>
         <w:tc>
           <w:tcPr>
-            <w:tcW w:type="dxa" w:w="2161"/>
+            <w:tcW w:type="dxa" w:w="1729"/>
             <w:shd w:fill="E6E6E6" w:val="clear"/>
           </w:tcPr>
           <w:p>
@@ -13927,7 +14140,7 @@
         </w:tc>
         <w:tc>
           <w:tcPr>
-            <w:tcW w:type="dxa" w:w="2161"/>
+            <w:tcW w:type="dxa" w:w="1729"/>
             <w:shd w:fill="E6E6E6" w:val="clear"/>
           </w:tcPr>
           <w:p>
@@ -13948,7 +14161,7 @@
         </w:tc>
         <w:tc>
           <w:tcPr>
-            <w:tcW w:type="dxa" w:w="2161"/>
+            <w:tcW w:type="dxa" w:w="1729"/>
             <w:shd w:fill="E6E6E6" w:val="clear"/>
           </w:tcPr>
           <w:p>
@@ -13969,7 +14182,7 @@
         </w:tc>
         <w:tc>
           <w:tcPr>
-            <w:tcW w:type="dxa" w:w="2161"/>
+            <w:tcW w:type="dxa" w:w="1729"/>
             <w:shd w:fill="E6E6E6" w:val="clear"/>
           </w:tcPr>
           <w:p>
@@ -13985,6 +14198,27 @@
                 <w:sz w:val="16"/>
               </w:rPr>
               <w:t>257</w:t>
+            </w:r>
+          </w:p>
+        </w:tc>
+        <w:tc>
+          <w:tcPr>
+            <w:tcW w:type="dxa" w:w="1729"/>
+            <w:shd w:fill="E6E6E6" w:val="clear"/>
+          </w:tcPr>
+          <w:p>
+            <w:pPr>
+              <w:spacing w:before="20" w:after="20"/>
+              <w:jc w:val="center"/>
+            </w:pPr>
+            <w:r>
+              <w:rPr>
+                <w:rFonts w:ascii="Microsoft YaHei" w:hAnsi="Microsoft YaHei" w:eastAsia="Microsoft YaHei"/>
+                <w:b w:val="0"/>
+                <w:color w:val="333333"/>
+                <w:sz w:val="16"/>
+              </w:rPr>
+              <w:t>7</w:t>
             </w:r>
           </w:p>
         </w:tc>
@@ -13992,7 +14226,7 @@
       <w:tr>
         <w:tc>
           <w:tcPr>
-            <w:tcW w:type="dxa" w:w="2161"/>
+            <w:tcW w:type="dxa" w:w="1729"/>
             <w:shd w:fill="FFFFFF" w:val="clear"/>
           </w:tcPr>
           <w:p>
@@ -14013,7 +14247,7 @@
         </w:tc>
         <w:tc>
           <w:tcPr>
-            <w:tcW w:type="dxa" w:w="2161"/>
+            <w:tcW w:type="dxa" w:w="1729"/>
             <w:shd w:fill="FFFFFF" w:val="clear"/>
           </w:tcPr>
           <w:p>
@@ -14034,7 +14268,7 @@
         </w:tc>
         <w:tc>
           <w:tcPr>
-            <w:tcW w:type="dxa" w:w="2161"/>
+            <w:tcW w:type="dxa" w:w="1729"/>
             <w:shd w:fill="FFFFFF" w:val="clear"/>
           </w:tcPr>
           <w:p>
@@ -14055,7 +14289,7 @@
         </w:tc>
         <w:tc>
           <w:tcPr>
-            <w:tcW w:type="dxa" w:w="2161"/>
+            <w:tcW w:type="dxa" w:w="1729"/>
             <w:shd w:fill="FFFFFF" w:val="clear"/>
           </w:tcPr>
           <w:p>
@@ -14071,6 +14305,27 @@
                 <w:sz w:val="16"/>
               </w:rPr>
               <w:t>86</w:t>
+            </w:r>
+          </w:p>
+        </w:tc>
+        <w:tc>
+          <w:tcPr>
+            <w:tcW w:type="dxa" w:w="1729"/>
+            <w:shd w:fill="FFFFFF" w:val="clear"/>
+          </w:tcPr>
+          <w:p>
+            <w:pPr>
+              <w:spacing w:before="20" w:after="20"/>
+              <w:jc w:val="center"/>
+            </w:pPr>
+            <w:r>
+              <w:rPr>
+                <w:rFonts w:ascii="Microsoft YaHei" w:hAnsi="Microsoft YaHei" w:eastAsia="Microsoft YaHei"/>
+                <w:b w:val="0"/>
+                <w:color w:val="333333"/>
+                <w:sz w:val="16"/>
+              </w:rPr>
+              <w:t>7</w:t>
             </w:r>
           </w:p>
         </w:tc>
@@ -14078,7 +14333,7 @@
       <w:tr>
         <w:tc>
           <w:tcPr>
-            <w:tcW w:type="dxa" w:w="2161"/>
+            <w:tcW w:type="dxa" w:w="1729"/>
             <w:shd w:fill="E6E6E6" w:val="clear"/>
           </w:tcPr>
           <w:p>
@@ -14099,7 +14354,7 @@
         </w:tc>
         <w:tc>
           <w:tcPr>
-            <w:tcW w:type="dxa" w:w="2161"/>
+            <w:tcW w:type="dxa" w:w="1729"/>
             <w:shd w:fill="E6E6E6" w:val="clear"/>
           </w:tcPr>
           <w:p>
@@ -14120,7 +14375,7 @@
         </w:tc>
         <w:tc>
           <w:tcPr>
-            <w:tcW w:type="dxa" w:w="2161"/>
+            <w:tcW w:type="dxa" w:w="1729"/>
             <w:shd w:fill="E6E6E6" w:val="clear"/>
           </w:tcPr>
           <w:p>
@@ -14141,7 +14396,7 @@
         </w:tc>
         <w:tc>
           <w:tcPr>
-            <w:tcW w:type="dxa" w:w="2161"/>
+            <w:tcW w:type="dxa" w:w="1729"/>
             <w:shd w:fill="E6E6E6" w:val="clear"/>
           </w:tcPr>
           <w:p>
@@ -14157,6 +14412,27 @@
                 <w:sz w:val="16"/>
               </w:rPr>
               <w:t>19</w:t>
+            </w:r>
+          </w:p>
+        </w:tc>
+        <w:tc>
+          <w:tcPr>
+            <w:tcW w:type="dxa" w:w="1729"/>
+            <w:shd w:fill="E6E6E6" w:val="clear"/>
+          </w:tcPr>
+          <w:p>
+            <w:pPr>
+              <w:spacing w:before="20" w:after="20"/>
+              <w:jc w:val="center"/>
+            </w:pPr>
+            <w:r>
+              <w:rPr>
+                <w:rFonts w:ascii="Microsoft YaHei" w:hAnsi="Microsoft YaHei" w:eastAsia="Microsoft YaHei"/>
+                <w:b w:val="0"/>
+                <w:color w:val="333333"/>
+                <w:sz w:val="16"/>
+              </w:rPr>
+              <w:t>6</w:t>
             </w:r>
           </w:p>
         </w:tc>
@@ -14164,7 +14440,7 @@
       <w:tr>
         <w:tc>
           <w:tcPr>
-            <w:tcW w:type="dxa" w:w="2161"/>
+            <w:tcW w:type="dxa" w:w="1729"/>
             <w:shd w:fill="FFFFFF" w:val="clear"/>
           </w:tcPr>
           <w:p>
@@ -14185,7 +14461,7 @@
         </w:tc>
         <w:tc>
           <w:tcPr>
-            <w:tcW w:type="dxa" w:w="2161"/>
+            <w:tcW w:type="dxa" w:w="1729"/>
             <w:shd w:fill="FFFFFF" w:val="clear"/>
           </w:tcPr>
           <w:p>
@@ -14206,7 +14482,7 @@
         </w:tc>
         <w:tc>
           <w:tcPr>
-            <w:tcW w:type="dxa" w:w="2161"/>
+            <w:tcW w:type="dxa" w:w="1729"/>
             <w:shd w:fill="FFFFFF" w:val="clear"/>
           </w:tcPr>
           <w:p>
@@ -14227,7 +14503,7 @@
         </w:tc>
         <w:tc>
           <w:tcPr>
-            <w:tcW w:type="dxa" w:w="2161"/>
+            <w:tcW w:type="dxa" w:w="1729"/>
             <w:shd w:fill="FFFFFF" w:val="clear"/>
           </w:tcPr>
           <w:p>
@@ -14243,6 +14519,27 @@
                 <w:sz w:val="16"/>
               </w:rPr>
               <w:t>14</w:t>
+            </w:r>
+          </w:p>
+        </w:tc>
+        <w:tc>
+          <w:tcPr>
+            <w:tcW w:type="dxa" w:w="1729"/>
+            <w:shd w:fill="FFFFFF" w:val="clear"/>
+          </w:tcPr>
+          <w:p>
+            <w:pPr>
+              <w:spacing w:before="20" w:after="20"/>
+              <w:jc w:val="center"/>
+            </w:pPr>
+            <w:r>
+              <w:rPr>
+                <w:rFonts w:ascii="Microsoft YaHei" w:hAnsi="Microsoft YaHei" w:eastAsia="Microsoft YaHei"/>
+                <w:b w:val="0"/>
+                <w:color w:val="333333"/>
+                <w:sz w:val="16"/>
+              </w:rPr>
+              <w:t>4</w:t>
             </w:r>
           </w:p>
         </w:tc>
@@ -14250,7 +14547,7 @@
       <w:tr>
         <w:tc>
           <w:tcPr>
-            <w:tcW w:type="dxa" w:w="2161"/>
+            <w:tcW w:type="dxa" w:w="1729"/>
             <w:shd w:fill="E6E6E6" w:val="clear"/>
           </w:tcPr>
           <w:p>
@@ -14271,7 +14568,7 @@
         </w:tc>
         <w:tc>
           <w:tcPr>
-            <w:tcW w:type="dxa" w:w="2161"/>
+            <w:tcW w:type="dxa" w:w="1729"/>
             <w:shd w:fill="E6E6E6" w:val="clear"/>
           </w:tcPr>
           <w:p>
@@ -14292,7 +14589,7 @@
         </w:tc>
         <w:tc>
           <w:tcPr>
-            <w:tcW w:type="dxa" w:w="2161"/>
+            <w:tcW w:type="dxa" w:w="1729"/>
             <w:shd w:fill="E6E6E6" w:val="clear"/>
           </w:tcPr>
           <w:p>
@@ -14313,7 +14610,7 @@
         </w:tc>
         <w:tc>
           <w:tcPr>
-            <w:tcW w:type="dxa" w:w="2161"/>
+            <w:tcW w:type="dxa" w:w="1729"/>
             <w:shd w:fill="E6E6E6" w:val="clear"/>
           </w:tcPr>
           <w:p>
@@ -14329,6 +14626,27 @@
                 <w:sz w:val="16"/>
               </w:rPr>
               <w:t>25</w:t>
+            </w:r>
+          </w:p>
+        </w:tc>
+        <w:tc>
+          <w:tcPr>
+            <w:tcW w:type="dxa" w:w="1729"/>
+            <w:shd w:fill="E6E6E6" w:val="clear"/>
+          </w:tcPr>
+          <w:p>
+            <w:pPr>
+              <w:spacing w:before="20" w:after="20"/>
+              <w:jc w:val="center"/>
+            </w:pPr>
+            <w:r>
+              <w:rPr>
+                <w:rFonts w:ascii="Microsoft YaHei" w:hAnsi="Microsoft YaHei" w:eastAsia="Microsoft YaHei"/>
+                <w:b w:val="0"/>
+                <w:color w:val="333333"/>
+                <w:sz w:val="16"/>
+              </w:rPr>
+              <w:t>1</w:t>
             </w:r>
           </w:p>
         </w:tc>
@@ -14932,7 +15250,7 @@
           <w:color w:val="000000"/>
           <w:sz w:val="24"/>
         </w:rPr>
-        <w:t>4.3 方向相反的策略（逐策略展开）</w:t>
+        <w:t>4.3 方向相反的异常策略</w:t>
       </w:r>
     </w:p>
     <w:p>
@@ -14943,7 +15261,1194 @@
           <w:color w:val="000000"/>
           <w:sz w:val="20"/>
         </w:rPr>
-        <w:t>以下 5 条策略的阈值加深方向与全策略中位数明显相反（相关系数 &lt; -0.5），逐策略展示平均回报、命中率、交易数。多条件策略只调整被扫描条件，其余条件固定。</w:t>
+        <w:t>按策略逐条统计阈值加深后的效果方向，同时看平均回报与命中率两个相关系数；任一指标相关系数 &lt; -0.5 即列入异常。全部 33 组策略级阈值扫描中，负向策略平均回报中位数相关系数为 +0.73、命中率中位数为 +0.82；正向策略分别为 +0.90、+0.79。共 8 组异常策略（同一策略调整不同条件计为不同组）：</w:t>
+      </w:r>
+    </w:p>
+    <w:tbl>
+      <w:tblPr>
+        <w:tblW w:type="auto" w:w="0"/>
+        <w:jc w:val="center"/>
+        <w:tblLayout w:type="fixed"/>
+        <w:tblLook w:firstColumn="1" w:firstRow="1" w:lastColumn="0" w:lastRow="0" w:noHBand="0" w:noVBand="1" w:val="04A0"/>
+        <w:tblBorders>
+          <w:top w:val="single" w:sz="4" w:space="0" w:color="BBBBBB"/>
+          <w:left w:val="single" w:sz="4" w:space="0" w:color="BBBBBB"/>
+          <w:bottom w:val="single" w:sz="4" w:space="0" w:color="BBBBBB"/>
+          <w:right w:val="single" w:sz="4" w:space="0" w:color="BBBBBB"/>
+          <w:insideH w:val="single" w:sz="4" w:space="0" w:color="BBBBBB"/>
+          <w:insideV w:val="single" w:sz="4" w:space="0" w:color="BBBBBB"/>
+        </w:tblBorders>
+      </w:tblPr>
+      <w:tblGrid>
+        <w:gridCol w:w="1441"/>
+        <w:gridCol w:w="1441"/>
+        <w:gridCol w:w="1441"/>
+        <w:gridCol w:w="1441"/>
+        <w:gridCol w:w="1441"/>
+        <w:gridCol w:w="1441"/>
+      </w:tblGrid>
+      <w:tr>
+        <w:tc>
+          <w:tcPr>
+            <w:tcW w:type="dxa" w:w="850"/>
+            <w:shd w:fill="FFFFFF" w:val="clear"/>
+          </w:tcPr>
+          <w:p>
+            <w:pPr>
+              <w:spacing w:before="60" w:after="60"/>
+              <w:jc w:val="center"/>
+            </w:pPr>
+            <w:r>
+              <w:rPr>
+                <w:rFonts w:ascii="SimHei" w:hAnsi="SimHei" w:eastAsia="SimHei"/>
+                <w:b/>
+                <w:color w:val="000000"/>
+                <w:sz w:val="18"/>
+              </w:rPr>
+              <w:t>基金</w:t>
+            </w:r>
+          </w:p>
+        </w:tc>
+        <w:tc>
+          <w:tcPr>
+            <w:tcW w:type="dxa" w:w="2268"/>
+            <w:shd w:fill="FFFFFF" w:val="clear"/>
+          </w:tcPr>
+          <w:p>
+            <w:pPr>
+              <w:spacing w:before="60" w:after="60"/>
+              <w:jc w:val="center"/>
+            </w:pPr>
+            <w:r>
+              <w:rPr>
+                <w:rFonts w:ascii="SimHei" w:hAnsi="SimHei" w:eastAsia="SimHei"/>
+                <w:b/>
+                <w:color w:val="000000"/>
+                <w:sz w:val="18"/>
+              </w:rPr>
+              <w:t>条件</w:t>
+            </w:r>
+          </w:p>
+        </w:tc>
+        <w:tc>
+          <w:tcPr>
+            <w:tcW w:type="dxa" w:w="1134"/>
+            <w:shd w:fill="FFFFFF" w:val="clear"/>
+          </w:tcPr>
+          <w:p>
+            <w:pPr>
+              <w:spacing w:before="60" w:after="60"/>
+              <w:jc w:val="center"/>
+            </w:pPr>
+            <w:r>
+              <w:rPr>
+                <w:rFonts w:ascii="SimHei" w:hAnsi="SimHei" w:eastAsia="SimHei"/>
+                <w:b/>
+                <w:color w:val="000000"/>
+                <w:sz w:val="18"/>
+              </w:rPr>
+              <w:t>调整条件</w:t>
+            </w:r>
+          </w:p>
+        </w:tc>
+        <w:tc>
+          <w:tcPr>
+            <w:tcW w:type="dxa" w:w="907"/>
+            <w:shd w:fill="FFFFFF" w:val="clear"/>
+          </w:tcPr>
+          <w:p>
+            <w:pPr>
+              <w:spacing w:before="60" w:after="60"/>
+              <w:jc w:val="center"/>
+            </w:pPr>
+            <w:r>
+              <w:rPr>
+                <w:rFonts w:ascii="SimHei" w:hAnsi="SimHei" w:eastAsia="SimHei"/>
+                <w:b/>
+                <w:color w:val="000000"/>
+                <w:sz w:val="18"/>
+              </w:rPr>
+              <w:t>平均回报rho</w:t>
+            </w:r>
+          </w:p>
+        </w:tc>
+        <w:tc>
+          <w:tcPr>
+            <w:tcW w:type="dxa" w:w="907"/>
+            <w:shd w:fill="FFFFFF" w:val="clear"/>
+          </w:tcPr>
+          <w:p>
+            <w:pPr>
+              <w:spacing w:before="60" w:after="60"/>
+              <w:jc w:val="center"/>
+            </w:pPr>
+            <w:r>
+              <w:rPr>
+                <w:rFonts w:ascii="SimHei" w:hAnsi="SimHei" w:eastAsia="SimHei"/>
+                <w:b/>
+                <w:color w:val="000000"/>
+                <w:sz w:val="18"/>
+              </w:rPr>
+              <w:t>命中率rho</w:t>
+            </w:r>
+          </w:p>
+        </w:tc>
+        <w:tc>
+          <w:tcPr>
+            <w:tcW w:type="dxa" w:w="1134"/>
+            <w:shd w:fill="FFFFFF" w:val="clear"/>
+          </w:tcPr>
+          <w:p>
+            <w:pPr>
+              <w:spacing w:before="60" w:after="60"/>
+              <w:jc w:val="center"/>
+            </w:pPr>
+            <w:r>
+              <w:rPr>
+                <w:rFonts w:ascii="SimHei" w:hAnsi="SimHei" w:eastAsia="SimHei"/>
+                <w:b/>
+                <w:color w:val="000000"/>
+                <w:sz w:val="18"/>
+              </w:rPr>
+              <w:t>异常指标</w:t>
+            </w:r>
+          </w:p>
+        </w:tc>
+      </w:tr>
+      <w:tr>
+        <w:tc>
+          <w:tcPr>
+            <w:tcW w:type="dxa" w:w="1441"/>
+            <w:shd w:fill="FFFFFF" w:val="clear"/>
+          </w:tcPr>
+          <w:p>
+            <w:pPr>
+              <w:spacing w:before="20" w:after="20"/>
+              <w:jc w:val="center"/>
+            </w:pPr>
+            <w:r>
+              <w:rPr>
+                <w:rFonts w:ascii="Microsoft YaHei" w:hAnsi="Microsoft YaHei" w:eastAsia="Microsoft YaHei"/>
+                <w:b w:val="0"/>
+                <w:color w:val="333333"/>
+                <w:sz w:val="16"/>
+              </w:rPr>
+              <w:t>BIPIX</w:t>
+            </w:r>
+          </w:p>
+        </w:tc>
+        <w:tc>
+          <w:tcPr>
+            <w:tcW w:type="dxa" w:w="1441"/>
+            <w:shd w:fill="FFFFFF" w:val="clear"/>
+          </w:tcPr>
+          <w:p>
+            <w:pPr>
+              <w:spacing w:before="20" w:after="20"/>
+              <w:jc w:val="center"/>
+            </w:pPr>
+            <w:r>
+              <w:rPr>
+                <w:rFonts w:ascii="Microsoft YaHei" w:hAnsi="Microsoft YaHei" w:eastAsia="Microsoft YaHei"/>
+                <w:b w:val="0"/>
+                <w:color w:val="333333"/>
+                <w:sz w:val="16"/>
+              </w:rPr>
+              <w:t>SLV&gt;=1% 且 该基金当日回报&lt;0，买基金后2日平均回报</w:t>
+            </w:r>
+          </w:p>
+        </w:tc>
+        <w:tc>
+          <w:tcPr>
+            <w:tcW w:type="dxa" w:w="1441"/>
+            <w:shd w:fill="FFFFFF" w:val="clear"/>
+          </w:tcPr>
+          <w:p>
+            <w:pPr>
+              <w:spacing w:before="20" w:after="20"/>
+              <w:jc w:val="center"/>
+            </w:pPr>
+            <w:r>
+              <w:rPr>
+                <w:rFonts w:ascii="Microsoft YaHei" w:hAnsi="Microsoft YaHei" w:eastAsia="Microsoft YaHei"/>
+                <w:b w:val="0"/>
+                <w:color w:val="333333"/>
+                <w:sz w:val="16"/>
+              </w:rPr>
+              <w:t>SLV 阈值</w:t>
+            </w:r>
+          </w:p>
+        </w:tc>
+        <w:tc>
+          <w:tcPr>
+            <w:tcW w:type="dxa" w:w="1441"/>
+            <w:shd w:fill="FFFFFF" w:val="clear"/>
+          </w:tcPr>
+          <w:p>
+            <w:pPr>
+              <w:spacing w:before="20" w:after="20"/>
+              <w:jc w:val="center"/>
+            </w:pPr>
+            <w:r>
+              <w:rPr>
+                <w:rFonts w:ascii="Microsoft YaHei" w:hAnsi="Microsoft YaHei" w:eastAsia="Microsoft YaHei"/>
+                <w:b w:val="0"/>
+                <w:color w:val="333333"/>
+                <w:sz w:val="16"/>
+              </w:rPr>
+              <w:t>+0.94</w:t>
+            </w:r>
+          </w:p>
+        </w:tc>
+        <w:tc>
+          <w:tcPr>
+            <w:tcW w:type="dxa" w:w="1441"/>
+            <w:shd w:fill="FFFFFF" w:val="clear"/>
+          </w:tcPr>
+          <w:p>
+            <w:pPr>
+              <w:spacing w:before="20" w:after="20"/>
+              <w:jc w:val="center"/>
+            </w:pPr>
+            <w:r>
+              <w:rPr>
+                <w:rFonts w:ascii="Microsoft YaHei" w:hAnsi="Microsoft YaHei" w:eastAsia="Microsoft YaHei"/>
+                <w:b w:val="0"/>
+                <w:color w:val="333333"/>
+                <w:sz w:val="16"/>
+              </w:rPr>
+              <w:t>-0.71</w:t>
+            </w:r>
+          </w:p>
+        </w:tc>
+        <w:tc>
+          <w:tcPr>
+            <w:tcW w:type="dxa" w:w="1441"/>
+            <w:shd w:fill="FFFFFF" w:val="clear"/>
+          </w:tcPr>
+          <w:p>
+            <w:pPr>
+              <w:spacing w:before="20" w:after="20"/>
+              <w:jc w:val="center"/>
+            </w:pPr>
+            <w:r>
+              <w:rPr>
+                <w:rFonts w:ascii="Microsoft YaHei" w:hAnsi="Microsoft YaHei" w:eastAsia="Microsoft YaHei"/>
+                <w:b w:val="0"/>
+                <w:color w:val="333333"/>
+                <w:sz w:val="16"/>
+              </w:rPr>
+              <w:t>命中率</w:t>
+            </w:r>
+          </w:p>
+        </w:tc>
+      </w:tr>
+      <w:tr>
+        <w:tc>
+          <w:tcPr>
+            <w:tcW w:type="dxa" w:w="1441"/>
+            <w:shd w:fill="E6E6E6" w:val="clear"/>
+          </w:tcPr>
+          <w:p>
+            <w:pPr>
+              <w:spacing w:before="20" w:after="20"/>
+              <w:jc w:val="center"/>
+            </w:pPr>
+            <w:r>
+              <w:rPr>
+                <w:rFonts w:ascii="Microsoft YaHei" w:hAnsi="Microsoft YaHei" w:eastAsia="Microsoft YaHei"/>
+                <w:b w:val="0"/>
+                <w:color w:val="333333"/>
+                <w:sz w:val="16"/>
+              </w:rPr>
+              <w:t>CYPIX</w:t>
+            </w:r>
+          </w:p>
+        </w:tc>
+        <w:tc>
+          <w:tcPr>
+            <w:tcW w:type="dxa" w:w="1441"/>
+            <w:shd w:fill="E6E6E6" w:val="clear"/>
+          </w:tcPr>
+          <w:p>
+            <w:pPr>
+              <w:spacing w:before="20" w:after="20"/>
+              <w:jc w:val="center"/>
+            </w:pPr>
+            <w:r>
+              <w:rPr>
+                <w:rFonts w:ascii="Microsoft YaHei" w:hAnsi="Microsoft YaHei" w:eastAsia="Microsoft YaHei"/>
+                <w:b w:val="0"/>
+                <w:color w:val="333333"/>
+                <w:sz w:val="16"/>
+              </w:rPr>
+              <w:t>XLK&lt;=-1% 且 该基金当日回报&lt;=-2%，买基金第二天</w:t>
+            </w:r>
+          </w:p>
+        </w:tc>
+        <w:tc>
+          <w:tcPr>
+            <w:tcW w:type="dxa" w:w="1441"/>
+            <w:shd w:fill="E6E6E6" w:val="clear"/>
+          </w:tcPr>
+          <w:p>
+            <w:pPr>
+              <w:spacing w:before="20" w:after="20"/>
+              <w:jc w:val="center"/>
+            </w:pPr>
+            <w:r>
+              <w:rPr>
+                <w:rFonts w:ascii="Microsoft YaHei" w:hAnsi="Microsoft YaHei" w:eastAsia="Microsoft YaHei"/>
+                <w:b w:val="0"/>
+                <w:color w:val="333333"/>
+                <w:sz w:val="16"/>
+              </w:rPr>
+              <w:t>XLK 阈值</w:t>
+            </w:r>
+          </w:p>
+        </w:tc>
+        <w:tc>
+          <w:tcPr>
+            <w:tcW w:type="dxa" w:w="1441"/>
+            <w:shd w:fill="E6E6E6" w:val="clear"/>
+          </w:tcPr>
+          <w:p>
+            <w:pPr>
+              <w:spacing w:before="20" w:after="20"/>
+              <w:jc w:val="center"/>
+            </w:pPr>
+            <w:r>
+              <w:rPr>
+                <w:rFonts w:ascii="Microsoft YaHei" w:hAnsi="Microsoft YaHei" w:eastAsia="Microsoft YaHei"/>
+                <w:b w:val="0"/>
+                <w:color w:val="333333"/>
+                <w:sz w:val="16"/>
+              </w:rPr>
+              <w:t>-0.62</w:t>
+            </w:r>
+          </w:p>
+        </w:tc>
+        <w:tc>
+          <w:tcPr>
+            <w:tcW w:type="dxa" w:w="1441"/>
+            <w:shd w:fill="E6E6E6" w:val="clear"/>
+          </w:tcPr>
+          <w:p>
+            <w:pPr>
+              <w:spacing w:before="20" w:after="20"/>
+              <w:jc w:val="center"/>
+            </w:pPr>
+            <w:r>
+              <w:rPr>
+                <w:rFonts w:ascii="Microsoft YaHei" w:hAnsi="Microsoft YaHei" w:eastAsia="Microsoft YaHei"/>
+                <w:b w:val="0"/>
+                <w:color w:val="333333"/>
+                <w:sz w:val="16"/>
+              </w:rPr>
+              <w:t>-0.11</w:t>
+            </w:r>
+          </w:p>
+        </w:tc>
+        <w:tc>
+          <w:tcPr>
+            <w:tcW w:type="dxa" w:w="1441"/>
+            <w:shd w:fill="E6E6E6" w:val="clear"/>
+          </w:tcPr>
+          <w:p>
+            <w:pPr>
+              <w:spacing w:before="20" w:after="20"/>
+              <w:jc w:val="center"/>
+            </w:pPr>
+            <w:r>
+              <w:rPr>
+                <w:rFonts w:ascii="Microsoft YaHei" w:hAnsi="Microsoft YaHei" w:eastAsia="Microsoft YaHei"/>
+                <w:b w:val="0"/>
+                <w:color w:val="333333"/>
+                <w:sz w:val="16"/>
+              </w:rPr>
+              <w:t>平均回报</w:t>
+            </w:r>
+          </w:p>
+        </w:tc>
+      </w:tr>
+      <w:tr>
+        <w:tc>
+          <w:tcPr>
+            <w:tcW w:type="dxa" w:w="1441"/>
+            <w:shd w:fill="FFFFFF" w:val="clear"/>
+          </w:tcPr>
+          <w:p>
+            <w:pPr>
+              <w:spacing w:before="20" w:after="20"/>
+              <w:jc w:val="center"/>
+            </w:pPr>
+            <w:r>
+              <w:rPr>
+                <w:rFonts w:ascii="Microsoft YaHei" w:hAnsi="Microsoft YaHei" w:eastAsia="Microsoft YaHei"/>
+                <w:b w:val="0"/>
+                <w:color w:val="333333"/>
+                <w:sz w:val="16"/>
+              </w:rPr>
+              <w:t>CYPIX</w:t>
+            </w:r>
+          </w:p>
+        </w:tc>
+        <w:tc>
+          <w:tcPr>
+            <w:tcW w:type="dxa" w:w="1441"/>
+            <w:shd w:fill="FFFFFF" w:val="clear"/>
+          </w:tcPr>
+          <w:p>
+            <w:pPr>
+              <w:spacing w:before="20" w:after="20"/>
+              <w:jc w:val="center"/>
+            </w:pPr>
+            <w:r>
+              <w:rPr>
+                <w:rFonts w:ascii="Microsoft YaHei" w:hAnsi="Microsoft YaHei" w:eastAsia="Microsoft YaHei"/>
+                <w:b w:val="0"/>
+                <w:color w:val="333333"/>
+                <w:sz w:val="16"/>
+              </w:rPr>
+              <w:t>XLK&lt;=-1% 且 该基金当日回报&lt;=-2%，买基金第二天</w:t>
+            </w:r>
+          </w:p>
+        </w:tc>
+        <w:tc>
+          <w:tcPr>
+            <w:tcW w:type="dxa" w:w="1441"/>
+            <w:shd w:fill="FFFFFF" w:val="clear"/>
+          </w:tcPr>
+          <w:p>
+            <w:pPr>
+              <w:spacing w:before="20" w:after="20"/>
+              <w:jc w:val="center"/>
+            </w:pPr>
+            <w:r>
+              <w:rPr>
+                <w:rFonts w:ascii="Microsoft YaHei" w:hAnsi="Microsoft YaHei" w:eastAsia="Microsoft YaHei"/>
+                <w:b w:val="0"/>
+                <w:color w:val="333333"/>
+                <w:sz w:val="16"/>
+              </w:rPr>
+              <w:t>自身大跌阈值</w:t>
+            </w:r>
+          </w:p>
+        </w:tc>
+        <w:tc>
+          <w:tcPr>
+            <w:tcW w:type="dxa" w:w="1441"/>
+            <w:shd w:fill="FFFFFF" w:val="clear"/>
+          </w:tcPr>
+          <w:p>
+            <w:pPr>
+              <w:spacing w:before="20" w:after="20"/>
+              <w:jc w:val="center"/>
+            </w:pPr>
+            <w:r>
+              <w:rPr>
+                <w:rFonts w:ascii="Microsoft YaHei" w:hAnsi="Microsoft YaHei" w:eastAsia="Microsoft YaHei"/>
+                <w:b w:val="0"/>
+                <w:color w:val="333333"/>
+                <w:sz w:val="16"/>
+              </w:rPr>
+              <w:t>-0.14</w:t>
+            </w:r>
+          </w:p>
+        </w:tc>
+        <w:tc>
+          <w:tcPr>
+            <w:tcW w:type="dxa" w:w="1441"/>
+            <w:shd w:fill="FFFFFF" w:val="clear"/>
+          </w:tcPr>
+          <w:p>
+            <w:pPr>
+              <w:spacing w:before="20" w:after="20"/>
+              <w:jc w:val="center"/>
+            </w:pPr>
+            <w:r>
+              <w:rPr>
+                <w:rFonts w:ascii="Microsoft YaHei" w:hAnsi="Microsoft YaHei" w:eastAsia="Microsoft YaHei"/>
+                <w:b w:val="0"/>
+                <w:color w:val="333333"/>
+                <w:sz w:val="16"/>
+              </w:rPr>
+              <w:t>-0.65</w:t>
+            </w:r>
+          </w:p>
+        </w:tc>
+        <w:tc>
+          <w:tcPr>
+            <w:tcW w:type="dxa" w:w="1441"/>
+            <w:shd w:fill="FFFFFF" w:val="clear"/>
+          </w:tcPr>
+          <w:p>
+            <w:pPr>
+              <w:spacing w:before="20" w:after="20"/>
+              <w:jc w:val="center"/>
+            </w:pPr>
+            <w:r>
+              <w:rPr>
+                <w:rFonts w:ascii="Microsoft YaHei" w:hAnsi="Microsoft YaHei" w:eastAsia="Microsoft YaHei"/>
+                <w:b w:val="0"/>
+                <w:color w:val="333333"/>
+                <w:sz w:val="16"/>
+              </w:rPr>
+              <w:t>命中率</w:t>
+            </w:r>
+          </w:p>
+        </w:tc>
+      </w:tr>
+      <w:tr>
+        <w:tc>
+          <w:tcPr>
+            <w:tcW w:type="dxa" w:w="1441"/>
+            <w:shd w:fill="E6E6E6" w:val="clear"/>
+          </w:tcPr>
+          <w:p>
+            <w:pPr>
+              <w:spacing w:before="20" w:after="20"/>
+              <w:jc w:val="center"/>
+            </w:pPr>
+            <w:r>
+              <w:rPr>
+                <w:rFonts w:ascii="Microsoft YaHei" w:hAnsi="Microsoft YaHei" w:eastAsia="Microsoft YaHei"/>
+                <w:b w:val="0"/>
+                <w:color w:val="333333"/>
+                <w:sz w:val="16"/>
+              </w:rPr>
+              <w:t>UBPIX</w:t>
+            </w:r>
+          </w:p>
+        </w:tc>
+        <w:tc>
+          <w:tcPr>
+            <w:tcW w:type="dxa" w:w="1441"/>
+            <w:shd w:fill="E6E6E6" w:val="clear"/>
+          </w:tcPr>
+          <w:p>
+            <w:pPr>
+              <w:spacing w:before="20" w:after="20"/>
+              <w:jc w:val="center"/>
+            </w:pPr>
+            <w:r>
+              <w:rPr>
+                <w:rFonts w:ascii="Microsoft YaHei" w:hAnsi="Microsoft YaHei" w:eastAsia="Microsoft YaHei"/>
+                <w:b w:val="0"/>
+                <w:color w:val="333333"/>
+                <w:sz w:val="16"/>
+              </w:rPr>
+              <w:t>QQQ&lt;=-1% 且 VIX&gt;0，买基金第二天</w:t>
+            </w:r>
+          </w:p>
+        </w:tc>
+        <w:tc>
+          <w:tcPr>
+            <w:tcW w:type="dxa" w:w="1441"/>
+            <w:shd w:fill="E6E6E6" w:val="clear"/>
+          </w:tcPr>
+          <w:p>
+            <w:pPr>
+              <w:spacing w:before="20" w:after="20"/>
+              <w:jc w:val="center"/>
+            </w:pPr>
+            <w:r>
+              <w:rPr>
+                <w:rFonts w:ascii="Microsoft YaHei" w:hAnsi="Microsoft YaHei" w:eastAsia="Microsoft YaHei"/>
+                <w:b w:val="0"/>
+                <w:color w:val="333333"/>
+                <w:sz w:val="16"/>
+              </w:rPr>
+              <w:t>QQQ 阈值</w:t>
+            </w:r>
+          </w:p>
+        </w:tc>
+        <w:tc>
+          <w:tcPr>
+            <w:tcW w:type="dxa" w:w="1441"/>
+            <w:shd w:fill="E6E6E6" w:val="clear"/>
+          </w:tcPr>
+          <w:p>
+            <w:pPr>
+              <w:spacing w:before="20" w:after="20"/>
+              <w:jc w:val="center"/>
+            </w:pPr>
+            <w:r>
+              <w:rPr>
+                <w:rFonts w:ascii="Microsoft YaHei" w:hAnsi="Microsoft YaHei" w:eastAsia="Microsoft YaHei"/>
+                <w:b w:val="0"/>
+                <w:color w:val="333333"/>
+                <w:sz w:val="16"/>
+              </w:rPr>
+              <w:t>-0.79</w:t>
+            </w:r>
+          </w:p>
+        </w:tc>
+        <w:tc>
+          <w:tcPr>
+            <w:tcW w:type="dxa" w:w="1441"/>
+            <w:shd w:fill="E6E6E6" w:val="clear"/>
+          </w:tcPr>
+          <w:p>
+            <w:pPr>
+              <w:spacing w:before="20" w:after="20"/>
+              <w:jc w:val="center"/>
+            </w:pPr>
+            <w:r>
+              <w:rPr>
+                <w:rFonts w:ascii="Microsoft YaHei" w:hAnsi="Microsoft YaHei" w:eastAsia="Microsoft YaHei"/>
+                <w:b w:val="0"/>
+                <w:color w:val="333333"/>
+                <w:sz w:val="16"/>
+              </w:rPr>
+              <w:t>-0.66</w:t>
+            </w:r>
+          </w:p>
+        </w:tc>
+        <w:tc>
+          <w:tcPr>
+            <w:tcW w:type="dxa" w:w="1441"/>
+            <w:shd w:fill="E6E6E6" w:val="clear"/>
+          </w:tcPr>
+          <w:p>
+            <w:pPr>
+              <w:spacing w:before="20" w:after="20"/>
+              <w:jc w:val="center"/>
+            </w:pPr>
+            <w:r>
+              <w:rPr>
+                <w:rFonts w:ascii="Microsoft YaHei" w:hAnsi="Microsoft YaHei" w:eastAsia="Microsoft YaHei"/>
+                <w:b w:val="0"/>
+                <w:color w:val="333333"/>
+                <w:sz w:val="16"/>
+              </w:rPr>
+              <w:t>平均回报、命中率</w:t>
+            </w:r>
+          </w:p>
+        </w:tc>
+      </w:tr>
+      <w:tr>
+        <w:tc>
+          <w:tcPr>
+            <w:tcW w:type="dxa" w:w="1441"/>
+            <w:shd w:fill="FFFFFF" w:val="clear"/>
+          </w:tcPr>
+          <w:p>
+            <w:pPr>
+              <w:spacing w:before="20" w:after="20"/>
+              <w:jc w:val="center"/>
+            </w:pPr>
+            <w:r>
+              <w:rPr>
+                <w:rFonts w:ascii="Microsoft YaHei" w:hAnsi="Microsoft YaHei" w:eastAsia="Microsoft YaHei"/>
+                <w:b w:val="0"/>
+                <w:color w:val="333333"/>
+                <w:sz w:val="16"/>
+              </w:rPr>
+              <w:t>UBPSX</w:t>
+            </w:r>
+          </w:p>
+        </w:tc>
+        <w:tc>
+          <w:tcPr>
+            <w:tcW w:type="dxa" w:w="1441"/>
+            <w:shd w:fill="FFFFFF" w:val="clear"/>
+          </w:tcPr>
+          <w:p>
+            <w:pPr>
+              <w:spacing w:before="20" w:after="20"/>
+              <w:jc w:val="center"/>
+            </w:pPr>
+            <w:r>
+              <w:rPr>
+                <w:rFonts w:ascii="Microsoft YaHei" w:hAnsi="Microsoft YaHei" w:eastAsia="Microsoft YaHei"/>
+                <w:b w:val="0"/>
+                <w:color w:val="333333"/>
+                <w:sz w:val="16"/>
+              </w:rPr>
+              <w:t>QQQ&lt;=-1% 且 VIX&gt;0，买基金第二天</w:t>
+            </w:r>
+          </w:p>
+        </w:tc>
+        <w:tc>
+          <w:tcPr>
+            <w:tcW w:type="dxa" w:w="1441"/>
+            <w:shd w:fill="FFFFFF" w:val="clear"/>
+          </w:tcPr>
+          <w:p>
+            <w:pPr>
+              <w:spacing w:before="20" w:after="20"/>
+              <w:jc w:val="center"/>
+            </w:pPr>
+            <w:r>
+              <w:rPr>
+                <w:rFonts w:ascii="Microsoft YaHei" w:hAnsi="Microsoft YaHei" w:eastAsia="Microsoft YaHei"/>
+                <w:b w:val="0"/>
+                <w:color w:val="333333"/>
+                <w:sz w:val="16"/>
+              </w:rPr>
+              <w:t>QQQ 阈值</w:t>
+            </w:r>
+          </w:p>
+        </w:tc>
+        <w:tc>
+          <w:tcPr>
+            <w:tcW w:type="dxa" w:w="1441"/>
+            <w:shd w:fill="FFFFFF" w:val="clear"/>
+          </w:tcPr>
+          <w:p>
+            <w:pPr>
+              <w:spacing w:before="20" w:after="20"/>
+              <w:jc w:val="center"/>
+            </w:pPr>
+            <w:r>
+              <w:rPr>
+                <w:rFonts w:ascii="Microsoft YaHei" w:hAnsi="Microsoft YaHei" w:eastAsia="Microsoft YaHei"/>
+                <w:b w:val="0"/>
+                <w:color w:val="333333"/>
+                <w:sz w:val="16"/>
+              </w:rPr>
+              <w:t>-0.80</w:t>
+            </w:r>
+          </w:p>
+        </w:tc>
+        <w:tc>
+          <w:tcPr>
+            <w:tcW w:type="dxa" w:w="1441"/>
+            <w:shd w:fill="FFFFFF" w:val="clear"/>
+          </w:tcPr>
+          <w:p>
+            <w:pPr>
+              <w:spacing w:before="20" w:after="20"/>
+              <w:jc w:val="center"/>
+            </w:pPr>
+            <w:r>
+              <w:rPr>
+                <w:rFonts w:ascii="Microsoft YaHei" w:hAnsi="Microsoft YaHei" w:eastAsia="Microsoft YaHei"/>
+                <w:b w:val="0"/>
+                <w:color w:val="333333"/>
+                <w:sz w:val="16"/>
+              </w:rPr>
+              <w:t>-0.66</w:t>
+            </w:r>
+          </w:p>
+        </w:tc>
+        <w:tc>
+          <w:tcPr>
+            <w:tcW w:type="dxa" w:w="1441"/>
+            <w:shd w:fill="FFFFFF" w:val="clear"/>
+          </w:tcPr>
+          <w:p>
+            <w:pPr>
+              <w:spacing w:before="20" w:after="20"/>
+              <w:jc w:val="center"/>
+            </w:pPr>
+            <w:r>
+              <w:rPr>
+                <w:rFonts w:ascii="Microsoft YaHei" w:hAnsi="Microsoft YaHei" w:eastAsia="Microsoft YaHei"/>
+                <w:b w:val="0"/>
+                <w:color w:val="333333"/>
+                <w:sz w:val="16"/>
+              </w:rPr>
+              <w:t>平均回报、命中率</w:t>
+            </w:r>
+          </w:p>
+        </w:tc>
+      </w:tr>
+      <w:tr>
+        <w:tc>
+          <w:tcPr>
+            <w:tcW w:type="dxa" w:w="1441"/>
+            <w:shd w:fill="E6E6E6" w:val="clear"/>
+          </w:tcPr>
+          <w:p>
+            <w:pPr>
+              <w:spacing w:before="20" w:after="20"/>
+              <w:jc w:val="center"/>
+            </w:pPr>
+            <w:r>
+              <w:rPr>
+                <w:rFonts w:ascii="Microsoft YaHei" w:hAnsi="Microsoft YaHei" w:eastAsia="Microsoft YaHei"/>
+                <w:b w:val="0"/>
+                <w:color w:val="333333"/>
+                <w:sz w:val="16"/>
+              </w:rPr>
+              <w:t>UDPSX</w:t>
+            </w:r>
+          </w:p>
+        </w:tc>
+        <w:tc>
+          <w:tcPr>
+            <w:tcW w:type="dxa" w:w="1441"/>
+            <w:shd w:fill="E6E6E6" w:val="clear"/>
+          </w:tcPr>
+          <w:p>
+            <w:pPr>
+              <w:spacing w:before="20" w:after="20"/>
+              <w:jc w:val="center"/>
+            </w:pPr>
+            <w:r>
+              <w:rPr>
+                <w:rFonts w:ascii="Microsoft YaHei" w:hAnsi="Microsoft YaHei" w:eastAsia="Microsoft YaHei"/>
+                <w:b w:val="0"/>
+                <w:color w:val="333333"/>
+                <w:sz w:val="16"/>
+              </w:rPr>
+              <w:t>QQQ&lt;=-1% 且 VIX5d&gt;0，买基金第二天</w:t>
+            </w:r>
+          </w:p>
+        </w:tc>
+        <w:tc>
+          <w:tcPr>
+            <w:tcW w:type="dxa" w:w="1441"/>
+            <w:shd w:fill="E6E6E6" w:val="clear"/>
+          </w:tcPr>
+          <w:p>
+            <w:pPr>
+              <w:spacing w:before="20" w:after="20"/>
+              <w:jc w:val="center"/>
+            </w:pPr>
+            <w:r>
+              <w:rPr>
+                <w:rFonts w:ascii="Microsoft YaHei" w:hAnsi="Microsoft YaHei" w:eastAsia="Microsoft YaHei"/>
+                <w:b w:val="0"/>
+                <w:color w:val="333333"/>
+                <w:sz w:val="16"/>
+              </w:rPr>
+              <w:t>QQQ 阈值</w:t>
+            </w:r>
+          </w:p>
+        </w:tc>
+        <w:tc>
+          <w:tcPr>
+            <w:tcW w:type="dxa" w:w="1441"/>
+            <w:shd w:fill="E6E6E6" w:val="clear"/>
+          </w:tcPr>
+          <w:p>
+            <w:pPr>
+              <w:spacing w:before="20" w:after="20"/>
+              <w:jc w:val="center"/>
+            </w:pPr>
+            <w:r>
+              <w:rPr>
+                <w:rFonts w:ascii="Microsoft YaHei" w:hAnsi="Microsoft YaHei" w:eastAsia="Microsoft YaHei"/>
+                <w:b w:val="0"/>
+                <w:color w:val="333333"/>
+                <w:sz w:val="16"/>
+              </w:rPr>
+              <w:t>-0.90</w:t>
+            </w:r>
+          </w:p>
+        </w:tc>
+        <w:tc>
+          <w:tcPr>
+            <w:tcW w:type="dxa" w:w="1441"/>
+            <w:shd w:fill="E6E6E6" w:val="clear"/>
+          </w:tcPr>
+          <w:p>
+            <w:pPr>
+              <w:spacing w:before="20" w:after="20"/>
+              <w:jc w:val="center"/>
+            </w:pPr>
+            <w:r>
+              <w:rPr>
+                <w:rFonts w:ascii="Microsoft YaHei" w:hAnsi="Microsoft YaHei" w:eastAsia="Microsoft YaHei"/>
+                <w:b w:val="0"/>
+                <w:color w:val="333333"/>
+                <w:sz w:val="16"/>
+              </w:rPr>
+              <w:t>-0.80</w:t>
+            </w:r>
+          </w:p>
+        </w:tc>
+        <w:tc>
+          <w:tcPr>
+            <w:tcW w:type="dxa" w:w="1441"/>
+            <w:shd w:fill="E6E6E6" w:val="clear"/>
+          </w:tcPr>
+          <w:p>
+            <w:pPr>
+              <w:spacing w:before="20" w:after="20"/>
+              <w:jc w:val="center"/>
+            </w:pPr>
+            <w:r>
+              <w:rPr>
+                <w:rFonts w:ascii="Microsoft YaHei" w:hAnsi="Microsoft YaHei" w:eastAsia="Microsoft YaHei"/>
+                <w:b w:val="0"/>
+                <w:color w:val="333333"/>
+                <w:sz w:val="16"/>
+              </w:rPr>
+              <w:t>平均回报、命中率</w:t>
+            </w:r>
+          </w:p>
+        </w:tc>
+      </w:tr>
+      <w:tr>
+        <w:tc>
+          <w:tcPr>
+            <w:tcW w:type="dxa" w:w="1441"/>
+            <w:shd w:fill="FFFFFF" w:val="clear"/>
+          </w:tcPr>
+          <w:p>
+            <w:pPr>
+              <w:spacing w:before="20" w:after="20"/>
+              <w:jc w:val="center"/>
+            </w:pPr>
+            <w:r>
+              <w:rPr>
+                <w:rFonts w:ascii="Microsoft YaHei" w:hAnsi="Microsoft YaHei" w:eastAsia="Microsoft YaHei"/>
+                <w:b w:val="0"/>
+                <w:color w:val="333333"/>
+                <w:sz w:val="16"/>
+              </w:rPr>
+              <w:t>UIPIX</w:t>
+            </w:r>
+          </w:p>
+        </w:tc>
+        <w:tc>
+          <w:tcPr>
+            <w:tcW w:type="dxa" w:w="1441"/>
+            <w:shd w:fill="FFFFFF" w:val="clear"/>
+          </w:tcPr>
+          <w:p>
+            <w:pPr>
+              <w:spacing w:before="20" w:after="20"/>
+              <w:jc w:val="center"/>
+            </w:pPr>
+            <w:r>
+              <w:rPr>
+                <w:rFonts w:ascii="Microsoft YaHei" w:hAnsi="Microsoft YaHei" w:eastAsia="Microsoft YaHei"/>
+                <w:b w:val="0"/>
+                <w:color w:val="333333"/>
+                <w:sz w:val="16"/>
+              </w:rPr>
+              <w:t>XLC&gt;=1% 且 美元/黄金&lt;0，买基金后2日平均回报</w:t>
+            </w:r>
+          </w:p>
+        </w:tc>
+        <w:tc>
+          <w:tcPr>
+            <w:tcW w:type="dxa" w:w="1441"/>
+            <w:shd w:fill="FFFFFF" w:val="clear"/>
+          </w:tcPr>
+          <w:p>
+            <w:pPr>
+              <w:spacing w:before="20" w:after="20"/>
+              <w:jc w:val="center"/>
+            </w:pPr>
+            <w:r>
+              <w:rPr>
+                <w:rFonts w:ascii="Microsoft YaHei" w:hAnsi="Microsoft YaHei" w:eastAsia="Microsoft YaHei"/>
+                <w:b w:val="0"/>
+                <w:color w:val="333333"/>
+                <w:sz w:val="16"/>
+              </w:rPr>
+              <w:t>XLC 阈值</w:t>
+            </w:r>
+          </w:p>
+        </w:tc>
+        <w:tc>
+          <w:tcPr>
+            <w:tcW w:type="dxa" w:w="1441"/>
+            <w:shd w:fill="FFFFFF" w:val="clear"/>
+          </w:tcPr>
+          <w:p>
+            <w:pPr>
+              <w:spacing w:before="20" w:after="20"/>
+              <w:jc w:val="center"/>
+            </w:pPr>
+            <w:r>
+              <w:rPr>
+                <w:rFonts w:ascii="Microsoft YaHei" w:hAnsi="Microsoft YaHei" w:eastAsia="Microsoft YaHei"/>
+                <w:b w:val="0"/>
+                <w:color w:val="333333"/>
+                <w:sz w:val="16"/>
+              </w:rPr>
+              <w:t>-0.52</w:t>
+            </w:r>
+          </w:p>
+        </w:tc>
+        <w:tc>
+          <w:tcPr>
+            <w:tcW w:type="dxa" w:w="1441"/>
+            <w:shd w:fill="FFFFFF" w:val="clear"/>
+          </w:tcPr>
+          <w:p>
+            <w:pPr>
+              <w:spacing w:before="20" w:after="20"/>
+              <w:jc w:val="center"/>
+            </w:pPr>
+            <w:r>
+              <w:rPr>
+                <w:rFonts w:ascii="Microsoft YaHei" w:hAnsi="Microsoft YaHei" w:eastAsia="Microsoft YaHei"/>
+                <w:b w:val="0"/>
+                <w:color w:val="333333"/>
+                <w:sz w:val="16"/>
+              </w:rPr>
+              <w:t>+1.00</w:t>
+            </w:r>
+          </w:p>
+        </w:tc>
+        <w:tc>
+          <w:tcPr>
+            <w:tcW w:type="dxa" w:w="1441"/>
+            <w:shd w:fill="FFFFFF" w:val="clear"/>
+          </w:tcPr>
+          <w:p>
+            <w:pPr>
+              <w:spacing w:before="20" w:after="20"/>
+              <w:jc w:val="center"/>
+            </w:pPr>
+            <w:r>
+              <w:rPr>
+                <w:rFonts w:ascii="Microsoft YaHei" w:hAnsi="Microsoft YaHei" w:eastAsia="Microsoft YaHei"/>
+                <w:b w:val="0"/>
+                <w:color w:val="333333"/>
+                <w:sz w:val="16"/>
+              </w:rPr>
+              <w:t>平均回报</w:t>
+            </w:r>
+          </w:p>
+        </w:tc>
+      </w:tr>
+      <w:tr>
+        <w:tc>
+          <w:tcPr>
+            <w:tcW w:type="dxa" w:w="1441"/>
+            <w:shd w:fill="E6E6E6" w:val="clear"/>
+          </w:tcPr>
+          <w:p>
+            <w:pPr>
+              <w:spacing w:before="20" w:after="20"/>
+              <w:jc w:val="center"/>
+            </w:pPr>
+            <w:r>
+              <w:rPr>
+                <w:rFonts w:ascii="Microsoft YaHei" w:hAnsi="Microsoft YaHei" w:eastAsia="Microsoft YaHei"/>
+                <w:b w:val="0"/>
+                <w:color w:val="333333"/>
+                <w:sz w:val="16"/>
+              </w:rPr>
+              <w:t>ULPIX</w:t>
+            </w:r>
+          </w:p>
+        </w:tc>
+        <w:tc>
+          <w:tcPr>
+            <w:tcW w:type="dxa" w:w="1441"/>
+            <w:shd w:fill="E6E6E6" w:val="clear"/>
+          </w:tcPr>
+          <w:p>
+            <w:pPr>
+              <w:spacing w:before="20" w:after="20"/>
+              <w:jc w:val="center"/>
+            </w:pPr>
+            <w:r>
+              <w:rPr>
+                <w:rFonts w:ascii="Microsoft YaHei" w:hAnsi="Microsoft YaHei" w:eastAsia="Microsoft YaHei"/>
+                <w:b w:val="0"/>
+                <w:color w:val="333333"/>
+                <w:sz w:val="16"/>
+              </w:rPr>
+              <w:t>QQQ&lt;=-1% 且 VIX5d&gt;0，买基金第二天</w:t>
+            </w:r>
+          </w:p>
+        </w:tc>
+        <w:tc>
+          <w:tcPr>
+            <w:tcW w:type="dxa" w:w="1441"/>
+            <w:shd w:fill="E6E6E6" w:val="clear"/>
+          </w:tcPr>
+          <w:p>
+            <w:pPr>
+              <w:spacing w:before="20" w:after="20"/>
+              <w:jc w:val="center"/>
+            </w:pPr>
+            <w:r>
+              <w:rPr>
+                <w:rFonts w:ascii="Microsoft YaHei" w:hAnsi="Microsoft YaHei" w:eastAsia="Microsoft YaHei"/>
+                <w:b w:val="0"/>
+                <w:color w:val="333333"/>
+                <w:sz w:val="16"/>
+              </w:rPr>
+              <w:t>QQQ 阈值</w:t>
+            </w:r>
+          </w:p>
+        </w:tc>
+        <w:tc>
+          <w:tcPr>
+            <w:tcW w:type="dxa" w:w="1441"/>
+            <w:shd w:fill="E6E6E6" w:val="clear"/>
+          </w:tcPr>
+          <w:p>
+            <w:pPr>
+              <w:spacing w:before="20" w:after="20"/>
+              <w:jc w:val="center"/>
+            </w:pPr>
+            <w:r>
+              <w:rPr>
+                <w:rFonts w:ascii="Microsoft YaHei" w:hAnsi="Microsoft YaHei" w:eastAsia="Microsoft YaHei"/>
+                <w:b w:val="0"/>
+                <w:color w:val="333333"/>
+                <w:sz w:val="16"/>
+              </w:rPr>
+              <w:t>-0.85</w:t>
+            </w:r>
+          </w:p>
+        </w:tc>
+        <w:tc>
+          <w:tcPr>
+            <w:tcW w:type="dxa" w:w="1441"/>
+            <w:shd w:fill="E6E6E6" w:val="clear"/>
+          </w:tcPr>
+          <w:p>
+            <w:pPr>
+              <w:spacing w:before="20" w:after="20"/>
+              <w:jc w:val="center"/>
+            </w:pPr>
+            <w:r>
+              <w:rPr>
+                <w:rFonts w:ascii="Microsoft YaHei" w:hAnsi="Microsoft YaHei" w:eastAsia="Microsoft YaHei"/>
+                <w:b w:val="0"/>
+                <w:color w:val="333333"/>
+                <w:sz w:val="16"/>
+              </w:rPr>
+              <w:t>-0.64</w:t>
+            </w:r>
+          </w:p>
+        </w:tc>
+        <w:tc>
+          <w:tcPr>
+            <w:tcW w:type="dxa" w:w="1441"/>
+            <w:shd w:fill="E6E6E6" w:val="clear"/>
+          </w:tcPr>
+          <w:p>
+            <w:pPr>
+              <w:spacing w:before="20" w:after="20"/>
+              <w:jc w:val="center"/>
+            </w:pPr>
+            <w:r>
+              <w:rPr>
+                <w:rFonts w:ascii="Microsoft YaHei" w:hAnsi="Microsoft YaHei" w:eastAsia="Microsoft YaHei"/>
+                <w:b w:val="0"/>
+                <w:color w:val="333333"/>
+                <w:sz w:val="16"/>
+              </w:rPr>
+              <w:t>平均回报、命中率</w:t>
+            </w:r>
+          </w:p>
+        </w:tc>
+      </w:tr>
+    </w:tbl>
+    <w:p>
+      <w:r>
+        <w:rPr>
+          <w:rFonts w:ascii="Microsoft YaHei" w:hAnsi="Microsoft YaHei" w:eastAsia="Microsoft YaHei"/>
+          <w:b w:val="0"/>
+          <w:color w:val="000000"/>
+          <w:sz w:val="20"/>
+        </w:rPr>
+        <w:t>逐策略展开如下（8 组 &lt; 10，故保留在文档内；多条件策略只调整被扫描条件，其余条件固定）：</w:t>
       </w:r>
     </w:p>
     <w:p>
@@ -14954,7 +16459,7 @@
           <w:color w:val="000000"/>
           <w:sz w:val="20"/>
         </w:rPr>
-        <w:t>CYPIX：XLK&lt;=-1% 且 该基金当日回报&lt;=-2%，买基金第二天（只调整 XLK 阈值，自身大跌固定 -2%）</w:t>
+        <w:t>BIPIX：SLV&gt;=1% 且 该基金当日回报&lt;0，买基金后2日平均回报（只调整 SLV 阈值，自身下跌固定）</w:t>
       </w:r>
     </w:p>
     <w:tbl>
@@ -15082,7 +16587,7 @@
                 <w:color w:val="333333"/>
                 <w:sz w:val="16"/>
               </w:rPr>
-              <w:t>-0.5%</w:t>
+              <w:t>+0.5%</w:t>
             </w:r>
           </w:p>
         </w:tc>
@@ -15103,7 +16608,7 @@
                 <w:color w:val="333333"/>
                 <w:sz w:val="16"/>
               </w:rPr>
-              <w:t>0.326%</w:t>
+              <w:t>0.188%</w:t>
             </w:r>
           </w:p>
         </w:tc>
@@ -15124,7 +16629,7 @@
                 <w:color w:val="333333"/>
                 <w:sz w:val="16"/>
               </w:rPr>
-              <w:t>54.0%</w:t>
+              <w:t>56.6%</w:t>
             </w:r>
           </w:p>
         </w:tc>
@@ -15145,7 +16650,7 @@
                 <w:color w:val="333333"/>
                 <w:sz w:val="16"/>
               </w:rPr>
-              <w:t>202</w:t>
+              <w:t>709</w:t>
             </w:r>
           </w:p>
         </w:tc>
@@ -15168,7 +16673,7 @@
                 <w:color w:val="333333"/>
                 <w:sz w:val="16"/>
               </w:rPr>
-              <w:t>-1%</w:t>
+              <w:t>+1%</w:t>
             </w:r>
           </w:p>
         </w:tc>
@@ -15189,7 +16694,7 @@
                 <w:color w:val="333333"/>
                 <w:sz w:val="16"/>
               </w:rPr>
-              <w:t>0.482%</w:t>
+              <w:t>0.235%</w:t>
             </w:r>
           </w:p>
         </w:tc>
@@ -15210,7 +16715,7 @@
                 <w:color w:val="333333"/>
                 <w:sz w:val="16"/>
               </w:rPr>
-              <w:t>56.7%</w:t>
+              <w:t>59.2%</w:t>
             </w:r>
           </w:p>
         </w:tc>
@@ -15231,7 +16736,7 @@
                 <w:color w:val="333333"/>
                 <w:sz w:val="16"/>
               </w:rPr>
-              <w:t>217</w:t>
+              <w:t>451</w:t>
             </w:r>
           </w:p>
         </w:tc>
@@ -15254,7 +16759,7 @@
                 <w:color w:val="333333"/>
                 <w:sz w:val="16"/>
               </w:rPr>
-              <w:t>-1.5%</w:t>
+              <w:t>+1.5%</w:t>
             </w:r>
           </w:p>
         </w:tc>
@@ -15275,7 +16780,7 @@
                 <w:color w:val="333333"/>
                 <w:sz w:val="16"/>
               </w:rPr>
-              <w:t>0.455%</w:t>
+              <w:t>0.308%</w:t>
             </w:r>
           </w:p>
         </w:tc>
@@ -15296,7 +16801,7 @@
                 <w:color w:val="333333"/>
                 <w:sz w:val="16"/>
               </w:rPr>
-              <w:t>60.0%</w:t>
+              <w:t>59.6%</w:t>
             </w:r>
           </w:p>
         </w:tc>
@@ -15317,7 +16822,7 @@
                 <w:color w:val="333333"/>
                 <w:sz w:val="16"/>
               </w:rPr>
-              <w:t>145</w:t>
+              <w:t>280</w:t>
             </w:r>
           </w:p>
         </w:tc>
@@ -15340,7 +16845,7 @@
                 <w:color w:val="333333"/>
                 <w:sz w:val="16"/>
               </w:rPr>
-              <w:t>-2%</w:t>
+              <w:t>+2%</w:t>
             </w:r>
           </w:p>
         </w:tc>
@@ -15361,7 +16866,7 @@
                 <w:color w:val="333333"/>
                 <w:sz w:val="16"/>
               </w:rPr>
-              <w:t>0.641%</w:t>
+              <w:t>0.266%</w:t>
             </w:r>
           </w:p>
         </w:tc>
@@ -15382,7 +16887,7 @@
                 <w:color w:val="333333"/>
                 <w:sz w:val="16"/>
               </w:rPr>
-              <w:t>61.9%</w:t>
+              <w:t>58.1%</w:t>
             </w:r>
           </w:p>
         </w:tc>
@@ -15403,7 +16908,7 @@
                 <w:color w:val="333333"/>
                 <w:sz w:val="16"/>
               </w:rPr>
-              <w:t>118</w:t>
+              <w:t>148</w:t>
             </w:r>
           </w:p>
         </w:tc>
@@ -15426,7 +16931,7 @@
                 <w:color w:val="333333"/>
                 <w:sz w:val="16"/>
               </w:rPr>
-              <w:t>-2.5%</w:t>
+              <w:t>+2.5%</w:t>
             </w:r>
           </w:p>
         </w:tc>
@@ -15447,7 +16952,7 @@
                 <w:color w:val="333333"/>
                 <w:sz w:val="16"/>
               </w:rPr>
-              <w:t>0.217%</w:t>
+              <w:t>0.354%</w:t>
             </w:r>
           </w:p>
         </w:tc>
@@ -15468,7 +16973,7 @@
                 <w:color w:val="333333"/>
                 <w:sz w:val="16"/>
               </w:rPr>
-              <w:t>55.4%</w:t>
+              <w:t>53.2%</w:t>
             </w:r>
           </w:p>
         </w:tc>
@@ -15489,7 +16994,7 @@
                 <w:color w:val="333333"/>
                 <w:sz w:val="16"/>
               </w:rPr>
-              <w:t>65</w:t>
+              <w:t>77</w:t>
             </w:r>
           </w:p>
         </w:tc>
@@ -15512,7 +17017,7 @@
                 <w:color w:val="333333"/>
                 <w:sz w:val="16"/>
               </w:rPr>
-              <w:t>-3%</w:t>
+              <w:t>+3%</w:t>
             </w:r>
           </w:p>
         </w:tc>
@@ -15533,7 +17038,7 @@
                 <w:color w:val="333333"/>
                 <w:sz w:val="16"/>
               </w:rPr>
-              <w:t>-0.388%</w:t>
+              <w:t>0.389%</w:t>
             </w:r>
           </w:p>
         </w:tc>
@@ -15554,7 +17059,7 @@
                 <w:color w:val="333333"/>
                 <w:sz w:val="16"/>
               </w:rPr>
-              <w:t>52.9%</w:t>
+              <w:t>52.0%</w:t>
             </w:r>
           </w:p>
         </w:tc>
@@ -15575,7 +17080,1277 @@
                 <w:color w:val="333333"/>
                 <w:sz w:val="16"/>
               </w:rPr>
+              <w:t>25</w:t>
+            </w:r>
+          </w:p>
+        </w:tc>
+      </w:tr>
+    </w:tbl>
+    <w:p>
+      <w:r>
+        <w:rPr>
+          <w:rFonts w:ascii="Microsoft YaHei" w:hAnsi="Microsoft YaHei" w:eastAsia="Microsoft YaHei"/>
+          <w:b w:val="0"/>
+          <w:color w:val="000000"/>
+          <w:sz w:val="20"/>
+        </w:rPr>
+        <w:t>CYPIX（调整 XLK）：XLK&lt;=-1% 且 该基金当日回报&lt;=-2%，买基金第二天</w:t>
+      </w:r>
+    </w:p>
+    <w:tbl>
+      <w:tblPr>
+        <w:tblW w:type="auto" w:w="0"/>
+        <w:jc w:val="center"/>
+        <w:tblLayout w:type="fixed"/>
+        <w:tblLook w:firstColumn="1" w:firstRow="1" w:lastColumn="0" w:lastRow="0" w:noHBand="0" w:noVBand="1" w:val="04A0"/>
+        <w:tblBorders>
+          <w:top w:val="single" w:sz="4" w:space="0" w:color="BBBBBB"/>
+          <w:left w:val="single" w:sz="4" w:space="0" w:color="BBBBBB"/>
+          <w:bottom w:val="single" w:sz="4" w:space="0" w:color="BBBBBB"/>
+          <w:right w:val="single" w:sz="4" w:space="0" w:color="BBBBBB"/>
+          <w:insideH w:val="single" w:sz="4" w:space="0" w:color="BBBBBB"/>
+          <w:insideV w:val="single" w:sz="4" w:space="0" w:color="BBBBBB"/>
+        </w:tblBorders>
+      </w:tblPr>
+      <w:tblGrid>
+        <w:gridCol w:w="2161"/>
+        <w:gridCol w:w="2161"/>
+        <w:gridCol w:w="2161"/>
+        <w:gridCol w:w="2161"/>
+      </w:tblGrid>
+      <w:tr>
+        <w:tc>
+          <w:tcPr>
+            <w:tcW w:type="dxa" w:w="1417"/>
+            <w:shd w:fill="FFFFFF" w:val="clear"/>
+          </w:tcPr>
+          <w:p>
+            <w:pPr>
+              <w:spacing w:before="60" w:after="60"/>
+              <w:jc w:val="center"/>
+            </w:pPr>
+            <w:r>
+              <w:rPr>
+                <w:rFonts w:ascii="SimHei" w:hAnsi="SimHei" w:eastAsia="SimHei"/>
+                <w:b/>
+                <w:color w:val="000000"/>
+                <w:sz w:val="18"/>
+              </w:rPr>
+              <w:t>阈值</w:t>
+            </w:r>
+          </w:p>
+        </w:tc>
+        <w:tc>
+          <w:tcPr>
+            <w:tcW w:type="dxa" w:w="1701"/>
+            <w:shd w:fill="FFFFFF" w:val="clear"/>
+          </w:tcPr>
+          <w:p>
+            <w:pPr>
+              <w:spacing w:before="60" w:after="60"/>
+              <w:jc w:val="center"/>
+            </w:pPr>
+            <w:r>
+              <w:rPr>
+                <w:rFonts w:ascii="SimHei" w:hAnsi="SimHei" w:eastAsia="SimHei"/>
+                <w:b/>
+                <w:color w:val="000000"/>
+                <w:sz w:val="18"/>
+              </w:rPr>
+              <w:t>平均回报</w:t>
+            </w:r>
+          </w:p>
+        </w:tc>
+        <w:tc>
+          <w:tcPr>
+            <w:tcW w:type="dxa" w:w="1701"/>
+            <w:shd w:fill="FFFFFF" w:val="clear"/>
+          </w:tcPr>
+          <w:p>
+            <w:pPr>
+              <w:spacing w:before="60" w:after="60"/>
+              <w:jc w:val="center"/>
+            </w:pPr>
+            <w:r>
+              <w:rPr>
+                <w:rFonts w:ascii="SimHei" w:hAnsi="SimHei" w:eastAsia="SimHei"/>
+                <w:b/>
+                <w:color w:val="000000"/>
+                <w:sz w:val="18"/>
+              </w:rPr>
+              <w:t>命中率</w:t>
+            </w:r>
+          </w:p>
+        </w:tc>
+        <w:tc>
+          <w:tcPr>
+            <w:tcW w:type="dxa" w:w="1701"/>
+            <w:shd w:fill="FFFFFF" w:val="clear"/>
+          </w:tcPr>
+          <w:p>
+            <w:pPr>
+              <w:spacing w:before="60" w:after="60"/>
+              <w:jc w:val="center"/>
+            </w:pPr>
+            <w:r>
+              <w:rPr>
+                <w:rFonts w:ascii="SimHei" w:hAnsi="SimHei" w:eastAsia="SimHei"/>
+                <w:b/>
+                <w:color w:val="000000"/>
+                <w:sz w:val="18"/>
+              </w:rPr>
+              <w:t>交易数</w:t>
+            </w:r>
+          </w:p>
+        </w:tc>
+      </w:tr>
+      <w:tr>
+        <w:tc>
+          <w:tcPr>
+            <w:tcW w:type="dxa" w:w="2161"/>
+            <w:shd w:fill="FFFFFF" w:val="clear"/>
+          </w:tcPr>
+          <w:p>
+            <w:pPr>
+              <w:spacing w:before="20" w:after="20"/>
+              <w:jc w:val="center"/>
+            </w:pPr>
+            <w:r>
+              <w:rPr>
+                <w:rFonts w:ascii="Microsoft YaHei" w:hAnsi="Microsoft YaHei" w:eastAsia="Microsoft YaHei"/>
+                <w:b w:val="0"/>
+                <w:color w:val="333333"/>
+                <w:sz w:val="16"/>
+              </w:rPr>
+              <w:t>-0.5%</w:t>
+            </w:r>
+          </w:p>
+        </w:tc>
+        <w:tc>
+          <w:tcPr>
+            <w:tcW w:type="dxa" w:w="2161"/>
+            <w:shd w:fill="FFFFFF" w:val="clear"/>
+          </w:tcPr>
+          <w:p>
+            <w:pPr>
+              <w:spacing w:before="20" w:after="20"/>
+              <w:jc w:val="center"/>
+            </w:pPr>
+            <w:r>
+              <w:rPr>
+                <w:rFonts w:ascii="Microsoft YaHei" w:hAnsi="Microsoft YaHei" w:eastAsia="Microsoft YaHei"/>
+                <w:b w:val="0"/>
+                <w:color w:val="333333"/>
+                <w:sz w:val="16"/>
+              </w:rPr>
+              <w:t>0.326%</w:t>
+            </w:r>
+          </w:p>
+        </w:tc>
+        <w:tc>
+          <w:tcPr>
+            <w:tcW w:type="dxa" w:w="2161"/>
+            <w:shd w:fill="FFFFFF" w:val="clear"/>
+          </w:tcPr>
+          <w:p>
+            <w:pPr>
+              <w:spacing w:before="20" w:after="20"/>
+              <w:jc w:val="center"/>
+            </w:pPr>
+            <w:r>
+              <w:rPr>
+                <w:rFonts w:ascii="Microsoft YaHei" w:hAnsi="Microsoft YaHei" w:eastAsia="Microsoft YaHei"/>
+                <w:b w:val="0"/>
+                <w:color w:val="333333"/>
+                <w:sz w:val="16"/>
+              </w:rPr>
+              <w:t>54.0%</w:t>
+            </w:r>
+          </w:p>
+        </w:tc>
+        <w:tc>
+          <w:tcPr>
+            <w:tcW w:type="dxa" w:w="2161"/>
+            <w:shd w:fill="FFFFFF" w:val="clear"/>
+          </w:tcPr>
+          <w:p>
+            <w:pPr>
+              <w:spacing w:before="20" w:after="20"/>
+              <w:jc w:val="center"/>
+            </w:pPr>
+            <w:r>
+              <w:rPr>
+                <w:rFonts w:ascii="Microsoft YaHei" w:hAnsi="Microsoft YaHei" w:eastAsia="Microsoft YaHei"/>
+                <w:b w:val="0"/>
+                <w:color w:val="333333"/>
+                <w:sz w:val="16"/>
+              </w:rPr>
+              <w:t>202</w:t>
+            </w:r>
+          </w:p>
+        </w:tc>
+      </w:tr>
+      <w:tr>
+        <w:tc>
+          <w:tcPr>
+            <w:tcW w:type="dxa" w:w="2161"/>
+            <w:shd w:fill="E6E6E6" w:val="clear"/>
+          </w:tcPr>
+          <w:p>
+            <w:pPr>
+              <w:spacing w:before="20" w:after="20"/>
+              <w:jc w:val="center"/>
+            </w:pPr>
+            <w:r>
+              <w:rPr>
+                <w:rFonts w:ascii="Microsoft YaHei" w:hAnsi="Microsoft YaHei" w:eastAsia="Microsoft YaHei"/>
+                <w:b w:val="0"/>
+                <w:color w:val="333333"/>
+                <w:sz w:val="16"/>
+              </w:rPr>
+              <w:t>-1%</w:t>
+            </w:r>
+          </w:p>
+        </w:tc>
+        <w:tc>
+          <w:tcPr>
+            <w:tcW w:type="dxa" w:w="2161"/>
+            <w:shd w:fill="E6E6E6" w:val="clear"/>
+          </w:tcPr>
+          <w:p>
+            <w:pPr>
+              <w:spacing w:before="20" w:after="20"/>
+              <w:jc w:val="center"/>
+            </w:pPr>
+            <w:r>
+              <w:rPr>
+                <w:rFonts w:ascii="Microsoft YaHei" w:hAnsi="Microsoft YaHei" w:eastAsia="Microsoft YaHei"/>
+                <w:b w:val="0"/>
+                <w:color w:val="333333"/>
+                <w:sz w:val="16"/>
+              </w:rPr>
+              <w:t>0.482%</w:t>
+            </w:r>
+          </w:p>
+        </w:tc>
+        <w:tc>
+          <w:tcPr>
+            <w:tcW w:type="dxa" w:w="2161"/>
+            <w:shd w:fill="E6E6E6" w:val="clear"/>
+          </w:tcPr>
+          <w:p>
+            <w:pPr>
+              <w:spacing w:before="20" w:after="20"/>
+              <w:jc w:val="center"/>
+            </w:pPr>
+            <w:r>
+              <w:rPr>
+                <w:rFonts w:ascii="Microsoft YaHei" w:hAnsi="Microsoft YaHei" w:eastAsia="Microsoft YaHei"/>
+                <w:b w:val="0"/>
+                <w:color w:val="333333"/>
+                <w:sz w:val="16"/>
+              </w:rPr>
+              <w:t>56.7%</w:t>
+            </w:r>
+          </w:p>
+        </w:tc>
+        <w:tc>
+          <w:tcPr>
+            <w:tcW w:type="dxa" w:w="2161"/>
+            <w:shd w:fill="E6E6E6" w:val="clear"/>
+          </w:tcPr>
+          <w:p>
+            <w:pPr>
+              <w:spacing w:before="20" w:after="20"/>
+              <w:jc w:val="center"/>
+            </w:pPr>
+            <w:r>
+              <w:rPr>
+                <w:rFonts w:ascii="Microsoft YaHei" w:hAnsi="Microsoft YaHei" w:eastAsia="Microsoft YaHei"/>
+                <w:b w:val="0"/>
+                <w:color w:val="333333"/>
+                <w:sz w:val="16"/>
+              </w:rPr>
+              <w:t>217</w:t>
+            </w:r>
+          </w:p>
+        </w:tc>
+      </w:tr>
+      <w:tr>
+        <w:tc>
+          <w:tcPr>
+            <w:tcW w:type="dxa" w:w="2161"/>
+            <w:shd w:fill="FFFFFF" w:val="clear"/>
+          </w:tcPr>
+          <w:p>
+            <w:pPr>
+              <w:spacing w:before="20" w:after="20"/>
+              <w:jc w:val="center"/>
+            </w:pPr>
+            <w:r>
+              <w:rPr>
+                <w:rFonts w:ascii="Microsoft YaHei" w:hAnsi="Microsoft YaHei" w:eastAsia="Microsoft YaHei"/>
+                <w:b w:val="0"/>
+                <w:color w:val="333333"/>
+                <w:sz w:val="16"/>
+              </w:rPr>
+              <w:t>-1.5%</w:t>
+            </w:r>
+          </w:p>
+        </w:tc>
+        <w:tc>
+          <w:tcPr>
+            <w:tcW w:type="dxa" w:w="2161"/>
+            <w:shd w:fill="FFFFFF" w:val="clear"/>
+          </w:tcPr>
+          <w:p>
+            <w:pPr>
+              <w:spacing w:before="20" w:after="20"/>
+              <w:jc w:val="center"/>
+            </w:pPr>
+            <w:r>
+              <w:rPr>
+                <w:rFonts w:ascii="Microsoft YaHei" w:hAnsi="Microsoft YaHei" w:eastAsia="Microsoft YaHei"/>
+                <w:b w:val="0"/>
+                <w:color w:val="333333"/>
+                <w:sz w:val="16"/>
+              </w:rPr>
+              <w:t>0.455%</w:t>
+            </w:r>
+          </w:p>
+        </w:tc>
+        <w:tc>
+          <w:tcPr>
+            <w:tcW w:type="dxa" w:w="2161"/>
+            <w:shd w:fill="FFFFFF" w:val="clear"/>
+          </w:tcPr>
+          <w:p>
+            <w:pPr>
+              <w:spacing w:before="20" w:after="20"/>
+              <w:jc w:val="center"/>
+            </w:pPr>
+            <w:r>
+              <w:rPr>
+                <w:rFonts w:ascii="Microsoft YaHei" w:hAnsi="Microsoft YaHei" w:eastAsia="Microsoft YaHei"/>
+                <w:b w:val="0"/>
+                <w:color w:val="333333"/>
+                <w:sz w:val="16"/>
+              </w:rPr>
+              <w:t>60.0%</w:t>
+            </w:r>
+          </w:p>
+        </w:tc>
+        <w:tc>
+          <w:tcPr>
+            <w:tcW w:type="dxa" w:w="2161"/>
+            <w:shd w:fill="FFFFFF" w:val="clear"/>
+          </w:tcPr>
+          <w:p>
+            <w:pPr>
+              <w:spacing w:before="20" w:after="20"/>
+              <w:jc w:val="center"/>
+            </w:pPr>
+            <w:r>
+              <w:rPr>
+                <w:rFonts w:ascii="Microsoft YaHei" w:hAnsi="Microsoft YaHei" w:eastAsia="Microsoft YaHei"/>
+                <w:b w:val="0"/>
+                <w:color w:val="333333"/>
+                <w:sz w:val="16"/>
+              </w:rPr>
+              <w:t>145</w:t>
+            </w:r>
+          </w:p>
+        </w:tc>
+      </w:tr>
+      <w:tr>
+        <w:tc>
+          <w:tcPr>
+            <w:tcW w:type="dxa" w:w="2161"/>
+            <w:shd w:fill="E6E6E6" w:val="clear"/>
+          </w:tcPr>
+          <w:p>
+            <w:pPr>
+              <w:spacing w:before="20" w:after="20"/>
+              <w:jc w:val="center"/>
+            </w:pPr>
+            <w:r>
+              <w:rPr>
+                <w:rFonts w:ascii="Microsoft YaHei" w:hAnsi="Microsoft YaHei" w:eastAsia="Microsoft YaHei"/>
+                <w:b w:val="0"/>
+                <w:color w:val="333333"/>
+                <w:sz w:val="16"/>
+              </w:rPr>
+              <w:t>-2%</w:t>
+            </w:r>
+          </w:p>
+        </w:tc>
+        <w:tc>
+          <w:tcPr>
+            <w:tcW w:type="dxa" w:w="2161"/>
+            <w:shd w:fill="E6E6E6" w:val="clear"/>
+          </w:tcPr>
+          <w:p>
+            <w:pPr>
+              <w:spacing w:before="20" w:after="20"/>
+              <w:jc w:val="center"/>
+            </w:pPr>
+            <w:r>
+              <w:rPr>
+                <w:rFonts w:ascii="Microsoft YaHei" w:hAnsi="Microsoft YaHei" w:eastAsia="Microsoft YaHei"/>
+                <w:b w:val="0"/>
+                <w:color w:val="333333"/>
+                <w:sz w:val="16"/>
+              </w:rPr>
+              <w:t>0.641%</w:t>
+            </w:r>
+          </w:p>
+        </w:tc>
+        <w:tc>
+          <w:tcPr>
+            <w:tcW w:type="dxa" w:w="2161"/>
+            <w:shd w:fill="E6E6E6" w:val="clear"/>
+          </w:tcPr>
+          <w:p>
+            <w:pPr>
+              <w:spacing w:before="20" w:after="20"/>
+              <w:jc w:val="center"/>
+            </w:pPr>
+            <w:r>
+              <w:rPr>
+                <w:rFonts w:ascii="Microsoft YaHei" w:hAnsi="Microsoft YaHei" w:eastAsia="Microsoft YaHei"/>
+                <w:b w:val="0"/>
+                <w:color w:val="333333"/>
+                <w:sz w:val="16"/>
+              </w:rPr>
+              <w:t>61.9%</w:t>
+            </w:r>
+          </w:p>
+        </w:tc>
+        <w:tc>
+          <w:tcPr>
+            <w:tcW w:type="dxa" w:w="2161"/>
+            <w:shd w:fill="E6E6E6" w:val="clear"/>
+          </w:tcPr>
+          <w:p>
+            <w:pPr>
+              <w:spacing w:before="20" w:after="20"/>
+              <w:jc w:val="center"/>
+            </w:pPr>
+            <w:r>
+              <w:rPr>
+                <w:rFonts w:ascii="Microsoft YaHei" w:hAnsi="Microsoft YaHei" w:eastAsia="Microsoft YaHei"/>
+                <w:b w:val="0"/>
+                <w:color w:val="333333"/>
+                <w:sz w:val="16"/>
+              </w:rPr>
+              <w:t>118</w:t>
+            </w:r>
+          </w:p>
+        </w:tc>
+      </w:tr>
+      <w:tr>
+        <w:tc>
+          <w:tcPr>
+            <w:tcW w:type="dxa" w:w="2161"/>
+            <w:shd w:fill="FFFFFF" w:val="clear"/>
+          </w:tcPr>
+          <w:p>
+            <w:pPr>
+              <w:spacing w:before="20" w:after="20"/>
+              <w:jc w:val="center"/>
+            </w:pPr>
+            <w:r>
+              <w:rPr>
+                <w:rFonts w:ascii="Microsoft YaHei" w:hAnsi="Microsoft YaHei" w:eastAsia="Microsoft YaHei"/>
+                <w:b w:val="0"/>
+                <w:color w:val="333333"/>
+                <w:sz w:val="16"/>
+              </w:rPr>
+              <w:t>-2.5%</w:t>
+            </w:r>
+          </w:p>
+        </w:tc>
+        <w:tc>
+          <w:tcPr>
+            <w:tcW w:type="dxa" w:w="2161"/>
+            <w:shd w:fill="FFFFFF" w:val="clear"/>
+          </w:tcPr>
+          <w:p>
+            <w:pPr>
+              <w:spacing w:before="20" w:after="20"/>
+              <w:jc w:val="center"/>
+            </w:pPr>
+            <w:r>
+              <w:rPr>
+                <w:rFonts w:ascii="Microsoft YaHei" w:hAnsi="Microsoft YaHei" w:eastAsia="Microsoft YaHei"/>
+                <w:b w:val="0"/>
+                <w:color w:val="333333"/>
+                <w:sz w:val="16"/>
+              </w:rPr>
+              <w:t>0.217%</w:t>
+            </w:r>
+          </w:p>
+        </w:tc>
+        <w:tc>
+          <w:tcPr>
+            <w:tcW w:type="dxa" w:w="2161"/>
+            <w:shd w:fill="FFFFFF" w:val="clear"/>
+          </w:tcPr>
+          <w:p>
+            <w:pPr>
+              <w:spacing w:before="20" w:after="20"/>
+              <w:jc w:val="center"/>
+            </w:pPr>
+            <w:r>
+              <w:rPr>
+                <w:rFonts w:ascii="Microsoft YaHei" w:hAnsi="Microsoft YaHei" w:eastAsia="Microsoft YaHei"/>
+                <w:b w:val="0"/>
+                <w:color w:val="333333"/>
+                <w:sz w:val="16"/>
+              </w:rPr>
+              <w:t>55.4%</w:t>
+            </w:r>
+          </w:p>
+        </w:tc>
+        <w:tc>
+          <w:tcPr>
+            <w:tcW w:type="dxa" w:w="2161"/>
+            <w:shd w:fill="FFFFFF" w:val="clear"/>
+          </w:tcPr>
+          <w:p>
+            <w:pPr>
+              <w:spacing w:before="20" w:after="20"/>
+              <w:jc w:val="center"/>
+            </w:pPr>
+            <w:r>
+              <w:rPr>
+                <w:rFonts w:ascii="Microsoft YaHei" w:hAnsi="Microsoft YaHei" w:eastAsia="Microsoft YaHei"/>
+                <w:b w:val="0"/>
+                <w:color w:val="333333"/>
+                <w:sz w:val="16"/>
+              </w:rPr>
+              <w:t>65</w:t>
+            </w:r>
+          </w:p>
+        </w:tc>
+      </w:tr>
+      <w:tr>
+        <w:tc>
+          <w:tcPr>
+            <w:tcW w:type="dxa" w:w="2161"/>
+            <w:shd w:fill="E6E6E6" w:val="clear"/>
+          </w:tcPr>
+          <w:p>
+            <w:pPr>
+              <w:spacing w:before="20" w:after="20"/>
+              <w:jc w:val="center"/>
+            </w:pPr>
+            <w:r>
+              <w:rPr>
+                <w:rFonts w:ascii="Microsoft YaHei" w:hAnsi="Microsoft YaHei" w:eastAsia="Microsoft YaHei"/>
+                <w:b w:val="0"/>
+                <w:color w:val="333333"/>
+                <w:sz w:val="16"/>
+              </w:rPr>
+              <w:t>-3%</w:t>
+            </w:r>
+          </w:p>
+        </w:tc>
+        <w:tc>
+          <w:tcPr>
+            <w:tcW w:type="dxa" w:w="2161"/>
+            <w:shd w:fill="E6E6E6" w:val="clear"/>
+          </w:tcPr>
+          <w:p>
+            <w:pPr>
+              <w:spacing w:before="20" w:after="20"/>
+              <w:jc w:val="center"/>
+            </w:pPr>
+            <w:r>
+              <w:rPr>
+                <w:rFonts w:ascii="Microsoft YaHei" w:hAnsi="Microsoft YaHei" w:eastAsia="Microsoft YaHei"/>
+                <w:b w:val="0"/>
+                <w:color w:val="333333"/>
+                <w:sz w:val="16"/>
+              </w:rPr>
+              <w:t>-0.388%</w:t>
+            </w:r>
+          </w:p>
+        </w:tc>
+        <w:tc>
+          <w:tcPr>
+            <w:tcW w:type="dxa" w:w="2161"/>
+            <w:shd w:fill="E6E6E6" w:val="clear"/>
+          </w:tcPr>
+          <w:p>
+            <w:pPr>
+              <w:spacing w:before="20" w:after="20"/>
+              <w:jc w:val="center"/>
+            </w:pPr>
+            <w:r>
+              <w:rPr>
+                <w:rFonts w:ascii="Microsoft YaHei" w:hAnsi="Microsoft YaHei" w:eastAsia="Microsoft YaHei"/>
+                <w:b w:val="0"/>
+                <w:color w:val="333333"/>
+                <w:sz w:val="16"/>
+              </w:rPr>
+              <w:t>52.9%</w:t>
+            </w:r>
+          </w:p>
+        </w:tc>
+        <w:tc>
+          <w:tcPr>
+            <w:tcW w:type="dxa" w:w="2161"/>
+            <w:shd w:fill="E6E6E6" w:val="clear"/>
+          </w:tcPr>
+          <w:p>
+            <w:pPr>
+              <w:spacing w:before="20" w:after="20"/>
+              <w:jc w:val="center"/>
+            </w:pPr>
+            <w:r>
+              <w:rPr>
+                <w:rFonts w:ascii="Microsoft YaHei" w:hAnsi="Microsoft YaHei" w:eastAsia="Microsoft YaHei"/>
+                <w:b w:val="0"/>
+                <w:color w:val="333333"/>
+                <w:sz w:val="16"/>
+              </w:rPr>
               <w:t>17</w:t>
+            </w:r>
+          </w:p>
+        </w:tc>
+      </w:tr>
+    </w:tbl>
+    <w:p>
+      <w:r>
+        <w:rPr>
+          <w:rFonts w:ascii="Microsoft YaHei" w:hAnsi="Microsoft YaHei" w:eastAsia="Microsoft YaHei"/>
+          <w:b w:val="0"/>
+          <w:color w:val="000000"/>
+          <w:sz w:val="20"/>
+        </w:rPr>
+        <w:t>CYPIX（调整自身大跌）：XLK&lt;=-1% 且 该基金当日回报&lt;=-2%，买基金第二天</w:t>
+      </w:r>
+    </w:p>
+    <w:tbl>
+      <w:tblPr>
+        <w:tblW w:type="auto" w:w="0"/>
+        <w:jc w:val="center"/>
+        <w:tblLayout w:type="fixed"/>
+        <w:tblLook w:firstColumn="1" w:firstRow="1" w:lastColumn="0" w:lastRow="0" w:noHBand="0" w:noVBand="1" w:val="04A0"/>
+        <w:tblBorders>
+          <w:top w:val="single" w:sz="4" w:space="0" w:color="BBBBBB"/>
+          <w:left w:val="single" w:sz="4" w:space="0" w:color="BBBBBB"/>
+          <w:bottom w:val="single" w:sz="4" w:space="0" w:color="BBBBBB"/>
+          <w:right w:val="single" w:sz="4" w:space="0" w:color="BBBBBB"/>
+          <w:insideH w:val="single" w:sz="4" w:space="0" w:color="BBBBBB"/>
+          <w:insideV w:val="single" w:sz="4" w:space="0" w:color="BBBBBB"/>
+        </w:tblBorders>
+      </w:tblPr>
+      <w:tblGrid>
+        <w:gridCol w:w="2161"/>
+        <w:gridCol w:w="2161"/>
+        <w:gridCol w:w="2161"/>
+        <w:gridCol w:w="2161"/>
+      </w:tblGrid>
+      <w:tr>
+        <w:tc>
+          <w:tcPr>
+            <w:tcW w:type="dxa" w:w="1417"/>
+            <w:shd w:fill="FFFFFF" w:val="clear"/>
+          </w:tcPr>
+          <w:p>
+            <w:pPr>
+              <w:spacing w:before="60" w:after="60"/>
+              <w:jc w:val="center"/>
+            </w:pPr>
+            <w:r>
+              <w:rPr>
+                <w:rFonts w:ascii="SimHei" w:hAnsi="SimHei" w:eastAsia="SimHei"/>
+                <w:b/>
+                <w:color w:val="000000"/>
+                <w:sz w:val="18"/>
+              </w:rPr>
+              <w:t>阈值</w:t>
+            </w:r>
+          </w:p>
+        </w:tc>
+        <w:tc>
+          <w:tcPr>
+            <w:tcW w:type="dxa" w:w="1701"/>
+            <w:shd w:fill="FFFFFF" w:val="clear"/>
+          </w:tcPr>
+          <w:p>
+            <w:pPr>
+              <w:spacing w:before="60" w:after="60"/>
+              <w:jc w:val="center"/>
+            </w:pPr>
+            <w:r>
+              <w:rPr>
+                <w:rFonts w:ascii="SimHei" w:hAnsi="SimHei" w:eastAsia="SimHei"/>
+                <w:b/>
+                <w:color w:val="000000"/>
+                <w:sz w:val="18"/>
+              </w:rPr>
+              <w:t>平均回报</w:t>
+            </w:r>
+          </w:p>
+        </w:tc>
+        <w:tc>
+          <w:tcPr>
+            <w:tcW w:type="dxa" w:w="1701"/>
+            <w:shd w:fill="FFFFFF" w:val="clear"/>
+          </w:tcPr>
+          <w:p>
+            <w:pPr>
+              <w:spacing w:before="60" w:after="60"/>
+              <w:jc w:val="center"/>
+            </w:pPr>
+            <w:r>
+              <w:rPr>
+                <w:rFonts w:ascii="SimHei" w:hAnsi="SimHei" w:eastAsia="SimHei"/>
+                <w:b/>
+                <w:color w:val="000000"/>
+                <w:sz w:val="18"/>
+              </w:rPr>
+              <w:t>命中率</w:t>
+            </w:r>
+          </w:p>
+        </w:tc>
+        <w:tc>
+          <w:tcPr>
+            <w:tcW w:type="dxa" w:w="1701"/>
+            <w:shd w:fill="FFFFFF" w:val="clear"/>
+          </w:tcPr>
+          <w:p>
+            <w:pPr>
+              <w:spacing w:before="60" w:after="60"/>
+              <w:jc w:val="center"/>
+            </w:pPr>
+            <w:r>
+              <w:rPr>
+                <w:rFonts w:ascii="SimHei" w:hAnsi="SimHei" w:eastAsia="SimHei"/>
+                <w:b/>
+                <w:color w:val="000000"/>
+                <w:sz w:val="18"/>
+              </w:rPr>
+              <w:t>交易数</w:t>
+            </w:r>
+          </w:p>
+        </w:tc>
+      </w:tr>
+      <w:tr>
+        <w:tc>
+          <w:tcPr>
+            <w:tcW w:type="dxa" w:w="2161"/>
+            <w:shd w:fill="FFFFFF" w:val="clear"/>
+          </w:tcPr>
+          <w:p>
+            <w:pPr>
+              <w:spacing w:before="20" w:after="20"/>
+              <w:jc w:val="center"/>
+            </w:pPr>
+            <w:r>
+              <w:rPr>
+                <w:rFonts w:ascii="Microsoft YaHei" w:hAnsi="Microsoft YaHei" w:eastAsia="Microsoft YaHei"/>
+                <w:b w:val="0"/>
+                <w:color w:val="333333"/>
+                <w:sz w:val="16"/>
+              </w:rPr>
+              <w:t>-0.5%</w:t>
+            </w:r>
+          </w:p>
+        </w:tc>
+        <w:tc>
+          <w:tcPr>
+            <w:tcW w:type="dxa" w:w="2161"/>
+            <w:shd w:fill="FFFFFF" w:val="clear"/>
+          </w:tcPr>
+          <w:p>
+            <w:pPr>
+              <w:spacing w:before="20" w:after="20"/>
+              <w:jc w:val="center"/>
+            </w:pPr>
+            <w:r>
+              <w:rPr>
+                <w:rFonts w:ascii="Microsoft YaHei" w:hAnsi="Microsoft YaHei" w:eastAsia="Microsoft YaHei"/>
+                <w:b w:val="0"/>
+                <w:color w:val="333333"/>
+                <w:sz w:val="16"/>
+              </w:rPr>
+              <w:t>0.197%</w:t>
+            </w:r>
+          </w:p>
+        </w:tc>
+        <w:tc>
+          <w:tcPr>
+            <w:tcW w:type="dxa" w:w="2161"/>
+            <w:shd w:fill="FFFFFF" w:val="clear"/>
+          </w:tcPr>
+          <w:p>
+            <w:pPr>
+              <w:spacing w:before="20" w:after="20"/>
+              <w:jc w:val="center"/>
+            </w:pPr>
+            <w:r>
+              <w:rPr>
+                <w:rFonts w:ascii="Microsoft YaHei" w:hAnsi="Microsoft YaHei" w:eastAsia="Microsoft YaHei"/>
+                <w:b w:val="0"/>
+                <w:color w:val="333333"/>
+                <w:sz w:val="16"/>
+              </w:rPr>
+              <w:t>55.3%</w:t>
+            </w:r>
+          </w:p>
+        </w:tc>
+        <w:tc>
+          <w:tcPr>
+            <w:tcW w:type="dxa" w:w="2161"/>
+            <w:shd w:fill="FFFFFF" w:val="clear"/>
+          </w:tcPr>
+          <w:p>
+            <w:pPr>
+              <w:spacing w:before="20" w:after="20"/>
+              <w:jc w:val="center"/>
+            </w:pPr>
+            <w:r>
+              <w:rPr>
+                <w:rFonts w:ascii="Microsoft YaHei" w:hAnsi="Microsoft YaHei" w:eastAsia="Microsoft YaHei"/>
+                <w:b w:val="0"/>
+                <w:color w:val="333333"/>
+                <w:sz w:val="16"/>
+              </w:rPr>
+              <w:t>293</w:t>
+            </w:r>
+          </w:p>
+        </w:tc>
+      </w:tr>
+      <w:tr>
+        <w:tc>
+          <w:tcPr>
+            <w:tcW w:type="dxa" w:w="2161"/>
+            <w:shd w:fill="E6E6E6" w:val="clear"/>
+          </w:tcPr>
+          <w:p>
+            <w:pPr>
+              <w:spacing w:before="20" w:after="20"/>
+              <w:jc w:val="center"/>
+            </w:pPr>
+            <w:r>
+              <w:rPr>
+                <w:rFonts w:ascii="Microsoft YaHei" w:hAnsi="Microsoft YaHei" w:eastAsia="Microsoft YaHei"/>
+                <w:b w:val="0"/>
+                <w:color w:val="333333"/>
+                <w:sz w:val="16"/>
+              </w:rPr>
+              <w:t>-1%</w:t>
+            </w:r>
+          </w:p>
+        </w:tc>
+        <w:tc>
+          <w:tcPr>
+            <w:tcW w:type="dxa" w:w="2161"/>
+            <w:shd w:fill="E6E6E6" w:val="clear"/>
+          </w:tcPr>
+          <w:p>
+            <w:pPr>
+              <w:spacing w:before="20" w:after="20"/>
+              <w:jc w:val="center"/>
+            </w:pPr>
+            <w:r>
+              <w:rPr>
+                <w:rFonts w:ascii="Microsoft YaHei" w:hAnsi="Microsoft YaHei" w:eastAsia="Microsoft YaHei"/>
+                <w:b w:val="0"/>
+                <w:color w:val="333333"/>
+                <w:sz w:val="16"/>
+              </w:rPr>
+              <w:t>0.308%</w:t>
+            </w:r>
+          </w:p>
+        </w:tc>
+        <w:tc>
+          <w:tcPr>
+            <w:tcW w:type="dxa" w:w="2161"/>
+            <w:shd w:fill="E6E6E6" w:val="clear"/>
+          </w:tcPr>
+          <w:p>
+            <w:pPr>
+              <w:spacing w:before="20" w:after="20"/>
+              <w:jc w:val="center"/>
+            </w:pPr>
+            <w:r>
+              <w:rPr>
+                <w:rFonts w:ascii="Microsoft YaHei" w:hAnsi="Microsoft YaHei" w:eastAsia="Microsoft YaHei"/>
+                <w:b w:val="0"/>
+                <w:color w:val="333333"/>
+                <w:sz w:val="16"/>
+              </w:rPr>
+              <w:t>57.6%</w:t>
+            </w:r>
+          </w:p>
+        </w:tc>
+        <w:tc>
+          <w:tcPr>
+            <w:tcW w:type="dxa" w:w="2161"/>
+            <w:shd w:fill="E6E6E6" w:val="clear"/>
+          </w:tcPr>
+          <w:p>
+            <w:pPr>
+              <w:spacing w:before="20" w:after="20"/>
+              <w:jc w:val="center"/>
+            </w:pPr>
+            <w:r>
+              <w:rPr>
+                <w:rFonts w:ascii="Microsoft YaHei" w:hAnsi="Microsoft YaHei" w:eastAsia="Microsoft YaHei"/>
+                <w:b w:val="0"/>
+                <w:color w:val="333333"/>
+                <w:sz w:val="16"/>
+              </w:rPr>
+              <w:t>288</w:t>
+            </w:r>
+          </w:p>
+        </w:tc>
+      </w:tr>
+      <w:tr>
+        <w:tc>
+          <w:tcPr>
+            <w:tcW w:type="dxa" w:w="2161"/>
+            <w:shd w:fill="FFFFFF" w:val="clear"/>
+          </w:tcPr>
+          <w:p>
+            <w:pPr>
+              <w:spacing w:before="20" w:after="20"/>
+              <w:jc w:val="center"/>
+            </w:pPr>
+            <w:r>
+              <w:rPr>
+                <w:rFonts w:ascii="Microsoft YaHei" w:hAnsi="Microsoft YaHei" w:eastAsia="Microsoft YaHei"/>
+                <w:b w:val="0"/>
+                <w:color w:val="333333"/>
+                <w:sz w:val="16"/>
+              </w:rPr>
+              <w:t>-1.5%</w:t>
+            </w:r>
+          </w:p>
+        </w:tc>
+        <w:tc>
+          <w:tcPr>
+            <w:tcW w:type="dxa" w:w="2161"/>
+            <w:shd w:fill="FFFFFF" w:val="clear"/>
+          </w:tcPr>
+          <w:p>
+            <w:pPr>
+              <w:spacing w:before="20" w:after="20"/>
+              <w:jc w:val="center"/>
+            </w:pPr>
+            <w:r>
+              <w:rPr>
+                <w:rFonts w:ascii="Microsoft YaHei" w:hAnsi="Microsoft YaHei" w:eastAsia="Microsoft YaHei"/>
+                <w:b w:val="0"/>
+                <w:color w:val="333333"/>
+                <w:sz w:val="16"/>
+              </w:rPr>
+              <w:t>0.327%</w:t>
+            </w:r>
+          </w:p>
+        </w:tc>
+        <w:tc>
+          <w:tcPr>
+            <w:tcW w:type="dxa" w:w="2161"/>
+            <w:shd w:fill="FFFFFF" w:val="clear"/>
+          </w:tcPr>
+          <w:p>
+            <w:pPr>
+              <w:spacing w:before="20" w:after="20"/>
+              <w:jc w:val="center"/>
+            </w:pPr>
+            <w:r>
+              <w:rPr>
+                <w:rFonts w:ascii="Microsoft YaHei" w:hAnsi="Microsoft YaHei" w:eastAsia="Microsoft YaHei"/>
+                <w:b w:val="0"/>
+                <w:color w:val="333333"/>
+                <w:sz w:val="16"/>
+              </w:rPr>
+              <w:t>57.9%</w:t>
+            </w:r>
+          </w:p>
+        </w:tc>
+        <w:tc>
+          <w:tcPr>
+            <w:tcW w:type="dxa" w:w="2161"/>
+            <w:shd w:fill="FFFFFF" w:val="clear"/>
+          </w:tcPr>
+          <w:p>
+            <w:pPr>
+              <w:spacing w:before="20" w:after="20"/>
+              <w:jc w:val="center"/>
+            </w:pPr>
+            <w:r>
+              <w:rPr>
+                <w:rFonts w:ascii="Microsoft YaHei" w:hAnsi="Microsoft YaHei" w:eastAsia="Microsoft YaHei"/>
+                <w:b w:val="0"/>
+                <w:color w:val="333333"/>
+                <w:sz w:val="16"/>
+              </w:rPr>
+              <w:t>361</w:t>
+            </w:r>
+          </w:p>
+        </w:tc>
+      </w:tr>
+      <w:tr>
+        <w:tc>
+          <w:tcPr>
+            <w:tcW w:type="dxa" w:w="2161"/>
+            <w:shd w:fill="E6E6E6" w:val="clear"/>
+          </w:tcPr>
+          <w:p>
+            <w:pPr>
+              <w:spacing w:before="20" w:after="20"/>
+              <w:jc w:val="center"/>
+            </w:pPr>
+            <w:r>
+              <w:rPr>
+                <w:rFonts w:ascii="Microsoft YaHei" w:hAnsi="Microsoft YaHei" w:eastAsia="Microsoft YaHei"/>
+                <w:b w:val="0"/>
+                <w:color w:val="333333"/>
+                <w:sz w:val="16"/>
+              </w:rPr>
+              <w:t>-2%</w:t>
+            </w:r>
+          </w:p>
+        </w:tc>
+        <w:tc>
+          <w:tcPr>
+            <w:tcW w:type="dxa" w:w="2161"/>
+            <w:shd w:fill="E6E6E6" w:val="clear"/>
+          </w:tcPr>
+          <w:p>
+            <w:pPr>
+              <w:spacing w:before="20" w:after="20"/>
+              <w:jc w:val="center"/>
+            </w:pPr>
+            <w:r>
+              <w:rPr>
+                <w:rFonts w:ascii="Microsoft YaHei" w:hAnsi="Microsoft YaHei" w:eastAsia="Microsoft YaHei"/>
+                <w:b w:val="0"/>
+                <w:color w:val="333333"/>
+                <w:sz w:val="16"/>
+              </w:rPr>
+              <w:t>0.482%</w:t>
+            </w:r>
+          </w:p>
+        </w:tc>
+        <w:tc>
+          <w:tcPr>
+            <w:tcW w:type="dxa" w:w="2161"/>
+            <w:shd w:fill="E6E6E6" w:val="clear"/>
+          </w:tcPr>
+          <w:p>
+            <w:pPr>
+              <w:spacing w:before="20" w:after="20"/>
+              <w:jc w:val="center"/>
+            </w:pPr>
+            <w:r>
+              <w:rPr>
+                <w:rFonts w:ascii="Microsoft YaHei" w:hAnsi="Microsoft YaHei" w:eastAsia="Microsoft YaHei"/>
+                <w:b w:val="0"/>
+                <w:color w:val="333333"/>
+                <w:sz w:val="16"/>
+              </w:rPr>
+              <w:t>56.7%</w:t>
+            </w:r>
+          </w:p>
+        </w:tc>
+        <w:tc>
+          <w:tcPr>
+            <w:tcW w:type="dxa" w:w="2161"/>
+            <w:shd w:fill="E6E6E6" w:val="clear"/>
+          </w:tcPr>
+          <w:p>
+            <w:pPr>
+              <w:spacing w:before="20" w:after="20"/>
+              <w:jc w:val="center"/>
+            </w:pPr>
+            <w:r>
+              <w:rPr>
+                <w:rFonts w:ascii="Microsoft YaHei" w:hAnsi="Microsoft YaHei" w:eastAsia="Microsoft YaHei"/>
+                <w:b w:val="0"/>
+                <w:color w:val="333333"/>
+                <w:sz w:val="16"/>
+              </w:rPr>
+              <w:t>217</w:t>
+            </w:r>
+          </w:p>
+        </w:tc>
+      </w:tr>
+      <w:tr>
+        <w:tc>
+          <w:tcPr>
+            <w:tcW w:type="dxa" w:w="2161"/>
+            <w:shd w:fill="FFFFFF" w:val="clear"/>
+          </w:tcPr>
+          <w:p>
+            <w:pPr>
+              <w:spacing w:before="20" w:after="20"/>
+              <w:jc w:val="center"/>
+            </w:pPr>
+            <w:r>
+              <w:rPr>
+                <w:rFonts w:ascii="Microsoft YaHei" w:hAnsi="Microsoft YaHei" w:eastAsia="Microsoft YaHei"/>
+                <w:b w:val="0"/>
+                <w:color w:val="333333"/>
+                <w:sz w:val="16"/>
+              </w:rPr>
+              <w:t>-2.5%</w:t>
+            </w:r>
+          </w:p>
+        </w:tc>
+        <w:tc>
+          <w:tcPr>
+            <w:tcW w:type="dxa" w:w="2161"/>
+            <w:shd w:fill="FFFFFF" w:val="clear"/>
+          </w:tcPr>
+          <w:p>
+            <w:pPr>
+              <w:spacing w:before="20" w:after="20"/>
+              <w:jc w:val="center"/>
+            </w:pPr>
+            <w:r>
+              <w:rPr>
+                <w:rFonts w:ascii="Microsoft YaHei" w:hAnsi="Microsoft YaHei" w:eastAsia="Microsoft YaHei"/>
+                <w:b w:val="0"/>
+                <w:color w:val="333333"/>
+                <w:sz w:val="16"/>
+              </w:rPr>
+              <w:t>-0.005%</w:t>
+            </w:r>
+          </w:p>
+        </w:tc>
+        <w:tc>
+          <w:tcPr>
+            <w:tcW w:type="dxa" w:w="2161"/>
+            <w:shd w:fill="FFFFFF" w:val="clear"/>
+          </w:tcPr>
+          <w:p>
+            <w:pPr>
+              <w:spacing w:before="20" w:after="20"/>
+              <w:jc w:val="center"/>
+            </w:pPr>
+            <w:r>
+              <w:rPr>
+                <w:rFonts w:ascii="Microsoft YaHei" w:hAnsi="Microsoft YaHei" w:eastAsia="Microsoft YaHei"/>
+                <w:b w:val="0"/>
+                <w:color w:val="333333"/>
+                <w:sz w:val="16"/>
+              </w:rPr>
+              <w:t>51.5%</w:t>
+            </w:r>
+          </w:p>
+        </w:tc>
+        <w:tc>
+          <w:tcPr>
+            <w:tcW w:type="dxa" w:w="2161"/>
+            <w:shd w:fill="FFFFFF" w:val="clear"/>
+          </w:tcPr>
+          <w:p>
+            <w:pPr>
+              <w:spacing w:before="20" w:after="20"/>
+              <w:jc w:val="center"/>
+            </w:pPr>
+            <w:r>
+              <w:rPr>
+                <w:rFonts w:ascii="Microsoft YaHei" w:hAnsi="Microsoft YaHei" w:eastAsia="Microsoft YaHei"/>
+                <w:b w:val="0"/>
+                <w:color w:val="333333"/>
+                <w:sz w:val="16"/>
+              </w:rPr>
+              <w:t>66</w:t>
+            </w:r>
+          </w:p>
+        </w:tc>
+      </w:tr>
+      <w:tr>
+        <w:tc>
+          <w:tcPr>
+            <w:tcW w:type="dxa" w:w="2161"/>
+            <w:shd w:fill="E6E6E6" w:val="clear"/>
+          </w:tcPr>
+          <w:p>
+            <w:pPr>
+              <w:spacing w:before="20" w:after="20"/>
+              <w:jc w:val="center"/>
+            </w:pPr>
+            <w:r>
+              <w:rPr>
+                <w:rFonts w:ascii="Microsoft YaHei" w:hAnsi="Microsoft YaHei" w:eastAsia="Microsoft YaHei"/>
+                <w:b w:val="0"/>
+                <w:color w:val="333333"/>
+                <w:sz w:val="16"/>
+              </w:rPr>
+              <w:t>-3%</w:t>
+            </w:r>
+          </w:p>
+        </w:tc>
+        <w:tc>
+          <w:tcPr>
+            <w:tcW w:type="dxa" w:w="2161"/>
+            <w:shd w:fill="E6E6E6" w:val="clear"/>
+          </w:tcPr>
+          <w:p>
+            <w:pPr>
+              <w:spacing w:before="20" w:after="20"/>
+              <w:jc w:val="center"/>
+            </w:pPr>
+            <w:r>
+              <w:rPr>
+                <w:rFonts w:ascii="Microsoft YaHei" w:hAnsi="Microsoft YaHei" w:eastAsia="Microsoft YaHei"/>
+                <w:b w:val="0"/>
+                <w:color w:val="333333"/>
+                <w:sz w:val="16"/>
+              </w:rPr>
+              <w:t>0.266%</w:t>
+            </w:r>
+          </w:p>
+        </w:tc>
+        <w:tc>
+          <w:tcPr>
+            <w:tcW w:type="dxa" w:w="2161"/>
+            <w:shd w:fill="E6E6E6" w:val="clear"/>
+          </w:tcPr>
+          <w:p>
+            <w:pPr>
+              <w:spacing w:before="20" w:after="20"/>
+              <w:jc w:val="center"/>
+            </w:pPr>
+            <w:r>
+              <w:rPr>
+                <w:rFonts w:ascii="Microsoft YaHei" w:hAnsi="Microsoft YaHei" w:eastAsia="Microsoft YaHei"/>
+                <w:b w:val="0"/>
+                <w:color w:val="333333"/>
+                <w:sz w:val="16"/>
+              </w:rPr>
+              <w:t>52.9%</w:t>
+            </w:r>
+          </w:p>
+        </w:tc>
+        <w:tc>
+          <w:tcPr>
+            <w:tcW w:type="dxa" w:w="2161"/>
+            <w:shd w:fill="E6E6E6" w:val="clear"/>
+          </w:tcPr>
+          <w:p>
+            <w:pPr>
+              <w:spacing w:before="20" w:after="20"/>
+              <w:jc w:val="center"/>
+            </w:pPr>
+            <w:r>
+              <w:rPr>
+                <w:rFonts w:ascii="Microsoft YaHei" w:hAnsi="Microsoft YaHei" w:eastAsia="Microsoft YaHei"/>
+                <w:b w:val="0"/>
+                <w:color w:val="333333"/>
+                <w:sz w:val="16"/>
+              </w:rPr>
+              <w:t>70</w:t>
             </w:r>
           </w:p>
         </w:tc>
@@ -17494,6 +20269,641 @@
           <w:color w:val="000000"/>
           <w:sz w:val="20"/>
         </w:rPr>
+        <w:t>UIPIX：XLC&gt;=1% 且 美元/黄金&lt;0，买基金后2日平均回报（只调整 XLC 阈值，美元/黄金&lt;0 固定）</w:t>
+      </w:r>
+    </w:p>
+    <w:tbl>
+      <w:tblPr>
+        <w:tblW w:type="auto" w:w="0"/>
+        <w:jc w:val="center"/>
+        <w:tblLayout w:type="fixed"/>
+        <w:tblLook w:firstColumn="1" w:firstRow="1" w:lastColumn="0" w:lastRow="0" w:noHBand="0" w:noVBand="1" w:val="04A0"/>
+        <w:tblBorders>
+          <w:top w:val="single" w:sz="4" w:space="0" w:color="BBBBBB"/>
+          <w:left w:val="single" w:sz="4" w:space="0" w:color="BBBBBB"/>
+          <w:bottom w:val="single" w:sz="4" w:space="0" w:color="BBBBBB"/>
+          <w:right w:val="single" w:sz="4" w:space="0" w:color="BBBBBB"/>
+          <w:insideH w:val="single" w:sz="4" w:space="0" w:color="BBBBBB"/>
+          <w:insideV w:val="single" w:sz="4" w:space="0" w:color="BBBBBB"/>
+        </w:tblBorders>
+      </w:tblPr>
+      <w:tblGrid>
+        <w:gridCol w:w="2161"/>
+        <w:gridCol w:w="2161"/>
+        <w:gridCol w:w="2161"/>
+        <w:gridCol w:w="2161"/>
+      </w:tblGrid>
+      <w:tr>
+        <w:tc>
+          <w:tcPr>
+            <w:tcW w:type="dxa" w:w="1417"/>
+            <w:shd w:fill="FFFFFF" w:val="clear"/>
+          </w:tcPr>
+          <w:p>
+            <w:pPr>
+              <w:spacing w:before="60" w:after="60"/>
+              <w:jc w:val="center"/>
+            </w:pPr>
+            <w:r>
+              <w:rPr>
+                <w:rFonts w:ascii="SimHei" w:hAnsi="SimHei" w:eastAsia="SimHei"/>
+                <w:b/>
+                <w:color w:val="000000"/>
+                <w:sz w:val="18"/>
+              </w:rPr>
+              <w:t>阈值</w:t>
+            </w:r>
+          </w:p>
+        </w:tc>
+        <w:tc>
+          <w:tcPr>
+            <w:tcW w:type="dxa" w:w="1701"/>
+            <w:shd w:fill="FFFFFF" w:val="clear"/>
+          </w:tcPr>
+          <w:p>
+            <w:pPr>
+              <w:spacing w:before="60" w:after="60"/>
+              <w:jc w:val="center"/>
+            </w:pPr>
+            <w:r>
+              <w:rPr>
+                <w:rFonts w:ascii="SimHei" w:hAnsi="SimHei" w:eastAsia="SimHei"/>
+                <w:b/>
+                <w:color w:val="000000"/>
+                <w:sz w:val="18"/>
+              </w:rPr>
+              <w:t>平均回报</w:t>
+            </w:r>
+          </w:p>
+        </w:tc>
+        <w:tc>
+          <w:tcPr>
+            <w:tcW w:type="dxa" w:w="1701"/>
+            <w:shd w:fill="FFFFFF" w:val="clear"/>
+          </w:tcPr>
+          <w:p>
+            <w:pPr>
+              <w:spacing w:before="60" w:after="60"/>
+              <w:jc w:val="center"/>
+            </w:pPr>
+            <w:r>
+              <w:rPr>
+                <w:rFonts w:ascii="SimHei" w:hAnsi="SimHei" w:eastAsia="SimHei"/>
+                <w:b/>
+                <w:color w:val="000000"/>
+                <w:sz w:val="18"/>
+              </w:rPr>
+              <w:t>命中率</w:t>
+            </w:r>
+          </w:p>
+        </w:tc>
+        <w:tc>
+          <w:tcPr>
+            <w:tcW w:type="dxa" w:w="1701"/>
+            <w:shd w:fill="FFFFFF" w:val="clear"/>
+          </w:tcPr>
+          <w:p>
+            <w:pPr>
+              <w:spacing w:before="60" w:after="60"/>
+              <w:jc w:val="center"/>
+            </w:pPr>
+            <w:r>
+              <w:rPr>
+                <w:rFonts w:ascii="SimHei" w:hAnsi="SimHei" w:eastAsia="SimHei"/>
+                <w:b/>
+                <w:color w:val="000000"/>
+                <w:sz w:val="18"/>
+              </w:rPr>
+              <w:t>交易数</w:t>
+            </w:r>
+          </w:p>
+        </w:tc>
+      </w:tr>
+      <w:tr>
+        <w:tc>
+          <w:tcPr>
+            <w:tcW w:type="dxa" w:w="2161"/>
+            <w:shd w:fill="FFFFFF" w:val="clear"/>
+          </w:tcPr>
+          <w:p>
+            <w:pPr>
+              <w:spacing w:before="20" w:after="20"/>
+              <w:jc w:val="center"/>
+            </w:pPr>
+            <w:r>
+              <w:rPr>
+                <w:rFonts w:ascii="Microsoft YaHei" w:hAnsi="Microsoft YaHei" w:eastAsia="Microsoft YaHei"/>
+                <w:b w:val="0"/>
+                <w:color w:val="333333"/>
+                <w:sz w:val="16"/>
+              </w:rPr>
+              <w:t>+0.5%</w:t>
+            </w:r>
+          </w:p>
+        </w:tc>
+        <w:tc>
+          <w:tcPr>
+            <w:tcW w:type="dxa" w:w="2161"/>
+            <w:shd w:fill="FFFFFF" w:val="clear"/>
+          </w:tcPr>
+          <w:p>
+            <w:pPr>
+              <w:spacing w:before="20" w:after="20"/>
+              <w:jc w:val="center"/>
+            </w:pPr>
+            <w:r>
+              <w:rPr>
+                <w:rFonts w:ascii="Microsoft YaHei" w:hAnsi="Microsoft YaHei" w:eastAsia="Microsoft YaHei"/>
+                <w:b w:val="0"/>
+                <w:color w:val="333333"/>
+                <w:sz w:val="16"/>
+              </w:rPr>
+              <w:t>0.161%</w:t>
+            </w:r>
+          </w:p>
+        </w:tc>
+        <w:tc>
+          <w:tcPr>
+            <w:tcW w:type="dxa" w:w="2161"/>
+            <w:shd w:fill="FFFFFF" w:val="clear"/>
+          </w:tcPr>
+          <w:p>
+            <w:pPr>
+              <w:spacing w:before="20" w:after="20"/>
+              <w:jc w:val="center"/>
+            </w:pPr>
+            <w:r>
+              <w:rPr>
+                <w:rFonts w:ascii="Microsoft YaHei" w:hAnsi="Microsoft YaHei" w:eastAsia="Microsoft YaHei"/>
+                <w:b w:val="0"/>
+                <w:color w:val="333333"/>
+                <w:sz w:val="16"/>
+              </w:rPr>
+              <w:t>51.7%</w:t>
+            </w:r>
+          </w:p>
+        </w:tc>
+        <w:tc>
+          <w:tcPr>
+            <w:tcW w:type="dxa" w:w="2161"/>
+            <w:shd w:fill="FFFFFF" w:val="clear"/>
+          </w:tcPr>
+          <w:p>
+            <w:pPr>
+              <w:spacing w:before="20" w:after="20"/>
+              <w:jc w:val="center"/>
+            </w:pPr>
+            <w:r>
+              <w:rPr>
+                <w:rFonts w:ascii="Microsoft YaHei" w:hAnsi="Microsoft YaHei" w:eastAsia="Microsoft YaHei"/>
+                <w:b w:val="0"/>
+                <w:color w:val="333333"/>
+                <w:sz w:val="16"/>
+              </w:rPr>
+              <w:t>267</w:t>
+            </w:r>
+          </w:p>
+        </w:tc>
+      </w:tr>
+      <w:tr>
+        <w:tc>
+          <w:tcPr>
+            <w:tcW w:type="dxa" w:w="2161"/>
+            <w:shd w:fill="E6E6E6" w:val="clear"/>
+          </w:tcPr>
+          <w:p>
+            <w:pPr>
+              <w:spacing w:before="20" w:after="20"/>
+              <w:jc w:val="center"/>
+            </w:pPr>
+            <w:r>
+              <w:rPr>
+                <w:rFonts w:ascii="Microsoft YaHei" w:hAnsi="Microsoft YaHei" w:eastAsia="Microsoft YaHei"/>
+                <w:b w:val="0"/>
+                <w:color w:val="333333"/>
+                <w:sz w:val="16"/>
+              </w:rPr>
+              <w:t>+1%</w:t>
+            </w:r>
+          </w:p>
+        </w:tc>
+        <w:tc>
+          <w:tcPr>
+            <w:tcW w:type="dxa" w:w="2161"/>
+            <w:shd w:fill="E6E6E6" w:val="clear"/>
+          </w:tcPr>
+          <w:p>
+            <w:pPr>
+              <w:spacing w:before="20" w:after="20"/>
+              <w:jc w:val="center"/>
+            </w:pPr>
+            <w:r>
+              <w:rPr>
+                <w:rFonts w:ascii="Microsoft YaHei" w:hAnsi="Microsoft YaHei" w:eastAsia="Microsoft YaHei"/>
+                <w:b w:val="0"/>
+                <w:color w:val="333333"/>
+                <w:sz w:val="16"/>
+              </w:rPr>
+              <w:t>0.259%</w:t>
+            </w:r>
+          </w:p>
+        </w:tc>
+        <w:tc>
+          <w:tcPr>
+            <w:tcW w:type="dxa" w:w="2161"/>
+            <w:shd w:fill="E6E6E6" w:val="clear"/>
+          </w:tcPr>
+          <w:p>
+            <w:pPr>
+              <w:spacing w:before="20" w:after="20"/>
+              <w:jc w:val="center"/>
+            </w:pPr>
+            <w:r>
+              <w:rPr>
+                <w:rFonts w:ascii="Microsoft YaHei" w:hAnsi="Microsoft YaHei" w:eastAsia="Microsoft YaHei"/>
+                <w:b w:val="0"/>
+                <w:color w:val="333333"/>
+                <w:sz w:val="16"/>
+              </w:rPr>
+              <w:t>55.6%</w:t>
+            </w:r>
+          </w:p>
+        </w:tc>
+        <w:tc>
+          <w:tcPr>
+            <w:tcW w:type="dxa" w:w="2161"/>
+            <w:shd w:fill="E6E6E6" w:val="clear"/>
+          </w:tcPr>
+          <w:p>
+            <w:pPr>
+              <w:spacing w:before="20" w:after="20"/>
+              <w:jc w:val="center"/>
+            </w:pPr>
+            <w:r>
+              <w:rPr>
+                <w:rFonts w:ascii="Microsoft YaHei" w:hAnsi="Microsoft YaHei" w:eastAsia="Microsoft YaHei"/>
+                <w:b w:val="0"/>
+                <w:color w:val="333333"/>
+                <w:sz w:val="16"/>
+              </w:rPr>
+              <w:t>126</w:t>
+            </w:r>
+          </w:p>
+        </w:tc>
+      </w:tr>
+      <w:tr>
+        <w:tc>
+          <w:tcPr>
+            <w:tcW w:type="dxa" w:w="2161"/>
+            <w:shd w:fill="FFFFFF" w:val="clear"/>
+          </w:tcPr>
+          <w:p>
+            <w:pPr>
+              <w:spacing w:before="20" w:after="20"/>
+              <w:jc w:val="center"/>
+            </w:pPr>
+            <w:r>
+              <w:rPr>
+                <w:rFonts w:ascii="Microsoft YaHei" w:hAnsi="Microsoft YaHei" w:eastAsia="Microsoft YaHei"/>
+                <w:b w:val="0"/>
+                <w:color w:val="333333"/>
+                <w:sz w:val="16"/>
+              </w:rPr>
+              <w:t>+1.5%</w:t>
+            </w:r>
+          </w:p>
+        </w:tc>
+        <w:tc>
+          <w:tcPr>
+            <w:tcW w:type="dxa" w:w="2161"/>
+            <w:shd w:fill="FFFFFF" w:val="clear"/>
+          </w:tcPr>
+          <w:p>
+            <w:pPr>
+              <w:spacing w:before="20" w:after="20"/>
+              <w:jc w:val="center"/>
+            </w:pPr>
+            <w:r>
+              <w:rPr>
+                <w:rFonts w:ascii="Microsoft YaHei" w:hAnsi="Microsoft YaHei" w:eastAsia="Microsoft YaHei"/>
+                <w:b w:val="0"/>
+                <w:color w:val="333333"/>
+                <w:sz w:val="16"/>
+              </w:rPr>
+              <w:t>0.055%</w:t>
+            </w:r>
+          </w:p>
+        </w:tc>
+        <w:tc>
+          <w:tcPr>
+            <w:tcW w:type="dxa" w:w="2161"/>
+            <w:shd w:fill="FFFFFF" w:val="clear"/>
+          </w:tcPr>
+          <w:p>
+            <w:pPr>
+              <w:spacing w:before="20" w:after="20"/>
+              <w:jc w:val="center"/>
+            </w:pPr>
+            <w:r>
+              <w:rPr>
+                <w:rFonts w:ascii="Microsoft YaHei" w:hAnsi="Microsoft YaHei" w:eastAsia="Microsoft YaHei"/>
+                <w:b w:val="0"/>
+                <w:color w:val="333333"/>
+                <w:sz w:val="16"/>
+              </w:rPr>
+              <w:t>59.1%</w:t>
+            </w:r>
+          </w:p>
+        </w:tc>
+        <w:tc>
+          <w:tcPr>
+            <w:tcW w:type="dxa" w:w="2161"/>
+            <w:shd w:fill="FFFFFF" w:val="clear"/>
+          </w:tcPr>
+          <w:p>
+            <w:pPr>
+              <w:spacing w:before="20" w:after="20"/>
+              <w:jc w:val="center"/>
+            </w:pPr>
+            <w:r>
+              <w:rPr>
+                <w:rFonts w:ascii="Microsoft YaHei" w:hAnsi="Microsoft YaHei" w:eastAsia="Microsoft YaHei"/>
+                <w:b w:val="0"/>
+                <w:color w:val="333333"/>
+                <w:sz w:val="16"/>
+              </w:rPr>
+              <w:t>22</w:t>
+            </w:r>
+          </w:p>
+        </w:tc>
+      </w:tr>
+      <w:tr>
+        <w:tc>
+          <w:tcPr>
+            <w:tcW w:type="dxa" w:w="2161"/>
+            <w:shd w:fill="E6E6E6" w:val="clear"/>
+          </w:tcPr>
+          <w:p>
+            <w:pPr>
+              <w:spacing w:before="20" w:after="20"/>
+              <w:jc w:val="center"/>
+            </w:pPr>
+            <w:r>
+              <w:rPr>
+                <w:rFonts w:ascii="Microsoft YaHei" w:hAnsi="Microsoft YaHei" w:eastAsia="Microsoft YaHei"/>
+                <w:b w:val="0"/>
+                <w:color w:val="333333"/>
+                <w:sz w:val="16"/>
+              </w:rPr>
+              <w:t>+2%</w:t>
+            </w:r>
+          </w:p>
+        </w:tc>
+        <w:tc>
+          <w:tcPr>
+            <w:tcW w:type="dxa" w:w="2161"/>
+            <w:shd w:fill="E6E6E6" w:val="clear"/>
+          </w:tcPr>
+          <w:p>
+            <w:pPr>
+              <w:spacing w:before="20" w:after="20"/>
+              <w:jc w:val="center"/>
+            </w:pPr>
+            <w:r>
+              <w:rPr>
+                <w:rFonts w:ascii="Microsoft YaHei" w:hAnsi="Microsoft YaHei" w:eastAsia="Microsoft YaHei"/>
+                <w:b w:val="0"/>
+                <w:color w:val="333333"/>
+                <w:sz w:val="16"/>
+              </w:rPr>
+              <w:t>无触发</w:t>
+            </w:r>
+          </w:p>
+        </w:tc>
+        <w:tc>
+          <w:tcPr>
+            <w:tcW w:type="dxa" w:w="2161"/>
+            <w:shd w:fill="E6E6E6" w:val="clear"/>
+          </w:tcPr>
+          <w:p>
+            <w:pPr>
+              <w:spacing w:before="20" w:after="20"/>
+              <w:jc w:val="center"/>
+            </w:pPr>
+            <w:r>
+              <w:rPr>
+                <w:rFonts w:ascii="Microsoft YaHei" w:hAnsi="Microsoft YaHei" w:eastAsia="Microsoft YaHei"/>
+                <w:b w:val="0"/>
+                <w:color w:val="333333"/>
+                <w:sz w:val="16"/>
+              </w:rPr>
+              <w:t>无</w:t>
+            </w:r>
+          </w:p>
+        </w:tc>
+        <w:tc>
+          <w:tcPr>
+            <w:tcW w:type="dxa" w:w="2161"/>
+            <w:shd w:fill="E6E6E6" w:val="clear"/>
+          </w:tcPr>
+          <w:p>
+            <w:pPr>
+              <w:spacing w:before="20" w:after="20"/>
+              <w:jc w:val="center"/>
+            </w:pPr>
+            <w:r>
+              <w:rPr>
+                <w:rFonts w:ascii="Microsoft YaHei" w:hAnsi="Microsoft YaHei" w:eastAsia="Microsoft YaHei"/>
+                <w:b w:val="0"/>
+                <w:color w:val="333333"/>
+                <w:sz w:val="16"/>
+              </w:rPr>
+              <w:t>0</w:t>
+            </w:r>
+          </w:p>
+        </w:tc>
+      </w:tr>
+      <w:tr>
+        <w:tc>
+          <w:tcPr>
+            <w:tcW w:type="dxa" w:w="2161"/>
+            <w:shd w:fill="FFFFFF" w:val="clear"/>
+          </w:tcPr>
+          <w:p>
+            <w:pPr>
+              <w:spacing w:before="20" w:after="20"/>
+              <w:jc w:val="center"/>
+            </w:pPr>
+            <w:r>
+              <w:rPr>
+                <w:rFonts w:ascii="Microsoft YaHei" w:hAnsi="Microsoft YaHei" w:eastAsia="Microsoft YaHei"/>
+                <w:b w:val="0"/>
+                <w:color w:val="333333"/>
+                <w:sz w:val="16"/>
+              </w:rPr>
+              <w:t>+2.5%</w:t>
+            </w:r>
+          </w:p>
+        </w:tc>
+        <w:tc>
+          <w:tcPr>
+            <w:tcW w:type="dxa" w:w="2161"/>
+            <w:shd w:fill="FFFFFF" w:val="clear"/>
+          </w:tcPr>
+          <w:p>
+            <w:pPr>
+              <w:spacing w:before="20" w:after="20"/>
+              <w:jc w:val="center"/>
+            </w:pPr>
+            <w:r>
+              <w:rPr>
+                <w:rFonts w:ascii="Microsoft YaHei" w:hAnsi="Microsoft YaHei" w:eastAsia="Microsoft YaHei"/>
+                <w:b w:val="0"/>
+                <w:color w:val="333333"/>
+                <w:sz w:val="16"/>
+              </w:rPr>
+              <w:t>无触发</w:t>
+            </w:r>
+          </w:p>
+        </w:tc>
+        <w:tc>
+          <w:tcPr>
+            <w:tcW w:type="dxa" w:w="2161"/>
+            <w:shd w:fill="FFFFFF" w:val="clear"/>
+          </w:tcPr>
+          <w:p>
+            <w:pPr>
+              <w:spacing w:before="20" w:after="20"/>
+              <w:jc w:val="center"/>
+            </w:pPr>
+            <w:r>
+              <w:rPr>
+                <w:rFonts w:ascii="Microsoft YaHei" w:hAnsi="Microsoft YaHei" w:eastAsia="Microsoft YaHei"/>
+                <w:b w:val="0"/>
+                <w:color w:val="333333"/>
+                <w:sz w:val="16"/>
+              </w:rPr>
+              <w:t>无</w:t>
+            </w:r>
+          </w:p>
+        </w:tc>
+        <w:tc>
+          <w:tcPr>
+            <w:tcW w:type="dxa" w:w="2161"/>
+            <w:shd w:fill="FFFFFF" w:val="clear"/>
+          </w:tcPr>
+          <w:p>
+            <w:pPr>
+              <w:spacing w:before="20" w:after="20"/>
+              <w:jc w:val="center"/>
+            </w:pPr>
+            <w:r>
+              <w:rPr>
+                <w:rFonts w:ascii="Microsoft YaHei" w:hAnsi="Microsoft YaHei" w:eastAsia="Microsoft YaHei"/>
+                <w:b w:val="0"/>
+                <w:color w:val="333333"/>
+                <w:sz w:val="16"/>
+              </w:rPr>
+              <w:t>0</w:t>
+            </w:r>
+          </w:p>
+        </w:tc>
+      </w:tr>
+      <w:tr>
+        <w:tc>
+          <w:tcPr>
+            <w:tcW w:type="dxa" w:w="2161"/>
+            <w:shd w:fill="E6E6E6" w:val="clear"/>
+          </w:tcPr>
+          <w:p>
+            <w:pPr>
+              <w:spacing w:before="20" w:after="20"/>
+              <w:jc w:val="center"/>
+            </w:pPr>
+            <w:r>
+              <w:rPr>
+                <w:rFonts w:ascii="Microsoft YaHei" w:hAnsi="Microsoft YaHei" w:eastAsia="Microsoft YaHei"/>
+                <w:b w:val="0"/>
+                <w:color w:val="333333"/>
+                <w:sz w:val="16"/>
+              </w:rPr>
+              <w:t>+3%</w:t>
+            </w:r>
+          </w:p>
+        </w:tc>
+        <w:tc>
+          <w:tcPr>
+            <w:tcW w:type="dxa" w:w="2161"/>
+            <w:shd w:fill="E6E6E6" w:val="clear"/>
+          </w:tcPr>
+          <w:p>
+            <w:pPr>
+              <w:spacing w:before="20" w:after="20"/>
+              <w:jc w:val="center"/>
+            </w:pPr>
+            <w:r>
+              <w:rPr>
+                <w:rFonts w:ascii="Microsoft YaHei" w:hAnsi="Microsoft YaHei" w:eastAsia="Microsoft YaHei"/>
+                <w:b w:val="0"/>
+                <w:color w:val="333333"/>
+                <w:sz w:val="16"/>
+              </w:rPr>
+              <w:t>无触发</w:t>
+            </w:r>
+          </w:p>
+        </w:tc>
+        <w:tc>
+          <w:tcPr>
+            <w:tcW w:type="dxa" w:w="2161"/>
+            <w:shd w:fill="E6E6E6" w:val="clear"/>
+          </w:tcPr>
+          <w:p>
+            <w:pPr>
+              <w:spacing w:before="20" w:after="20"/>
+              <w:jc w:val="center"/>
+            </w:pPr>
+            <w:r>
+              <w:rPr>
+                <w:rFonts w:ascii="Microsoft YaHei" w:hAnsi="Microsoft YaHei" w:eastAsia="Microsoft YaHei"/>
+                <w:b w:val="0"/>
+                <w:color w:val="333333"/>
+                <w:sz w:val="16"/>
+              </w:rPr>
+              <w:t>无</w:t>
+            </w:r>
+          </w:p>
+        </w:tc>
+        <w:tc>
+          <w:tcPr>
+            <w:tcW w:type="dxa" w:w="2161"/>
+            <w:shd w:fill="E6E6E6" w:val="clear"/>
+          </w:tcPr>
+          <w:p>
+            <w:pPr>
+              <w:spacing w:before="20" w:after="20"/>
+              <w:jc w:val="center"/>
+            </w:pPr>
+            <w:r>
+              <w:rPr>
+                <w:rFonts w:ascii="Microsoft YaHei" w:hAnsi="Microsoft YaHei" w:eastAsia="Microsoft YaHei"/>
+                <w:b w:val="0"/>
+                <w:color w:val="333333"/>
+                <w:sz w:val="16"/>
+              </w:rPr>
+              <w:t>0</w:t>
+            </w:r>
+          </w:p>
+        </w:tc>
+      </w:tr>
+    </w:tbl>
+    <w:p>
+      <w:r>
+        <w:rPr>
+          <w:rFonts w:ascii="Microsoft YaHei" w:hAnsi="Microsoft YaHei" w:eastAsia="Microsoft YaHei"/>
+          <w:b w:val="0"/>
+          <w:color w:val="000000"/>
+          <w:sz w:val="20"/>
+        </w:rPr>
         <w:t>ULPIX：QQQ&lt;=-1% 且 VIX5d&gt;0，买基金第二天（只调整 QQQ 阈值，VIX5d&gt;0 固定）</w:t>
       </w:r>
     </w:p>
@@ -18129,7 +21539,7 @@
           <w:color w:val="000000"/>
           <w:sz w:val="20"/>
         </w:rPr>
-        <w:t>改进措施：这 5 条策略不做“更深阈值”外推，当前 -1% 阈值反而更优；其余策略保持 -2% 固定阈值即可。</w:t>
+        <w:t>改进措施：这 8 组异常策略不做“更深阈值”外推，当前 -1% 阈值反而更优；其余策略保持 -2% 固定阈值即可。</w:t>
       </w:r>
     </w:p>
     <w:sectPr>

</xml_diff>

<commit_message>
docs: add explanation consistency check and clarify threshold scan scope
</commit_message>
<xml_diff>
--- a/03_文档/报告/2026-08-18_v4稳健性分析报告_上司版.docx
+++ b/03_文档/报告/2026-08-18_v4稳健性分析报告_上司版.docx
@@ -3066,304 +3066,6 @@
                 <w:color w:val="333333"/>
                 <w:sz w:val="16"/>
               </w:rPr>
-              <w:t>UDPSX</w:t>
-            </w:r>
-          </w:p>
-        </w:tc>
-        <w:tc>
-          <w:tcPr>
-            <w:tcW w:type="dxa" w:w="1235"/>
-            <w:shd w:fill="FFFFFF" w:val="clear"/>
-          </w:tcPr>
-          <w:p>
-            <w:pPr>
-              <w:spacing w:before="20" w:after="20"/>
-              <w:jc w:val="center"/>
-            </w:pPr>
-            <w:r>
-              <w:rPr>
-                <w:rFonts w:ascii="Microsoft YaHei" w:hAnsi="Microsoft YaHei" w:eastAsia="Microsoft YaHei"/>
-                <w:b w:val="0"/>
-                <w:color w:val="333333"/>
-                <w:sz w:val="16"/>
-              </w:rPr>
-              <w:t>QQQ&lt;=-1% 且 VIX5d&gt;0，买基金第二天</w:t>
-            </w:r>
-          </w:p>
-        </w:tc>
-        <w:tc>
-          <w:tcPr>
-            <w:tcW w:type="dxa" w:w="1235"/>
-            <w:shd w:fill="FFFFFF" w:val="clear"/>
-          </w:tcPr>
-          <w:p>
-            <w:pPr>
-              <w:spacing w:before="20" w:after="20"/>
-              <w:jc w:val="center"/>
-            </w:pPr>
-            <w:r>
-              <w:rPr>
-                <w:rFonts w:ascii="Microsoft YaHei" w:hAnsi="Microsoft YaHei" w:eastAsia="Microsoft YaHei"/>
-                <w:b w:val="0"/>
-                <w:color w:val="333333"/>
-                <w:sz w:val="16"/>
-              </w:rPr>
-              <w:t>0.205%</w:t>
-            </w:r>
-          </w:p>
-        </w:tc>
-        <w:tc>
-          <w:tcPr>
-            <w:tcW w:type="dxa" w:w="1235"/>
-            <w:shd w:fill="FFFFFF" w:val="clear"/>
-          </w:tcPr>
-          <w:p>
-            <w:pPr>
-              <w:spacing w:before="20" w:after="20"/>
-              <w:jc w:val="center"/>
-            </w:pPr>
-            <w:r>
-              <w:rPr>
-                <w:rFonts w:ascii="Microsoft YaHei" w:hAnsi="Microsoft YaHei" w:eastAsia="Microsoft YaHei"/>
-                <w:b w:val="0"/>
-                <w:color w:val="333333"/>
-                <w:sz w:val="16"/>
-              </w:rPr>
-              <w:t>57.3%</w:t>
-            </w:r>
-          </w:p>
-        </w:tc>
-        <w:tc>
-          <w:tcPr>
-            <w:tcW w:type="dxa" w:w="1235"/>
-            <w:shd w:fill="FFFFFF" w:val="clear"/>
-          </w:tcPr>
-          <w:p>
-            <w:pPr>
-              <w:spacing w:before="20" w:after="20"/>
-              <w:jc w:val="center"/>
-            </w:pPr>
-            <w:r>
-              <w:rPr>
-                <w:rFonts w:ascii="Microsoft YaHei" w:hAnsi="Microsoft YaHei" w:eastAsia="Microsoft YaHei"/>
-                <w:b w:val="0"/>
-                <w:color w:val="333333"/>
-                <w:sz w:val="16"/>
-              </w:rPr>
-              <w:t>0.536%</w:t>
-            </w:r>
-          </w:p>
-        </w:tc>
-        <w:tc>
-          <w:tcPr>
-            <w:tcW w:type="dxa" w:w="1235"/>
-            <w:shd w:fill="FFFFFF" w:val="clear"/>
-          </w:tcPr>
-          <w:p>
-            <w:pPr>
-              <w:spacing w:before="20" w:after="20"/>
-              <w:jc w:val="center"/>
-            </w:pPr>
-            <w:r>
-              <w:rPr>
-                <w:rFonts w:ascii="Microsoft YaHei" w:hAnsi="Microsoft YaHei" w:eastAsia="Microsoft YaHei"/>
-                <w:b w:val="0"/>
-                <w:color w:val="333333"/>
-                <w:sz w:val="16"/>
-              </w:rPr>
-              <w:t>67.9%</w:t>
-            </w:r>
-          </w:p>
-        </w:tc>
-        <w:tc>
-          <w:tcPr>
-            <w:tcW w:type="dxa" w:w="1235"/>
-            <w:shd w:fill="FFFFFF" w:val="clear"/>
-          </w:tcPr>
-          <w:p>
-            <w:pPr>
-              <w:spacing w:before="20" w:after="20"/>
-              <w:jc w:val="center"/>
-            </w:pPr>
-            <w:r>
-              <w:rPr>
-                <w:rFonts w:ascii="Microsoft YaHei" w:hAnsi="Microsoft YaHei" w:eastAsia="Microsoft YaHei"/>
-                <w:b w:val="0"/>
-                <w:color w:val="333333"/>
-                <w:sz w:val="16"/>
-              </w:rPr>
-              <w:t>训练效果弱且波动高</w:t>
-            </w:r>
-          </w:p>
-        </w:tc>
-      </w:tr>
-      <w:tr>
-        <w:tc>
-          <w:tcPr>
-            <w:tcW w:type="dxa" w:w="1235"/>
-            <w:shd w:fill="E6E6E6" w:val="clear"/>
-          </w:tcPr>
-          <w:p>
-            <w:pPr>
-              <w:spacing w:before="20" w:after="20"/>
-              <w:jc w:val="center"/>
-            </w:pPr>
-            <w:r>
-              <w:rPr>
-                <w:rFonts w:ascii="Microsoft YaHei" w:hAnsi="Microsoft YaHei" w:eastAsia="Microsoft YaHei"/>
-                <w:b w:val="0"/>
-                <w:color w:val="333333"/>
-                <w:sz w:val="16"/>
-              </w:rPr>
-              <w:t>UIPSX</w:t>
-            </w:r>
-          </w:p>
-        </w:tc>
-        <w:tc>
-          <w:tcPr>
-            <w:tcW w:type="dxa" w:w="1235"/>
-            <w:shd w:fill="E6E6E6" w:val="clear"/>
-          </w:tcPr>
-          <w:p>
-            <w:pPr>
-              <w:spacing w:before="20" w:after="20"/>
-              <w:jc w:val="center"/>
-            </w:pPr>
-            <w:r>
-              <w:rPr>
-                <w:rFonts w:ascii="Microsoft YaHei" w:hAnsi="Microsoft YaHei" w:eastAsia="Microsoft YaHei"/>
-                <w:b w:val="0"/>
-                <w:color w:val="333333"/>
-                <w:sz w:val="16"/>
-              </w:rPr>
-              <w:t>FXY&lt;0 且 GLD&gt;0 且 XLC&gt;0，买基金后2日平均回报</w:t>
-            </w:r>
-          </w:p>
-        </w:tc>
-        <w:tc>
-          <w:tcPr>
-            <w:tcW w:type="dxa" w:w="1235"/>
-            <w:shd w:fill="E6E6E6" w:val="clear"/>
-          </w:tcPr>
-          <w:p>
-            <w:pPr>
-              <w:spacing w:before="20" w:after="20"/>
-              <w:jc w:val="center"/>
-            </w:pPr>
-            <w:r>
-              <w:rPr>
-                <w:rFonts w:ascii="Microsoft YaHei" w:hAnsi="Microsoft YaHei" w:eastAsia="Microsoft YaHei"/>
-                <w:b w:val="0"/>
-                <w:color w:val="333333"/>
-                <w:sz w:val="16"/>
-              </w:rPr>
-              <w:t>0.235%</w:t>
-            </w:r>
-          </w:p>
-        </w:tc>
-        <w:tc>
-          <w:tcPr>
-            <w:tcW w:type="dxa" w:w="1235"/>
-            <w:shd w:fill="E6E6E6" w:val="clear"/>
-          </w:tcPr>
-          <w:p>
-            <w:pPr>
-              <w:spacing w:before="20" w:after="20"/>
-              <w:jc w:val="center"/>
-            </w:pPr>
-            <w:r>
-              <w:rPr>
-                <w:rFonts w:ascii="Microsoft YaHei" w:hAnsi="Microsoft YaHei" w:eastAsia="Microsoft YaHei"/>
-                <w:b w:val="0"/>
-                <w:color w:val="333333"/>
-                <w:sz w:val="16"/>
-              </w:rPr>
-              <w:t>55.6%</w:t>
-            </w:r>
-          </w:p>
-        </w:tc>
-        <w:tc>
-          <w:tcPr>
-            <w:tcW w:type="dxa" w:w="1235"/>
-            <w:shd w:fill="E6E6E6" w:val="clear"/>
-          </w:tcPr>
-          <w:p>
-            <w:pPr>
-              <w:spacing w:before="20" w:after="20"/>
-              <w:jc w:val="center"/>
-            </w:pPr>
-            <w:r>
-              <w:rPr>
-                <w:rFonts w:ascii="Microsoft YaHei" w:hAnsi="Microsoft YaHei" w:eastAsia="Microsoft YaHei"/>
-                <w:b w:val="0"/>
-                <w:color w:val="333333"/>
-                <w:sz w:val="16"/>
-              </w:rPr>
-              <w:t>0.526%</w:t>
-            </w:r>
-          </w:p>
-        </w:tc>
-        <w:tc>
-          <w:tcPr>
-            <w:tcW w:type="dxa" w:w="1235"/>
-            <w:shd w:fill="E6E6E6" w:val="clear"/>
-          </w:tcPr>
-          <w:p>
-            <w:pPr>
-              <w:spacing w:before="20" w:after="20"/>
-              <w:jc w:val="center"/>
-            </w:pPr>
-            <w:r>
-              <w:rPr>
-                <w:rFonts w:ascii="Microsoft YaHei" w:hAnsi="Microsoft YaHei" w:eastAsia="Microsoft YaHei"/>
-                <w:b w:val="0"/>
-                <w:color w:val="333333"/>
-                <w:sz w:val="16"/>
-              </w:rPr>
-              <w:t>60.5%</w:t>
-            </w:r>
-          </w:p>
-        </w:tc>
-        <w:tc>
-          <w:tcPr>
-            <w:tcW w:type="dxa" w:w="1235"/>
-            <w:shd w:fill="E6E6E6" w:val="clear"/>
-          </w:tcPr>
-          <w:p>
-            <w:pPr>
-              <w:spacing w:before="20" w:after="20"/>
-              <w:jc w:val="center"/>
-            </w:pPr>
-            <w:r>
-              <w:rPr>
-                <w:rFonts w:ascii="Microsoft YaHei" w:hAnsi="Microsoft YaHei" w:eastAsia="Microsoft YaHei"/>
-                <w:b w:val="0"/>
-                <w:color w:val="333333"/>
-                <w:sz w:val="16"/>
-              </w:rPr>
-              <w:t>训练效果偏弱</w:t>
-            </w:r>
-          </w:p>
-        </w:tc>
-      </w:tr>
-      <w:tr>
-        <w:tc>
-          <w:tcPr>
-            <w:tcW w:type="dxa" w:w="1235"/>
-            <w:shd w:fill="FFFFFF" w:val="clear"/>
-          </w:tcPr>
-          <w:p>
-            <w:pPr>
-              <w:spacing w:before="20" w:after="20"/>
-              <w:jc w:val="center"/>
-            </w:pPr>
-            <w:r>
-              <w:rPr>
-                <w:rFonts w:ascii="Microsoft YaHei" w:hAnsi="Microsoft YaHei" w:eastAsia="Microsoft YaHei"/>
-                <w:b w:val="0"/>
-                <w:color w:val="333333"/>
-                <w:sz w:val="16"/>
-              </w:rPr>
               <w:t>UKPIX</w:t>
             </w:r>
           </w:p>
@@ -3672,12 +3374,13 @@
         </w:tblBorders>
       </w:tblPr>
       <w:tblGrid>
-        <w:gridCol w:w="1441"/>
-        <w:gridCol w:w="1441"/>
-        <w:gridCol w:w="1441"/>
-        <w:gridCol w:w="1441"/>
-        <w:gridCol w:w="1441"/>
-        <w:gridCol w:w="1441"/>
+        <w:gridCol w:w="1235"/>
+        <w:gridCol w:w="1235"/>
+        <w:gridCol w:w="1235"/>
+        <w:gridCol w:w="1235"/>
+        <w:gridCol w:w="1235"/>
+        <w:gridCol w:w="1235"/>
+        <w:gridCol w:w="1235"/>
       </w:tblGrid>
       <w:tr>
         <w:tc>
@@ -3806,131 +3509,173 @@
             </w:r>
           </w:p>
         </w:tc>
+        <w:tc>
+          <w:tcPr>
+            <w:tcW w:type="dxa" w:w="1235"/>
+            <w:shd w:fill="FFFFFF" w:val="clear"/>
+          </w:tcPr>
+          <w:p>
+            <w:pPr>
+              <w:spacing w:before="60" w:after="60"/>
+              <w:jc w:val="center"/>
+            </w:pPr>
+            <w:r>
+              <w:rPr>
+                <w:rFonts w:ascii="SimHei" w:hAnsi="SimHei" w:eastAsia="SimHei"/>
+                <w:b/>
+                <w:color w:val="000000"/>
+                <w:sz w:val="18"/>
+              </w:rPr>
+              <w:t>备注</w:t>
+            </w:r>
+          </w:p>
+        </w:tc>
       </w:tr>
       <w:tr>
         <w:tc>
           <w:tcPr>
-            <w:tcW w:type="dxa" w:w="1441"/>
-            <w:shd w:fill="FFFFFF" w:val="clear"/>
-          </w:tcPr>
-          <w:p>
-            <w:pPr>
-              <w:spacing w:before="20" w:after="20"/>
-              <w:jc w:val="center"/>
-            </w:pPr>
-            <w:r>
-              <w:rPr>
-                <w:rFonts w:ascii="Microsoft YaHei" w:hAnsi="Microsoft YaHei" w:eastAsia="Microsoft YaHei"/>
-                <w:b w:val="0"/>
-                <w:color w:val="333333"/>
-                <w:sz w:val="16"/>
-              </w:rPr>
-              <w:t>CYPSX</w:t>
-            </w:r>
-          </w:p>
-        </w:tc>
-        <w:tc>
-          <w:tcPr>
-            <w:tcW w:type="dxa" w:w="1441"/>
-            <w:shd w:fill="FFFFFF" w:val="clear"/>
-          </w:tcPr>
-          <w:p>
-            <w:pPr>
-              <w:spacing w:before="20" w:after="20"/>
-              <w:jc w:val="center"/>
-            </w:pPr>
-            <w:r>
-              <w:rPr>
-                <w:rFonts w:ascii="Microsoft YaHei" w:hAnsi="Microsoft YaHei" w:eastAsia="Microsoft YaHei"/>
-                <w:b w:val="0"/>
-                <w:color w:val="333333"/>
-                <w:sz w:val="16"/>
-              </w:rPr>
-              <w:t>EEM&lt;0 且 SLV&gt;0 且 XLF&lt;0，买基金第二天</w:t>
-            </w:r>
-          </w:p>
-        </w:tc>
-        <w:tc>
-          <w:tcPr>
-            <w:tcW w:type="dxa" w:w="1441"/>
-            <w:shd w:fill="FFFFFF" w:val="clear"/>
-          </w:tcPr>
-          <w:p>
-            <w:pPr>
-              <w:spacing w:before="20" w:after="20"/>
-              <w:jc w:val="center"/>
-            </w:pPr>
-            <w:r>
-              <w:rPr>
-                <w:rFonts w:ascii="Microsoft YaHei" w:hAnsi="Microsoft YaHei" w:eastAsia="Microsoft YaHei"/>
-                <w:b w:val="0"/>
-                <w:color w:val="333333"/>
-                <w:sz w:val="16"/>
-              </w:rPr>
-              <w:t>0.218%</w:t>
-            </w:r>
-          </w:p>
-        </w:tc>
-        <w:tc>
-          <w:tcPr>
-            <w:tcW w:type="dxa" w:w="1441"/>
-            <w:shd w:fill="FFFFFF" w:val="clear"/>
-          </w:tcPr>
-          <w:p>
-            <w:pPr>
-              <w:spacing w:before="20" w:after="20"/>
-              <w:jc w:val="center"/>
-            </w:pPr>
-            <w:r>
-              <w:rPr>
-                <w:rFonts w:ascii="Microsoft YaHei" w:hAnsi="Microsoft YaHei" w:eastAsia="Microsoft YaHei"/>
-                <w:b w:val="0"/>
-                <w:color w:val="333333"/>
-                <w:sz w:val="16"/>
-              </w:rPr>
-              <w:t>59.1%</w:t>
-            </w:r>
-          </w:p>
-        </w:tc>
-        <w:tc>
-          <w:tcPr>
-            <w:tcW w:type="dxa" w:w="1441"/>
-            <w:shd w:fill="FFFFFF" w:val="clear"/>
-          </w:tcPr>
-          <w:p>
-            <w:pPr>
-              <w:spacing w:before="20" w:after="20"/>
-              <w:jc w:val="center"/>
-            </w:pPr>
-            <w:r>
-              <w:rPr>
-                <w:rFonts w:ascii="Microsoft YaHei" w:hAnsi="Microsoft YaHei" w:eastAsia="Microsoft YaHei"/>
-                <w:b w:val="0"/>
-                <w:color w:val="333333"/>
-                <w:sz w:val="16"/>
-              </w:rPr>
-              <w:t>0.483%</w:t>
-            </w:r>
-          </w:p>
-        </w:tc>
-        <w:tc>
-          <w:tcPr>
-            <w:tcW w:type="dxa" w:w="1441"/>
-            <w:shd w:fill="FFFFFF" w:val="clear"/>
-          </w:tcPr>
-          <w:p>
-            <w:pPr>
-              <w:spacing w:before="20" w:after="20"/>
-              <w:jc w:val="center"/>
-            </w:pPr>
-            <w:r>
-              <w:rPr>
-                <w:rFonts w:ascii="Microsoft YaHei" w:hAnsi="Microsoft YaHei" w:eastAsia="Microsoft YaHei"/>
-                <w:b w:val="0"/>
-                <w:color w:val="333333"/>
-                <w:sz w:val="16"/>
-              </w:rPr>
-              <w:t>65.9%</w:t>
+            <w:tcW w:type="dxa" w:w="1235"/>
+            <w:shd w:fill="FFFFFF" w:val="clear"/>
+          </w:tcPr>
+          <w:p>
+            <w:pPr>
+              <w:spacing w:before="20" w:after="20"/>
+              <w:jc w:val="center"/>
+            </w:pPr>
+            <w:r>
+              <w:rPr>
+                <w:rFonts w:ascii="Microsoft YaHei" w:hAnsi="Microsoft YaHei" w:eastAsia="Microsoft YaHei"/>
+                <w:b w:val="0"/>
+                <w:color w:val="333333"/>
+                <w:sz w:val="16"/>
+              </w:rPr>
+              <w:t>UDPSX</w:t>
+            </w:r>
+          </w:p>
+        </w:tc>
+        <w:tc>
+          <w:tcPr>
+            <w:tcW w:type="dxa" w:w="1235"/>
+            <w:shd w:fill="FFFFFF" w:val="clear"/>
+          </w:tcPr>
+          <w:p>
+            <w:pPr>
+              <w:spacing w:before="20" w:after="20"/>
+              <w:jc w:val="center"/>
+            </w:pPr>
+            <w:r>
+              <w:rPr>
+                <w:rFonts w:ascii="Microsoft YaHei" w:hAnsi="Microsoft YaHei" w:eastAsia="Microsoft YaHei"/>
+                <w:b w:val="0"/>
+                <w:color w:val="333333"/>
+                <w:sz w:val="16"/>
+              </w:rPr>
+              <w:t>QQQ&lt;=-1% 且 VIX5d&gt;0，买基金第二天</w:t>
+            </w:r>
+          </w:p>
+        </w:tc>
+        <w:tc>
+          <w:tcPr>
+            <w:tcW w:type="dxa" w:w="1235"/>
+            <w:shd w:fill="FFFFFF" w:val="clear"/>
+          </w:tcPr>
+          <w:p>
+            <w:pPr>
+              <w:spacing w:before="20" w:after="20"/>
+              <w:jc w:val="center"/>
+            </w:pPr>
+            <w:r>
+              <w:rPr>
+                <w:rFonts w:ascii="Microsoft YaHei" w:hAnsi="Microsoft YaHei" w:eastAsia="Microsoft YaHei"/>
+                <w:b w:val="0"/>
+                <w:color w:val="333333"/>
+                <w:sz w:val="16"/>
+              </w:rPr>
+              <w:t>0.205%</w:t>
+            </w:r>
+          </w:p>
+        </w:tc>
+        <w:tc>
+          <w:tcPr>
+            <w:tcW w:type="dxa" w:w="1235"/>
+            <w:shd w:fill="FFFFFF" w:val="clear"/>
+          </w:tcPr>
+          <w:p>
+            <w:pPr>
+              <w:spacing w:before="20" w:after="20"/>
+              <w:jc w:val="center"/>
+            </w:pPr>
+            <w:r>
+              <w:rPr>
+                <w:rFonts w:ascii="Microsoft YaHei" w:hAnsi="Microsoft YaHei" w:eastAsia="Microsoft YaHei"/>
+                <w:b w:val="0"/>
+                <w:color w:val="333333"/>
+                <w:sz w:val="16"/>
+              </w:rPr>
+              <w:t>57.3%</w:t>
+            </w:r>
+          </w:p>
+        </w:tc>
+        <w:tc>
+          <w:tcPr>
+            <w:tcW w:type="dxa" w:w="1235"/>
+            <w:shd w:fill="FFFFFF" w:val="clear"/>
+          </w:tcPr>
+          <w:p>
+            <w:pPr>
+              <w:spacing w:before="20" w:after="20"/>
+              <w:jc w:val="center"/>
+            </w:pPr>
+            <w:r>
+              <w:rPr>
+                <w:rFonts w:ascii="Microsoft YaHei" w:hAnsi="Microsoft YaHei" w:eastAsia="Microsoft YaHei"/>
+                <w:b w:val="0"/>
+                <w:color w:val="333333"/>
+                <w:sz w:val="16"/>
+              </w:rPr>
+              <w:t>0.536%</w:t>
+            </w:r>
+          </w:p>
+        </w:tc>
+        <w:tc>
+          <w:tcPr>
+            <w:tcW w:type="dxa" w:w="1235"/>
+            <w:shd w:fill="FFFFFF" w:val="clear"/>
+          </w:tcPr>
+          <w:p>
+            <w:pPr>
+              <w:spacing w:before="20" w:after="20"/>
+              <w:jc w:val="center"/>
+            </w:pPr>
+            <w:r>
+              <w:rPr>
+                <w:rFonts w:ascii="Microsoft YaHei" w:hAnsi="Microsoft YaHei" w:eastAsia="Microsoft YaHei"/>
+                <w:b w:val="0"/>
+                <w:color w:val="333333"/>
+                <w:sz w:val="16"/>
+              </w:rPr>
+              <w:t>67.9%</w:t>
+            </w:r>
+          </w:p>
+        </w:tc>
+        <w:tc>
+          <w:tcPr>
+            <w:tcW w:type="dxa" w:w="1235"/>
+            <w:shd w:fill="FFFFFF" w:val="clear"/>
+          </w:tcPr>
+          <w:p>
+            <w:pPr>
+              <w:spacing w:before="20" w:after="20"/>
+              <w:jc w:val="center"/>
+            </w:pPr>
+            <w:r>
+              <w:rPr>
+                <w:rFonts w:ascii="Microsoft YaHei" w:hAnsi="Microsoft YaHei" w:eastAsia="Microsoft YaHei"/>
+                <w:b w:val="0"/>
+                <w:color w:val="333333"/>
+                <w:sz w:val="16"/>
+              </w:rPr>
+              <w:t>全历史弱且波动高，2025后改善明显，按观察处理</w:t>
             </w:r>
           </w:p>
         </w:tc>
@@ -3938,7 +3683,7 @@
       <w:tr>
         <w:tc>
           <w:tcPr>
-            <w:tcW w:type="dxa" w:w="1441"/>
+            <w:tcW w:type="dxa" w:w="1235"/>
             <w:shd w:fill="E6E6E6" w:val="clear"/>
           </w:tcPr>
           <w:p>
@@ -3953,13 +3698,13 @@
                 <w:color w:val="333333"/>
                 <w:sz w:val="16"/>
               </w:rPr>
-              <w:t>IDPSX</w:t>
-            </w:r>
-          </w:p>
-        </w:tc>
-        <w:tc>
-          <w:tcPr>
-            <w:tcW w:type="dxa" w:w="1441"/>
+              <w:t>UIPSX</w:t>
+            </w:r>
+          </w:p>
+        </w:tc>
+        <w:tc>
+          <w:tcPr>
+            <w:tcW w:type="dxa" w:w="1235"/>
             <w:shd w:fill="E6E6E6" w:val="clear"/>
           </w:tcPr>
           <w:p>
@@ -3974,13 +3719,13 @@
                 <w:color w:val="333333"/>
                 <w:sz w:val="16"/>
               </w:rPr>
-              <w:t>SPY&lt;0 且 美元/黄金&lt;=-1.0%，买基金第二天</w:t>
-            </w:r>
-          </w:p>
-        </w:tc>
-        <w:tc>
-          <w:tcPr>
-            <w:tcW w:type="dxa" w:w="1441"/>
+              <w:t>FXY&lt;0 且 GLD&gt;0 且 XLC&gt;0，买基金后2日平均回报</w:t>
+            </w:r>
+          </w:p>
+        </w:tc>
+        <w:tc>
+          <w:tcPr>
+            <w:tcW w:type="dxa" w:w="1235"/>
             <w:shd w:fill="E6E6E6" w:val="clear"/>
           </w:tcPr>
           <w:p>
@@ -3995,13 +3740,13 @@
                 <w:color w:val="333333"/>
                 <w:sz w:val="16"/>
               </w:rPr>
-              <w:t>0.248%</w:t>
-            </w:r>
-          </w:p>
-        </w:tc>
-        <w:tc>
-          <w:tcPr>
-            <w:tcW w:type="dxa" w:w="1441"/>
+              <w:t>0.235%</w:t>
+            </w:r>
+          </w:p>
+        </w:tc>
+        <w:tc>
+          <w:tcPr>
+            <w:tcW w:type="dxa" w:w="1235"/>
             <w:shd w:fill="E6E6E6" w:val="clear"/>
           </w:tcPr>
           <w:p>
@@ -4016,13 +3761,13 @@
                 <w:color w:val="333333"/>
                 <w:sz w:val="16"/>
               </w:rPr>
-              <w:t>58.8%</w:t>
-            </w:r>
-          </w:p>
-        </w:tc>
-        <w:tc>
-          <w:tcPr>
-            <w:tcW w:type="dxa" w:w="1441"/>
+              <w:t>55.6%</w:t>
+            </w:r>
+          </w:p>
+        </w:tc>
+        <w:tc>
+          <w:tcPr>
+            <w:tcW w:type="dxa" w:w="1235"/>
             <w:shd w:fill="E6E6E6" w:val="clear"/>
           </w:tcPr>
           <w:p>
@@ -4037,13 +3782,13 @@
                 <w:color w:val="333333"/>
                 <w:sz w:val="16"/>
               </w:rPr>
-              <w:t>0.606%</w:t>
-            </w:r>
-          </w:p>
-        </w:tc>
-        <w:tc>
-          <w:tcPr>
-            <w:tcW w:type="dxa" w:w="1441"/>
+              <w:t>0.526%</w:t>
+            </w:r>
+          </w:p>
+        </w:tc>
+        <w:tc>
+          <w:tcPr>
+            <w:tcW w:type="dxa" w:w="1235"/>
             <w:shd w:fill="E6E6E6" w:val="clear"/>
           </w:tcPr>
           <w:p>
@@ -4058,7 +3803,28 @@
                 <w:color w:val="333333"/>
                 <w:sz w:val="16"/>
               </w:rPr>
-              <w:t>62.8%</w:t>
+              <w:t>60.5%</w:t>
+            </w:r>
+          </w:p>
+        </w:tc>
+        <w:tc>
+          <w:tcPr>
+            <w:tcW w:type="dxa" w:w="1235"/>
+            <w:shd w:fill="E6E6E6" w:val="clear"/>
+          </w:tcPr>
+          <w:p>
+            <w:pPr>
+              <w:spacing w:before="20" w:after="20"/>
+              <w:jc w:val="center"/>
+            </w:pPr>
+            <w:r>
+              <w:rPr>
+                <w:rFonts w:ascii="Microsoft YaHei" w:hAnsi="Microsoft YaHei" w:eastAsia="Microsoft YaHei"/>
+                <w:b w:val="0"/>
+                <w:color w:val="333333"/>
+                <w:sz w:val="16"/>
+              </w:rPr>
+              <w:t>全历史弱，2025后改善明显，按观察处理</w:t>
             </w:r>
           </w:p>
         </w:tc>
@@ -4066,127 +3832,148 @@
       <w:tr>
         <w:tc>
           <w:tcPr>
-            <w:tcW w:type="dxa" w:w="1441"/>
-            <w:shd w:fill="FFFFFF" w:val="clear"/>
-          </w:tcPr>
-          <w:p>
-            <w:pPr>
-              <w:spacing w:before="20" w:after="20"/>
-              <w:jc w:val="center"/>
-            </w:pPr>
-            <w:r>
-              <w:rPr>
-                <w:rFonts w:ascii="Microsoft YaHei" w:hAnsi="Microsoft YaHei" w:eastAsia="Microsoft YaHei"/>
-                <w:b w:val="0"/>
-                <w:color w:val="333333"/>
-                <w:sz w:val="16"/>
-              </w:rPr>
-              <w:t>OEPIX</w:t>
-            </w:r>
-          </w:p>
-        </w:tc>
-        <w:tc>
-          <w:tcPr>
-            <w:tcW w:type="dxa" w:w="1441"/>
-            <w:shd w:fill="FFFFFF" w:val="clear"/>
-          </w:tcPr>
-          <w:p>
-            <w:pPr>
-              <w:spacing w:before="20" w:after="20"/>
-              <w:jc w:val="center"/>
-            </w:pPr>
-            <w:r>
-              <w:rPr>
-                <w:rFonts w:ascii="Microsoft YaHei" w:hAnsi="Microsoft YaHei" w:eastAsia="Microsoft YaHei"/>
-                <w:b w:val="0"/>
-                <w:color w:val="333333"/>
-                <w:sz w:val="16"/>
-              </w:rPr>
-              <w:t>XLU&lt;=-1% 且 VIX收盘&gt;0，买基金后3日平均回报</w:t>
-            </w:r>
-          </w:p>
-        </w:tc>
-        <w:tc>
-          <w:tcPr>
-            <w:tcW w:type="dxa" w:w="1441"/>
-            <w:shd w:fill="FFFFFF" w:val="clear"/>
-          </w:tcPr>
-          <w:p>
-            <w:pPr>
-              <w:spacing w:before="20" w:after="20"/>
-              <w:jc w:val="center"/>
-            </w:pPr>
-            <w:r>
-              <w:rPr>
-                <w:rFonts w:ascii="Microsoft YaHei" w:hAnsi="Microsoft YaHei" w:eastAsia="Microsoft YaHei"/>
-                <w:b w:val="0"/>
-                <w:color w:val="333333"/>
-                <w:sz w:val="16"/>
-              </w:rPr>
-              <w:t>0.317%</w:t>
-            </w:r>
-          </w:p>
-        </w:tc>
-        <w:tc>
-          <w:tcPr>
-            <w:tcW w:type="dxa" w:w="1441"/>
-            <w:shd w:fill="FFFFFF" w:val="clear"/>
-          </w:tcPr>
-          <w:p>
-            <w:pPr>
-              <w:spacing w:before="20" w:after="20"/>
-              <w:jc w:val="center"/>
-            </w:pPr>
-            <w:r>
-              <w:rPr>
-                <w:rFonts w:ascii="Microsoft YaHei" w:hAnsi="Microsoft YaHei" w:eastAsia="Microsoft YaHei"/>
-                <w:b w:val="0"/>
-                <w:color w:val="333333"/>
-                <w:sz w:val="16"/>
-              </w:rPr>
-              <w:t>55.0%</w:t>
-            </w:r>
-          </w:p>
-        </w:tc>
-        <w:tc>
-          <w:tcPr>
-            <w:tcW w:type="dxa" w:w="1441"/>
-            <w:shd w:fill="FFFFFF" w:val="clear"/>
-          </w:tcPr>
-          <w:p>
-            <w:pPr>
-              <w:spacing w:before="20" w:after="20"/>
-              <w:jc w:val="center"/>
-            </w:pPr>
-            <w:r>
-              <w:rPr>
-                <w:rFonts w:ascii="Microsoft YaHei" w:hAnsi="Microsoft YaHei" w:eastAsia="Microsoft YaHei"/>
-                <w:b w:val="0"/>
-                <w:color w:val="333333"/>
-                <w:sz w:val="16"/>
-              </w:rPr>
-              <w:t>0.610%</w:t>
-            </w:r>
-          </w:p>
-        </w:tc>
-        <w:tc>
-          <w:tcPr>
-            <w:tcW w:type="dxa" w:w="1441"/>
-            <w:shd w:fill="FFFFFF" w:val="clear"/>
-          </w:tcPr>
-          <w:p>
-            <w:pPr>
-              <w:spacing w:before="20" w:after="20"/>
-              <w:jc w:val="center"/>
-            </w:pPr>
-            <w:r>
-              <w:rPr>
-                <w:rFonts w:ascii="Microsoft YaHei" w:hAnsi="Microsoft YaHei" w:eastAsia="Microsoft YaHei"/>
-                <w:b w:val="0"/>
-                <w:color w:val="333333"/>
-                <w:sz w:val="16"/>
-              </w:rPr>
-              <w:t>65.4%</w:t>
+            <w:tcW w:type="dxa" w:w="1235"/>
+            <w:shd w:fill="FFFFFF" w:val="clear"/>
+          </w:tcPr>
+          <w:p>
+            <w:pPr>
+              <w:spacing w:before="20" w:after="20"/>
+              <w:jc w:val="center"/>
+            </w:pPr>
+            <w:r>
+              <w:rPr>
+                <w:rFonts w:ascii="Microsoft YaHei" w:hAnsi="Microsoft YaHei" w:eastAsia="Microsoft YaHei"/>
+                <w:b w:val="0"/>
+                <w:color w:val="333333"/>
+                <w:sz w:val="16"/>
+              </w:rPr>
+              <w:t>CYPSX</w:t>
+            </w:r>
+          </w:p>
+        </w:tc>
+        <w:tc>
+          <w:tcPr>
+            <w:tcW w:type="dxa" w:w="1235"/>
+            <w:shd w:fill="FFFFFF" w:val="clear"/>
+          </w:tcPr>
+          <w:p>
+            <w:pPr>
+              <w:spacing w:before="20" w:after="20"/>
+              <w:jc w:val="center"/>
+            </w:pPr>
+            <w:r>
+              <w:rPr>
+                <w:rFonts w:ascii="Microsoft YaHei" w:hAnsi="Microsoft YaHei" w:eastAsia="Microsoft YaHei"/>
+                <w:b w:val="0"/>
+                <w:color w:val="333333"/>
+                <w:sz w:val="16"/>
+              </w:rPr>
+              <w:t>EEM&lt;0 且 SLV&gt;0 且 XLF&lt;0，买基金第二天</w:t>
+            </w:r>
+          </w:p>
+        </w:tc>
+        <w:tc>
+          <w:tcPr>
+            <w:tcW w:type="dxa" w:w="1235"/>
+            <w:shd w:fill="FFFFFF" w:val="clear"/>
+          </w:tcPr>
+          <w:p>
+            <w:pPr>
+              <w:spacing w:before="20" w:after="20"/>
+              <w:jc w:val="center"/>
+            </w:pPr>
+            <w:r>
+              <w:rPr>
+                <w:rFonts w:ascii="Microsoft YaHei" w:hAnsi="Microsoft YaHei" w:eastAsia="Microsoft YaHei"/>
+                <w:b w:val="0"/>
+                <w:color w:val="333333"/>
+                <w:sz w:val="16"/>
+              </w:rPr>
+              <w:t>0.218%</w:t>
+            </w:r>
+          </w:p>
+        </w:tc>
+        <w:tc>
+          <w:tcPr>
+            <w:tcW w:type="dxa" w:w="1235"/>
+            <w:shd w:fill="FFFFFF" w:val="clear"/>
+          </w:tcPr>
+          <w:p>
+            <w:pPr>
+              <w:spacing w:before="20" w:after="20"/>
+              <w:jc w:val="center"/>
+            </w:pPr>
+            <w:r>
+              <w:rPr>
+                <w:rFonts w:ascii="Microsoft YaHei" w:hAnsi="Microsoft YaHei" w:eastAsia="Microsoft YaHei"/>
+                <w:b w:val="0"/>
+                <w:color w:val="333333"/>
+                <w:sz w:val="16"/>
+              </w:rPr>
+              <w:t>59.1%</w:t>
+            </w:r>
+          </w:p>
+        </w:tc>
+        <w:tc>
+          <w:tcPr>
+            <w:tcW w:type="dxa" w:w="1235"/>
+            <w:shd w:fill="FFFFFF" w:val="clear"/>
+          </w:tcPr>
+          <w:p>
+            <w:pPr>
+              <w:spacing w:before="20" w:after="20"/>
+              <w:jc w:val="center"/>
+            </w:pPr>
+            <w:r>
+              <w:rPr>
+                <w:rFonts w:ascii="Microsoft YaHei" w:hAnsi="Microsoft YaHei" w:eastAsia="Microsoft YaHei"/>
+                <w:b w:val="0"/>
+                <w:color w:val="333333"/>
+                <w:sz w:val="16"/>
+              </w:rPr>
+              <w:t>0.483%</w:t>
+            </w:r>
+          </w:p>
+        </w:tc>
+        <w:tc>
+          <w:tcPr>
+            <w:tcW w:type="dxa" w:w="1235"/>
+            <w:shd w:fill="FFFFFF" w:val="clear"/>
+          </w:tcPr>
+          <w:p>
+            <w:pPr>
+              <w:spacing w:before="20" w:after="20"/>
+              <w:jc w:val="center"/>
+            </w:pPr>
+            <w:r>
+              <w:rPr>
+                <w:rFonts w:ascii="Microsoft YaHei" w:hAnsi="Microsoft YaHei" w:eastAsia="Microsoft YaHei"/>
+                <w:b w:val="0"/>
+                <w:color w:val="333333"/>
+                <w:sz w:val="16"/>
+              </w:rPr>
+              <w:t>65.9%</w:t>
+            </w:r>
+          </w:p>
+        </w:tc>
+        <w:tc>
+          <w:tcPr>
+            <w:tcW w:type="dxa" w:w="1235"/>
+            <w:shd w:fill="FFFFFF" w:val="clear"/>
+          </w:tcPr>
+          <w:p>
+            <w:pPr>
+              <w:spacing w:before="20" w:after="20"/>
+              <w:jc w:val="center"/>
+            </w:pPr>
+            <w:r>
+              <w:rPr>
+                <w:rFonts w:ascii="Microsoft YaHei" w:hAnsi="Microsoft YaHei" w:eastAsia="Microsoft YaHei"/>
+                <w:b w:val="0"/>
+                <w:color w:val="333333"/>
+                <w:sz w:val="16"/>
+              </w:rPr>
+              <w:t>2025后明显改善</w:t>
             </w:r>
           </w:p>
         </w:tc>
@@ -4194,7 +3981,7 @@
       <w:tr>
         <w:tc>
           <w:tcPr>
-            <w:tcW w:type="dxa" w:w="1441"/>
+            <w:tcW w:type="dxa" w:w="1235"/>
             <w:shd w:fill="E6E6E6" w:val="clear"/>
           </w:tcPr>
           <w:p>
@@ -4209,13 +3996,13 @@
                 <w:color w:val="333333"/>
                 <w:sz w:val="16"/>
               </w:rPr>
-              <w:t>SGPIX</w:t>
-            </w:r>
-          </w:p>
-        </w:tc>
-        <w:tc>
-          <w:tcPr>
-            <w:tcW w:type="dxa" w:w="1441"/>
+              <w:t>IDPSX</w:t>
+            </w:r>
+          </w:p>
+        </w:tc>
+        <w:tc>
+          <w:tcPr>
+            <w:tcW w:type="dxa" w:w="1235"/>
             <w:shd w:fill="E6E6E6" w:val="clear"/>
           </w:tcPr>
           <w:p>
@@ -4230,13 +4017,13 @@
                 <w:color w:val="333333"/>
                 <w:sz w:val="16"/>
               </w:rPr>
-              <w:t>GDX&gt;0 且 XLC&lt;0 且 XLK&lt;0，买基金第二天</w:t>
-            </w:r>
-          </w:p>
-        </w:tc>
-        <w:tc>
-          <w:tcPr>
-            <w:tcW w:type="dxa" w:w="1441"/>
+              <w:t>SPY&lt;0 且 美元/黄金&lt;=-1.0%，买基金第二天</w:t>
+            </w:r>
+          </w:p>
+        </w:tc>
+        <w:tc>
+          <w:tcPr>
+            <w:tcW w:type="dxa" w:w="1235"/>
             <w:shd w:fill="E6E6E6" w:val="clear"/>
           </w:tcPr>
           <w:p>
@@ -4251,13 +4038,13 @@
                 <w:color w:val="333333"/>
                 <w:sz w:val="16"/>
               </w:rPr>
-              <w:t>0.211%</w:t>
-            </w:r>
-          </w:p>
-        </w:tc>
-        <w:tc>
-          <w:tcPr>
-            <w:tcW w:type="dxa" w:w="1441"/>
+              <w:t>0.248%</w:t>
+            </w:r>
+          </w:p>
+        </w:tc>
+        <w:tc>
+          <w:tcPr>
+            <w:tcW w:type="dxa" w:w="1235"/>
             <w:shd w:fill="E6E6E6" w:val="clear"/>
           </w:tcPr>
           <w:p>
@@ -4272,13 +4059,13 @@
                 <w:color w:val="333333"/>
                 <w:sz w:val="16"/>
               </w:rPr>
-              <w:t>55.2%</w:t>
-            </w:r>
-          </w:p>
-        </w:tc>
-        <w:tc>
-          <w:tcPr>
-            <w:tcW w:type="dxa" w:w="1441"/>
+              <w:t>58.8%</w:t>
+            </w:r>
+          </w:p>
+        </w:tc>
+        <w:tc>
+          <w:tcPr>
+            <w:tcW w:type="dxa" w:w="1235"/>
             <w:shd w:fill="E6E6E6" w:val="clear"/>
           </w:tcPr>
           <w:p>
@@ -4293,13 +4080,13 @@
                 <w:color w:val="333333"/>
                 <w:sz w:val="16"/>
               </w:rPr>
-              <w:t>0.605%</w:t>
-            </w:r>
-          </w:p>
-        </w:tc>
-        <w:tc>
-          <w:tcPr>
-            <w:tcW w:type="dxa" w:w="1441"/>
+              <w:t>0.606%</w:t>
+            </w:r>
+          </w:p>
+        </w:tc>
+        <w:tc>
+          <w:tcPr>
+            <w:tcW w:type="dxa" w:w="1235"/>
             <w:shd w:fill="E6E6E6" w:val="clear"/>
           </w:tcPr>
           <w:p>
@@ -4314,7 +4101,28 @@
                 <w:color w:val="333333"/>
                 <w:sz w:val="16"/>
               </w:rPr>
-              <w:t>66.7%</w:t>
+              <w:t>62.8%</w:t>
+            </w:r>
+          </w:p>
+        </w:tc>
+        <w:tc>
+          <w:tcPr>
+            <w:tcW w:type="dxa" w:w="1235"/>
+            <w:shd w:fill="E6E6E6" w:val="clear"/>
+          </w:tcPr>
+          <w:p>
+            <w:pPr>
+              <w:spacing w:before="20" w:after="20"/>
+              <w:jc w:val="center"/>
+            </w:pPr>
+            <w:r>
+              <w:rPr>
+                <w:rFonts w:ascii="Microsoft YaHei" w:hAnsi="Microsoft YaHei" w:eastAsia="Microsoft YaHei"/>
+                <w:b w:val="0"/>
+                <w:color w:val="333333"/>
+                <w:sz w:val="16"/>
+              </w:rPr>
+              <w:t>2025后明显改善</w:t>
             </w:r>
           </w:p>
         </w:tc>
@@ -4322,127 +4130,148 @@
       <w:tr>
         <w:tc>
           <w:tcPr>
-            <w:tcW w:type="dxa" w:w="1441"/>
-            <w:shd w:fill="FFFFFF" w:val="clear"/>
-          </w:tcPr>
-          <w:p>
-            <w:pPr>
-              <w:spacing w:before="20" w:after="20"/>
-              <w:jc w:val="center"/>
-            </w:pPr>
-            <w:r>
-              <w:rPr>
-                <w:rFonts w:ascii="Microsoft YaHei" w:hAnsi="Microsoft YaHei" w:eastAsia="Microsoft YaHei"/>
-                <w:b w:val="0"/>
-                <w:color w:val="333333"/>
-                <w:sz w:val="16"/>
-              </w:rPr>
-              <w:t>SVPIX</w:t>
-            </w:r>
-          </w:p>
-        </w:tc>
-        <w:tc>
-          <w:tcPr>
-            <w:tcW w:type="dxa" w:w="1441"/>
-            <w:shd w:fill="FFFFFF" w:val="clear"/>
-          </w:tcPr>
-          <w:p>
-            <w:pPr>
-              <w:spacing w:before="20" w:after="20"/>
-              <w:jc w:val="center"/>
-            </w:pPr>
-            <w:r>
-              <w:rPr>
-                <w:rFonts w:ascii="Microsoft YaHei" w:hAnsi="Microsoft YaHei" w:eastAsia="Microsoft YaHei"/>
-                <w:b w:val="0"/>
-                <w:color w:val="333333"/>
-                <w:sz w:val="16"/>
-              </w:rPr>
-              <w:t>SLV&gt;0 且 SPY&lt;0 且 TIP&gt;0，买基金第二天</w:t>
-            </w:r>
-          </w:p>
-        </w:tc>
-        <w:tc>
-          <w:tcPr>
-            <w:tcW w:type="dxa" w:w="1441"/>
-            <w:shd w:fill="FFFFFF" w:val="clear"/>
-          </w:tcPr>
-          <w:p>
-            <w:pPr>
-              <w:spacing w:before="20" w:after="20"/>
-              <w:jc w:val="center"/>
-            </w:pPr>
-            <w:r>
-              <w:rPr>
-                <w:rFonts w:ascii="Microsoft YaHei" w:hAnsi="Microsoft YaHei" w:eastAsia="Microsoft YaHei"/>
-                <w:b w:val="0"/>
-                <w:color w:val="333333"/>
-                <w:sz w:val="16"/>
-              </w:rPr>
-              <w:t>0.205%</w:t>
-            </w:r>
-          </w:p>
-        </w:tc>
-        <w:tc>
-          <w:tcPr>
-            <w:tcW w:type="dxa" w:w="1441"/>
-            <w:shd w:fill="FFFFFF" w:val="clear"/>
-          </w:tcPr>
-          <w:p>
-            <w:pPr>
-              <w:spacing w:before="20" w:after="20"/>
-              <w:jc w:val="center"/>
-            </w:pPr>
-            <w:r>
-              <w:rPr>
-                <w:rFonts w:ascii="Microsoft YaHei" w:hAnsi="Microsoft YaHei" w:eastAsia="Microsoft YaHei"/>
-                <w:b w:val="0"/>
-                <w:color w:val="333333"/>
-                <w:sz w:val="16"/>
-              </w:rPr>
-              <w:t>55.7%</w:t>
-            </w:r>
-          </w:p>
-        </w:tc>
-        <w:tc>
-          <w:tcPr>
-            <w:tcW w:type="dxa" w:w="1441"/>
-            <w:shd w:fill="FFFFFF" w:val="clear"/>
-          </w:tcPr>
-          <w:p>
-            <w:pPr>
-              <w:spacing w:before="20" w:after="20"/>
-              <w:jc w:val="center"/>
-            </w:pPr>
-            <w:r>
-              <w:rPr>
-                <w:rFonts w:ascii="Microsoft YaHei" w:hAnsi="Microsoft YaHei" w:eastAsia="Microsoft YaHei"/>
-                <w:b w:val="0"/>
-                <w:color w:val="333333"/>
-                <w:sz w:val="16"/>
-              </w:rPr>
-              <w:t>0.596%</w:t>
-            </w:r>
-          </w:p>
-        </w:tc>
-        <w:tc>
-          <w:tcPr>
-            <w:tcW w:type="dxa" w:w="1441"/>
-            <w:shd w:fill="FFFFFF" w:val="clear"/>
-          </w:tcPr>
-          <w:p>
-            <w:pPr>
-              <w:spacing w:before="20" w:after="20"/>
-              <w:jc w:val="center"/>
-            </w:pPr>
-            <w:r>
-              <w:rPr>
-                <w:rFonts w:ascii="Microsoft YaHei" w:hAnsi="Microsoft YaHei" w:eastAsia="Microsoft YaHei"/>
-                <w:b w:val="0"/>
-                <w:color w:val="333333"/>
-                <w:sz w:val="16"/>
-              </w:rPr>
-              <w:t>67.5%</w:t>
+            <w:tcW w:type="dxa" w:w="1235"/>
+            <w:shd w:fill="FFFFFF" w:val="clear"/>
+          </w:tcPr>
+          <w:p>
+            <w:pPr>
+              <w:spacing w:before="20" w:after="20"/>
+              <w:jc w:val="center"/>
+            </w:pPr>
+            <w:r>
+              <w:rPr>
+                <w:rFonts w:ascii="Microsoft YaHei" w:hAnsi="Microsoft YaHei" w:eastAsia="Microsoft YaHei"/>
+                <w:b w:val="0"/>
+                <w:color w:val="333333"/>
+                <w:sz w:val="16"/>
+              </w:rPr>
+              <w:t>OEPIX</w:t>
+            </w:r>
+          </w:p>
+        </w:tc>
+        <w:tc>
+          <w:tcPr>
+            <w:tcW w:type="dxa" w:w="1235"/>
+            <w:shd w:fill="FFFFFF" w:val="clear"/>
+          </w:tcPr>
+          <w:p>
+            <w:pPr>
+              <w:spacing w:before="20" w:after="20"/>
+              <w:jc w:val="center"/>
+            </w:pPr>
+            <w:r>
+              <w:rPr>
+                <w:rFonts w:ascii="Microsoft YaHei" w:hAnsi="Microsoft YaHei" w:eastAsia="Microsoft YaHei"/>
+                <w:b w:val="0"/>
+                <w:color w:val="333333"/>
+                <w:sz w:val="16"/>
+              </w:rPr>
+              <w:t>XLU&lt;=-1% 且 VIX收盘&gt;0，买基金后3日平均回报</w:t>
+            </w:r>
+          </w:p>
+        </w:tc>
+        <w:tc>
+          <w:tcPr>
+            <w:tcW w:type="dxa" w:w="1235"/>
+            <w:shd w:fill="FFFFFF" w:val="clear"/>
+          </w:tcPr>
+          <w:p>
+            <w:pPr>
+              <w:spacing w:before="20" w:after="20"/>
+              <w:jc w:val="center"/>
+            </w:pPr>
+            <w:r>
+              <w:rPr>
+                <w:rFonts w:ascii="Microsoft YaHei" w:hAnsi="Microsoft YaHei" w:eastAsia="Microsoft YaHei"/>
+                <w:b w:val="0"/>
+                <w:color w:val="333333"/>
+                <w:sz w:val="16"/>
+              </w:rPr>
+              <w:t>0.317%</w:t>
+            </w:r>
+          </w:p>
+        </w:tc>
+        <w:tc>
+          <w:tcPr>
+            <w:tcW w:type="dxa" w:w="1235"/>
+            <w:shd w:fill="FFFFFF" w:val="clear"/>
+          </w:tcPr>
+          <w:p>
+            <w:pPr>
+              <w:spacing w:before="20" w:after="20"/>
+              <w:jc w:val="center"/>
+            </w:pPr>
+            <w:r>
+              <w:rPr>
+                <w:rFonts w:ascii="Microsoft YaHei" w:hAnsi="Microsoft YaHei" w:eastAsia="Microsoft YaHei"/>
+                <w:b w:val="0"/>
+                <w:color w:val="333333"/>
+                <w:sz w:val="16"/>
+              </w:rPr>
+              <w:t>55.0%</w:t>
+            </w:r>
+          </w:p>
+        </w:tc>
+        <w:tc>
+          <w:tcPr>
+            <w:tcW w:type="dxa" w:w="1235"/>
+            <w:shd w:fill="FFFFFF" w:val="clear"/>
+          </w:tcPr>
+          <w:p>
+            <w:pPr>
+              <w:spacing w:before="20" w:after="20"/>
+              <w:jc w:val="center"/>
+            </w:pPr>
+            <w:r>
+              <w:rPr>
+                <w:rFonts w:ascii="Microsoft YaHei" w:hAnsi="Microsoft YaHei" w:eastAsia="Microsoft YaHei"/>
+                <w:b w:val="0"/>
+                <w:color w:val="333333"/>
+                <w:sz w:val="16"/>
+              </w:rPr>
+              <w:t>0.610%</w:t>
+            </w:r>
+          </w:p>
+        </w:tc>
+        <w:tc>
+          <w:tcPr>
+            <w:tcW w:type="dxa" w:w="1235"/>
+            <w:shd w:fill="FFFFFF" w:val="clear"/>
+          </w:tcPr>
+          <w:p>
+            <w:pPr>
+              <w:spacing w:before="20" w:after="20"/>
+              <w:jc w:val="center"/>
+            </w:pPr>
+            <w:r>
+              <w:rPr>
+                <w:rFonts w:ascii="Microsoft YaHei" w:hAnsi="Microsoft YaHei" w:eastAsia="Microsoft YaHei"/>
+                <w:b w:val="0"/>
+                <w:color w:val="333333"/>
+                <w:sz w:val="16"/>
+              </w:rPr>
+              <w:t>65.4%</w:t>
+            </w:r>
+          </w:p>
+        </w:tc>
+        <w:tc>
+          <w:tcPr>
+            <w:tcW w:type="dxa" w:w="1235"/>
+            <w:shd w:fill="FFFFFF" w:val="clear"/>
+          </w:tcPr>
+          <w:p>
+            <w:pPr>
+              <w:spacing w:before="20" w:after="20"/>
+              <w:jc w:val="center"/>
+            </w:pPr>
+            <w:r>
+              <w:rPr>
+                <w:rFonts w:ascii="Microsoft YaHei" w:hAnsi="Microsoft YaHei" w:eastAsia="Microsoft YaHei"/>
+                <w:b w:val="0"/>
+                <w:color w:val="333333"/>
+                <w:sz w:val="16"/>
+              </w:rPr>
+              <w:t>2025后明显改善</w:t>
             </w:r>
           </w:p>
         </w:tc>
@@ -4450,7 +4279,7 @@
       <w:tr>
         <w:tc>
           <w:tcPr>
-            <w:tcW w:type="dxa" w:w="1441"/>
+            <w:tcW w:type="dxa" w:w="1235"/>
             <w:shd w:fill="E6E6E6" w:val="clear"/>
           </w:tcPr>
           <w:p>
@@ -4465,13 +4294,311 @@
                 <w:color w:val="333333"/>
                 <w:sz w:val="16"/>
               </w:rPr>
+              <w:t>SGPIX</w:t>
+            </w:r>
+          </w:p>
+        </w:tc>
+        <w:tc>
+          <w:tcPr>
+            <w:tcW w:type="dxa" w:w="1235"/>
+            <w:shd w:fill="E6E6E6" w:val="clear"/>
+          </w:tcPr>
+          <w:p>
+            <w:pPr>
+              <w:spacing w:before="20" w:after="20"/>
+              <w:jc w:val="center"/>
+            </w:pPr>
+            <w:r>
+              <w:rPr>
+                <w:rFonts w:ascii="Microsoft YaHei" w:hAnsi="Microsoft YaHei" w:eastAsia="Microsoft YaHei"/>
+                <w:b w:val="0"/>
+                <w:color w:val="333333"/>
+                <w:sz w:val="16"/>
+              </w:rPr>
+              <w:t>GDX&gt;0 且 XLC&lt;0 且 XLK&lt;0，买基金第二天</w:t>
+            </w:r>
+          </w:p>
+        </w:tc>
+        <w:tc>
+          <w:tcPr>
+            <w:tcW w:type="dxa" w:w="1235"/>
+            <w:shd w:fill="E6E6E6" w:val="clear"/>
+          </w:tcPr>
+          <w:p>
+            <w:pPr>
+              <w:spacing w:before="20" w:after="20"/>
+              <w:jc w:val="center"/>
+            </w:pPr>
+            <w:r>
+              <w:rPr>
+                <w:rFonts w:ascii="Microsoft YaHei" w:hAnsi="Microsoft YaHei" w:eastAsia="Microsoft YaHei"/>
+                <w:b w:val="0"/>
+                <w:color w:val="333333"/>
+                <w:sz w:val="16"/>
+              </w:rPr>
+              <w:t>0.211%</w:t>
+            </w:r>
+          </w:p>
+        </w:tc>
+        <w:tc>
+          <w:tcPr>
+            <w:tcW w:type="dxa" w:w="1235"/>
+            <w:shd w:fill="E6E6E6" w:val="clear"/>
+          </w:tcPr>
+          <w:p>
+            <w:pPr>
+              <w:spacing w:before="20" w:after="20"/>
+              <w:jc w:val="center"/>
+            </w:pPr>
+            <w:r>
+              <w:rPr>
+                <w:rFonts w:ascii="Microsoft YaHei" w:hAnsi="Microsoft YaHei" w:eastAsia="Microsoft YaHei"/>
+                <w:b w:val="0"/>
+                <w:color w:val="333333"/>
+                <w:sz w:val="16"/>
+              </w:rPr>
+              <w:t>55.2%</w:t>
+            </w:r>
+          </w:p>
+        </w:tc>
+        <w:tc>
+          <w:tcPr>
+            <w:tcW w:type="dxa" w:w="1235"/>
+            <w:shd w:fill="E6E6E6" w:val="clear"/>
+          </w:tcPr>
+          <w:p>
+            <w:pPr>
+              <w:spacing w:before="20" w:after="20"/>
+              <w:jc w:val="center"/>
+            </w:pPr>
+            <w:r>
+              <w:rPr>
+                <w:rFonts w:ascii="Microsoft YaHei" w:hAnsi="Microsoft YaHei" w:eastAsia="Microsoft YaHei"/>
+                <w:b w:val="0"/>
+                <w:color w:val="333333"/>
+                <w:sz w:val="16"/>
+              </w:rPr>
+              <w:t>0.605%</w:t>
+            </w:r>
+          </w:p>
+        </w:tc>
+        <w:tc>
+          <w:tcPr>
+            <w:tcW w:type="dxa" w:w="1235"/>
+            <w:shd w:fill="E6E6E6" w:val="clear"/>
+          </w:tcPr>
+          <w:p>
+            <w:pPr>
+              <w:spacing w:before="20" w:after="20"/>
+              <w:jc w:val="center"/>
+            </w:pPr>
+            <w:r>
+              <w:rPr>
+                <w:rFonts w:ascii="Microsoft YaHei" w:hAnsi="Microsoft YaHei" w:eastAsia="Microsoft YaHei"/>
+                <w:b w:val="0"/>
+                <w:color w:val="333333"/>
+                <w:sz w:val="16"/>
+              </w:rPr>
+              <w:t>66.7%</w:t>
+            </w:r>
+          </w:p>
+        </w:tc>
+        <w:tc>
+          <w:tcPr>
+            <w:tcW w:type="dxa" w:w="1235"/>
+            <w:shd w:fill="E6E6E6" w:val="clear"/>
+          </w:tcPr>
+          <w:p>
+            <w:pPr>
+              <w:spacing w:before="20" w:after="20"/>
+              <w:jc w:val="center"/>
+            </w:pPr>
+            <w:r>
+              <w:rPr>
+                <w:rFonts w:ascii="Microsoft YaHei" w:hAnsi="Microsoft YaHei" w:eastAsia="Microsoft YaHei"/>
+                <w:b w:val="0"/>
+                <w:color w:val="333333"/>
+                <w:sz w:val="16"/>
+              </w:rPr>
+              <w:t>2025后明显改善</w:t>
+            </w:r>
+          </w:p>
+        </w:tc>
+      </w:tr>
+      <w:tr>
+        <w:tc>
+          <w:tcPr>
+            <w:tcW w:type="dxa" w:w="1235"/>
+            <w:shd w:fill="FFFFFF" w:val="clear"/>
+          </w:tcPr>
+          <w:p>
+            <w:pPr>
+              <w:spacing w:before="20" w:after="20"/>
+              <w:jc w:val="center"/>
+            </w:pPr>
+            <w:r>
+              <w:rPr>
+                <w:rFonts w:ascii="Microsoft YaHei" w:hAnsi="Microsoft YaHei" w:eastAsia="Microsoft YaHei"/>
+                <w:b w:val="0"/>
+                <w:color w:val="333333"/>
+                <w:sz w:val="16"/>
+              </w:rPr>
+              <w:t>SVPIX</w:t>
+            </w:r>
+          </w:p>
+        </w:tc>
+        <w:tc>
+          <w:tcPr>
+            <w:tcW w:type="dxa" w:w="1235"/>
+            <w:shd w:fill="FFFFFF" w:val="clear"/>
+          </w:tcPr>
+          <w:p>
+            <w:pPr>
+              <w:spacing w:before="20" w:after="20"/>
+              <w:jc w:val="center"/>
+            </w:pPr>
+            <w:r>
+              <w:rPr>
+                <w:rFonts w:ascii="Microsoft YaHei" w:hAnsi="Microsoft YaHei" w:eastAsia="Microsoft YaHei"/>
+                <w:b w:val="0"/>
+                <w:color w:val="333333"/>
+                <w:sz w:val="16"/>
+              </w:rPr>
+              <w:t>SLV&gt;0 且 SPY&lt;0 且 TIP&gt;0，买基金第二天</w:t>
+            </w:r>
+          </w:p>
+        </w:tc>
+        <w:tc>
+          <w:tcPr>
+            <w:tcW w:type="dxa" w:w="1235"/>
+            <w:shd w:fill="FFFFFF" w:val="clear"/>
+          </w:tcPr>
+          <w:p>
+            <w:pPr>
+              <w:spacing w:before="20" w:after="20"/>
+              <w:jc w:val="center"/>
+            </w:pPr>
+            <w:r>
+              <w:rPr>
+                <w:rFonts w:ascii="Microsoft YaHei" w:hAnsi="Microsoft YaHei" w:eastAsia="Microsoft YaHei"/>
+                <w:b w:val="0"/>
+                <w:color w:val="333333"/>
+                <w:sz w:val="16"/>
+              </w:rPr>
+              <w:t>0.205%</w:t>
+            </w:r>
+          </w:p>
+        </w:tc>
+        <w:tc>
+          <w:tcPr>
+            <w:tcW w:type="dxa" w:w="1235"/>
+            <w:shd w:fill="FFFFFF" w:val="clear"/>
+          </w:tcPr>
+          <w:p>
+            <w:pPr>
+              <w:spacing w:before="20" w:after="20"/>
+              <w:jc w:val="center"/>
+            </w:pPr>
+            <w:r>
+              <w:rPr>
+                <w:rFonts w:ascii="Microsoft YaHei" w:hAnsi="Microsoft YaHei" w:eastAsia="Microsoft YaHei"/>
+                <w:b w:val="0"/>
+                <w:color w:val="333333"/>
+                <w:sz w:val="16"/>
+              </w:rPr>
+              <w:t>55.7%</w:t>
+            </w:r>
+          </w:p>
+        </w:tc>
+        <w:tc>
+          <w:tcPr>
+            <w:tcW w:type="dxa" w:w="1235"/>
+            <w:shd w:fill="FFFFFF" w:val="clear"/>
+          </w:tcPr>
+          <w:p>
+            <w:pPr>
+              <w:spacing w:before="20" w:after="20"/>
+              <w:jc w:val="center"/>
+            </w:pPr>
+            <w:r>
+              <w:rPr>
+                <w:rFonts w:ascii="Microsoft YaHei" w:hAnsi="Microsoft YaHei" w:eastAsia="Microsoft YaHei"/>
+                <w:b w:val="0"/>
+                <w:color w:val="333333"/>
+                <w:sz w:val="16"/>
+              </w:rPr>
+              <w:t>0.596%</w:t>
+            </w:r>
+          </w:p>
+        </w:tc>
+        <w:tc>
+          <w:tcPr>
+            <w:tcW w:type="dxa" w:w="1235"/>
+            <w:shd w:fill="FFFFFF" w:val="clear"/>
+          </w:tcPr>
+          <w:p>
+            <w:pPr>
+              <w:spacing w:before="20" w:after="20"/>
+              <w:jc w:val="center"/>
+            </w:pPr>
+            <w:r>
+              <w:rPr>
+                <w:rFonts w:ascii="Microsoft YaHei" w:hAnsi="Microsoft YaHei" w:eastAsia="Microsoft YaHei"/>
+                <w:b w:val="0"/>
+                <w:color w:val="333333"/>
+                <w:sz w:val="16"/>
+              </w:rPr>
+              <w:t>67.5%</w:t>
+            </w:r>
+          </w:p>
+        </w:tc>
+        <w:tc>
+          <w:tcPr>
+            <w:tcW w:type="dxa" w:w="1235"/>
+            <w:shd w:fill="FFFFFF" w:val="clear"/>
+          </w:tcPr>
+          <w:p>
+            <w:pPr>
+              <w:spacing w:before="20" w:after="20"/>
+              <w:jc w:val="center"/>
+            </w:pPr>
+            <w:r>
+              <w:rPr>
+                <w:rFonts w:ascii="Microsoft YaHei" w:hAnsi="Microsoft YaHei" w:eastAsia="Microsoft YaHei"/>
+                <w:b w:val="0"/>
+                <w:color w:val="333333"/>
+                <w:sz w:val="16"/>
+              </w:rPr>
+              <w:t>2025后明显改善</w:t>
+            </w:r>
+          </w:p>
+        </w:tc>
+      </w:tr>
+      <w:tr>
+        <w:tc>
+          <w:tcPr>
+            <w:tcW w:type="dxa" w:w="1235"/>
+            <w:shd w:fill="E6E6E6" w:val="clear"/>
+          </w:tcPr>
+          <w:p>
+            <w:pPr>
+              <w:spacing w:before="20" w:after="20"/>
+              <w:jc w:val="center"/>
+            </w:pPr>
+            <w:r>
+              <w:rPr>
+                <w:rFonts w:ascii="Microsoft YaHei" w:hAnsi="Microsoft YaHei" w:eastAsia="Microsoft YaHei"/>
+                <w:b w:val="0"/>
+                <w:color w:val="333333"/>
+                <w:sz w:val="16"/>
+              </w:rPr>
               <w:t>UKPIX</w:t>
             </w:r>
           </w:p>
         </w:tc>
         <w:tc>
           <w:tcPr>
-            <w:tcW w:type="dxa" w:w="1441"/>
+            <w:tcW w:type="dxa" w:w="1235"/>
             <w:shd w:fill="E6E6E6" w:val="clear"/>
           </w:tcPr>
           <w:p>
@@ -4492,7 +4619,7 @@
         </w:tc>
         <w:tc>
           <w:tcPr>
-            <w:tcW w:type="dxa" w:w="1441"/>
+            <w:tcW w:type="dxa" w:w="1235"/>
             <w:shd w:fill="E6E6E6" w:val="clear"/>
           </w:tcPr>
           <w:p>
@@ -4513,7 +4640,7 @@
         </w:tc>
         <w:tc>
           <w:tcPr>
-            <w:tcW w:type="dxa" w:w="1441"/>
+            <w:tcW w:type="dxa" w:w="1235"/>
             <w:shd w:fill="E6E6E6" w:val="clear"/>
           </w:tcPr>
           <w:p>
@@ -4534,7 +4661,7 @@
         </w:tc>
         <w:tc>
           <w:tcPr>
-            <w:tcW w:type="dxa" w:w="1441"/>
+            <w:tcW w:type="dxa" w:w="1235"/>
             <w:shd w:fill="E6E6E6" w:val="clear"/>
           </w:tcPr>
           <w:p>
@@ -4555,7 +4682,7 @@
         </w:tc>
         <w:tc>
           <w:tcPr>
-            <w:tcW w:type="dxa" w:w="1441"/>
+            <w:tcW w:type="dxa" w:w="1235"/>
             <w:shd w:fill="E6E6E6" w:val="clear"/>
           </w:tcPr>
           <w:p>
@@ -4571,6 +4698,27 @@
                 <w:sz w:val="16"/>
               </w:rPr>
               <w:t>64.3%</w:t>
+            </w:r>
+          </w:p>
+        </w:tc>
+        <w:tc>
+          <w:tcPr>
+            <w:tcW w:type="dxa" w:w="1235"/>
+            <w:shd w:fill="E6E6E6" w:val="clear"/>
+          </w:tcPr>
+          <w:p>
+            <w:pPr>
+              <w:spacing w:before="20" w:after="20"/>
+              <w:jc w:val="center"/>
+            </w:pPr>
+            <w:r>
+              <w:rPr>
+                <w:rFonts w:ascii="Microsoft YaHei" w:hAnsi="Microsoft YaHei" w:eastAsia="Microsoft YaHei"/>
+                <w:b w:val="0"/>
+                <w:color w:val="333333"/>
+                <w:sz w:val="16"/>
+              </w:rPr>
+              <w:t>2025后明显改善</w:t>
             </w:r>
           </w:p>
         </w:tc>
@@ -4584,7 +4732,7 @@
           <w:color w:val="000000"/>
           <w:sz w:val="20"/>
         </w:rPr>
-        <w:t>说明：UDPSX、UIPSX 的 2025 后表现也明显改善（平均 0.536%/0.526%、命中 67.9%/60.5%），但全历史平均回报与显著性仍偏弱，UDPSX 同时波动偏高，因此仍列入补强名单；若只按 2025 后口径，可按观察名单处理。</w:t>
+        <w:t>说明：UDPSX、UIPSX 已移入观察名单。它们 2025 后平均回报 0.536%/0.526%、命中率 67.9%/60.5%，明显改善，但全历史平均回报与显著性仍偏弱，UDPSX 同时波动偏高，因此不直接删除，继续观察。</w:t>
       </w:r>
     </w:p>
     <w:p>
@@ -4595,7 +4743,7 @@
           <w:color w:val="000000"/>
           <w:sz w:val="20"/>
         </w:rPr>
-        <w:t>改进措施：优先用候选池中更显著的信号替换 4 条训练弱策略；全历史弱但 2025 后强的 6 条继续观察，不为了凑覆盖硬塞低质量信号。</w:t>
+        <w:t>改进措施：优先用候选池中更显著的信号替换 UKPIX、UTPSX 两条训练弱策略；全历史弱但 2025 后明显的 8 条继续观察，不为了凑覆盖硬塞低质量信号。</w:t>
       </w:r>
     </w:p>
     <w:p>
@@ -6543,6 +6691,43 @@
     </w:p>
     <w:p>
       <w:pPr>
+        <w:pStyle w:val="Heading3"/>
+        <w:jc w:val="left"/>
+      </w:pPr>
+      <w:r>
+        <w:rPr>
+          <w:rFonts w:ascii="SimHei" w:hAnsi="SimHei" w:eastAsia="SimHei"/>
+          <w:b/>
+          <w:color w:val="000000"/>
+          <w:sz w:val="24"/>
+        </w:rPr>
+        <w:t>2.3 同基金/同主题解释一致性检查</w:t>
+      </w:r>
+    </w:p>
+    <w:p>
+      <w:r>
+        <w:rPr>
+          <w:rFonts w:ascii="Microsoft YaHei" w:hAnsi="Microsoft YaHei" w:eastAsia="Microsoft YaHei"/>
+          <w:b w:val="0"/>
+          <w:color w:val="000000"/>
+          <w:sz w:val="20"/>
+        </w:rPr>
+        <w:t>按“基金”维度检查：没有同一基金在相同市场状态（风险偏好收缩/回暖）下同时出现“价格倾向上涨”和“价格倾向承压”的矛盾解释。按“主题”维度存在方向相反的结论，但原因是主题内同时包含多头与反向基金，例如中国主题既有 Ultra China 多头、也有 Ultra Short China 反向，风险偏好收缩时多头承压、反向产品上涨，属于产品属性，不是解释矛盾。</w:t>
+      </w:r>
+    </w:p>
+    <w:p>
+      <w:r>
+        <w:rPr>
+          <w:rFonts w:ascii="Microsoft YaHei" w:hAnsi="Microsoft YaHei" w:eastAsia="Microsoft YaHei"/>
+          <w:b w:val="0"/>
+          <w:color w:val="000000"/>
+          <w:sz w:val="20"/>
+        </w:rPr>
+        <w:t>示例（银行金融类）：BKPIX/BKPSX 的两条解释分别是“风险偏好收缩时价格倾向承压”和“风险偏好回暖时价格倾向上涨”，属于不同市场状态下的互补结论，不构成矛盾。检查明细见 v4_explanation_conflict_check.csv。</w:t>
+      </w:r>
+    </w:p>
+    <w:p>
+      <w:pPr>
         <w:pStyle w:val="Heading2"/>
         <w:jc w:val="left"/>
       </w:pPr>
@@ -13068,7 +13253,7 @@
           <w:color w:val="000000"/>
           <w:sz w:val="20"/>
         </w:rPr>
-        <w:t>本章假设：对单个策略，把某个条件阈值改深，例如 XLK&lt;=-1% 且 该基金当日回报&lt;=-2% 中的 XLK 改为 &lt;=-2%/-2.5%/-3%，整个策略的平均回报和命中率应递增。以下全部按策略统计；多条件策略只调整被扫描的那个条件，其他子条件保持不变。4.1、4.2、4.3 使用同一份策略级阈值扫描结果。</w:t>
+        <w:t>本章假设：对单个策略，把某个条件阈值改深，例如 XLK&lt;=-1% 且 该基金当日回报&lt;=-2% 中的 XLK 改为 &lt;=-2%/-2.5%/-3%，整个策略的平均回报和命中率应递增。以下全部按策略统计；多条件策略只调整被扫描的那个条件，其他子条件保持不变。4.1、4.2、4.3 使用同一份策略级阈值扫描结果。为什么只有 33 组：231 条策略中只有 32 条含可调阈值/连跌条件（31 条数值阈值 + 1 条连跌天数），其中 CYPIX 同时有两个可调阈值条件，因此共 33 组；其余 199 条是 &gt;0/&lt;0 方向条件，没有可调数值，不参与扫描。</w:t>
       </w:r>
     </w:p>
     <w:p>

</xml_diff>